<commit_message>
Update proposal title stages and paper context
</commit_message>
<xml_diff>
--- a/Proposal2027-2028.improved.docx
+++ b/Proposal2027-2028.improved.docx
@@ -425,12 +425,14 @@
           <w:u w:val="single"/>
           <w:rtl w:val="0"/>
         </w:rPr>
-        <w:t xml:space="preserve">Механіка руйнування метаматеріально-орієнтованих інфраструктурних композитів з акцентом на системи дорожнього покриття за статичного та динамічного навантаження.</w:t>
-      </w:r>
-      <w:r>
-        <w:rPr>
-          <w:rtl w:val="0"/>
-        </w:rPr>
+      </w:r>
+      <w:r>
+        <w:rPr>
+          <w:rtl w:val="0"/>
+        </w:rPr>
+      </w:r>
+      <w:r>
+        <w:t>Механіка руйнування метаматеріально-орієнтованих інфраструктурних композитів для потреб оборони та безпеки держави (з акцентом на системи аеродромного та дорожнього покриття за статичного та динамічного навантаження).</w:t>
       </w:r>
     </w:p>
     <w:p>
@@ -552,6 +554,12 @@
       </w:r>
     </w:p>
     <w:p>
+      <w:pPr/>
+      <w:r>
+        <w:t>2. Механіка ракетно-космічних, авіаційних й енергетичних систем, матеріалів і конструкцій для потреб оборони та безпеки держави (2027-2028 рр).</w:t>
+      </w:r>
+    </w:p>
+    <w:p>
       <w:pPr>
         <w:spacing w:line="252.00000000000003" w:lineRule="auto"/>
         <w:jc w:val="center"/>
@@ -794,26 +802,26 @@
           <w:u w:val="single"/>
           <w:rtl w:val="0"/>
         </w:rPr>
-        <w:t xml:space="preserve">Механіка,</w:t>
-      </w:r>
-      <w:r>
-        <w:rPr>
-          <w:rtl w:val="0"/>
-        </w:rPr>
-        <w:t xml:space="preserve"> </w:t>
+      </w:r>
+      <w:r>
+        <w:rPr>
+          <w:rtl w:val="0"/>
+        </w:rPr>
       </w:r>
       <w:r>
         <w:rPr>
           <w:u w:val="single"/>
           <w:rtl w:val="0"/>
         </w:rPr>
-        <w:t xml:space="preserve">математичні проблеми механіки</w:t>
+      </w:r>
+      <w:r>
+        <w:rPr>
+          <w:rtl w:val="0"/>
+        </w:rPr>
+      </w:r>
+      <w:r>
+        <w:t>2. Механіка ракетно-космічних, авіаційних й енергетичних систем, матеріалів і конструкцій для потреб оборони та безпеки держави (2027-2028 рр).</w:t>
         <w:tab/>
-      </w:r>
-      <w:r>
-        <w:rPr>
-          <w:rtl w:val="0"/>
-        </w:rPr>
       </w:r>
     </w:p>
     <w:p>
@@ -1187,8 +1195,13 @@
     </w:p>
     <w:p>
       <w:pPr/>
-      <w:r>
-        <w:t>рекомендації щодо вибору геометричних, матеріальних і міжфазних параметрів тріщиностійких композитів для дорожніх покриттів, мостових настилів, плитних елементів, захисних і ремонтних шарів.</w:t>
+      <w:r/>
+      <w:r/>
+      <w:r/>
+      <w:r/>
+      <w:r/>
+      <w:r>
+        <w:t>рекомендації щодо вибору геометричних, матеріальних і міжфазних параметрів тріщиностійких композитів для аеродромних і дорожніх покриттів, мостових настилів, плитних елементів, захисних і ремонтних шарів.</w:t>
       </w:r>
     </w:p>
     <w:p>
@@ -3616,14 +3629,21 @@
     </w:p>
     <w:p>
       <w:pPr/>
-      <w:r>
-        <w:t>Сучасні дорожні покриття, мостові настили, плитні елементи, захисні та ремонтні шари працюють за одночасної дії статичних, циклічних і динамічних навантажень, температурних змін, вологи та поступового накопичення пошкоджень. Одним із головних механізмів втрати їхньої довговічності є зародження і поширення тріщин у матриці матеріалу або на міжфазних межах між його структурними компонентами. Тому актуальним є створення механіко-математичних підходів, які дають змогу не лише описувати руйнування, а й цілеспрямовано керувати траєкторіями тріщин та підвищувати опір пошкодженню інфраструктурних композитів.</w:t>
+      <w:r/>
+      <w:r/>
+      <w:r/>
+      <w:r/>
+      <w:r/>
+      <w:r/>
+      <w:r>
+        <w:t>Сучасні аеродромні та дорожні покриття, мостові настили, плитні елементи, захисні та ремонтні шари працюють за одночасної дії статичних, циклічних і динамічних навантажень, температурних змін, вологи та поступового накопичення пошкоджень. Одним із головних механізмів втрати їхньої довговічності є зародження і поширення тріщин у матриці матеріалу або на міжфазних межах між його структурними компонентами. Тому актуальним є створення механіко-математичних підходів, які дають змогу не лише описувати руйнування, а й цілеспрямовано керувати траєкторіями тріщин та підвищувати опір пошкодженню інфраструктурних композитів.</w:t>
       </w:r>
     </w:p>
     <w:p>
       <w:pPr/>
-      <w:r>
-        <w:t>У роботі пропонується дослідити метаматеріально-орієнтовані інфраструктурні композити, у яких ефективні механічні властивості визначаються не лише складом, а й спеціально спроєктованою внутрішньою архітектурою. До таких архітектур належать комірчасті та ауксетичні структури, резонансні включення, перфоровані цементні елементи, 3D-друковані полімерні або полімер-композитні армувальні решітки, а також шаруваті й міжфазні системи. Основна увага буде приділена системам дорожнього покриття та спорідненим інфраструктурним елементам, для яких критичними є тріщиностійкість, енергопоглинання, міжфазна міцність і довговічність.</w:t>
+      <w:r/>
+      <w:r>
+        <w:t>У роботі пропонується дослідити метаматеріально-орієнтовані інфраструктурні композити, у яких ефективні механічні властивості визначаються не лише складом, а й спеціально спроєктованою внутрішньою архітектурою. До таких архітектур належать комірчасті та ауксетичні структури, резонансні включення, перфоровані цементні елементи, 3D-друковані полімерні або полімер-композитні армувальні решітки, а також шаруваті й міжфазні системи. Основна увага буде приділена системам аеродромного та дорожнього покриття та спорідненим інфраструктурним елементам, для яких критичними є тріщиностійкість, енергопоглинання, міжфазна міцність і довговічність.</w:t>
       </w:r>
     </w:p>
     <w:p>
@@ -3754,8 +3774,9 @@
     </w:p>
     <w:p>
       <w:pPr/>
-      <w:r>
-        <w:t>Метою роботи є розроблення механіко-математичних моделей, чисельних методик та критеріїв оцінювання руйнування метаматеріально-орієнтованих інфраструктурних композитів з акцентом на системи дорожнього покриття за статичного, циклічного та динамічного навантаження, з урахуванням впливу внутрішньої архітектури, міжфазної деградації, crack-bridging механізмів і взаємодії тріщин з архітектурними елементами матеріалу.</w:t>
+      <w:r/>
+      <w:r>
+        <w:t>Метою роботи є розроблення механіко-математичних моделей, чисельних методик та критеріїв оцінювання руйнування метаматеріально-орієнтованих інфраструктурних композитів з акцентом на системи аеродромного та дорожнього покриття за статичного, циклічного та динамічного навантаження, з урахуванням впливу внутрішньої архітектури, міжфазної деградації, crack-bridging механізмів і взаємодії тріщин з архітектурними елементами матеріалу.</w:t>
       </w:r>
     </w:p>
     <w:p>
@@ -3884,7 +3905,18 @@
     <w:p>
       <w:pPr/>
       <w:r>
-        <w:t>Водночас більшість наявних робіт зосереджена на демонстрації окремих ефектів: ауксетичної поведінки, хвильового гасіння, енергопоглинання, сенсорної функціональності, проникності або підвищення міцності. Значно менш розробленою залишається системна механіка руйнування таких матеріалів, особливо для дорожніх покриттів, мостових настилів, плитних елементів, захисних і ремонтних шарів, де саме зародження та розвиток тріщин часто визначають експлуатаційну надійність конструкції.</w:t>
+        <w:t>Найбільш релевантними джерелами із наявного переліку для цієї теми є: S.J. Mitchell, A. Pandolfi, M. Ortiz, «Metaconcrete: designed aggregates to enhance dynamic performance» (2014), де обґрунтовано концепцію бетонного метаматеріалу з резонансними включеннями для послаблення динамічних хвиль; Y. Xu, H. Zhang, E. Schlangen, M. Luković, B. Šavija, «Cementitious cellular composites with auxetic behavior» (2020), де показано роль ауксетичної цементної архітектури та crack-bridging механізмів; H. Zhao та ін., «Exploiting meta-aggregate in functional composites for a balanced permeability and strength trade-off» (2025), де розглянуто 3D-друковані lattice meta-aggregates у цементній та асфальтовій матриці; M. Vandadi та ін., «Integrating 3D-Printed Auxetic Structures for Advanced Concrete Reinforcement» (2025), де досліджено вбудоване ауксетичне армування як засіб підвищення механічної ефективності бетону.</w:t>
+      </w:r>
+    </w:p>
+    <w:p>
+      <w:pPr/>
+      <w:r/>
+      <w:r/>
+      <w:r/>
+      <w:r/>
+      <w:r/>
+      <w:r>
+        <w:t>Водночас більшість наявних робіт зосереджена на демонстрації окремих ефектів: ауксетичної поведінки, хвильового гасіння, енергопоглинання, сенсорної функціональності, проникності або підвищення міцності. Значно менш розробленою залишається системна механіка руйнування таких матеріалів, особливо для аеродромних і дорожніх покриттів, мостових настилів, плитних елементів, захисних і ремонтних шарів, де саме зародження та розвиток тріщин часто визначають експлуатаційну надійність конструкції.</w:t>
       </w:r>
     </w:p>
     <w:p>
@@ -6725,14 +6757,25 @@
     </w:p>
     <w:p>
       <w:pPr/>
-      <w:r>
-        <w:t>Етап 1 (2027 р.). Розроблення моделей руйнування та вибір базових архітектур метаматеріально-орієнтованих інфраструктурних композитів. На цьому етапі буде систематизовано сучасні підходи до створення метабетону, ауксетичних цементних і бетонних структур, бетонів із вбудованим архітектурним армуванням, багатофункціональних бетонополімерних систем та композитів з вираженими міжфазними межами. Для вибраних архітектур буде побудовано скінченноелементні моделі напружено-деформованого стану за статичного навантаження, а також базові когезійно-зонні моделі зародження тріщин, руйнування інтерфейсів і посттріщинної поведінки. Буде виконано параметричний аналіз впливу геометрії внутрішньої архітектури на локалізацію напружень, траєкторії тріщин і ефективність архітектурних «пасток тріщин».</w:t>
+      <w:r/>
+      <w:r/>
+      <w:r/>
+      <w:r/>
+      <w:r/>
+      <w:r>
+        <w:t>Етап 1 (2027 р.). Теоретико-чисельні моделі руйнування та вибір архітектур метаматеріально-орієнтованих композитів для аеродромних і дорожніх покриттів. На цьому етапі буде систематизовано сучасні підходи до створення метабетону, ауксетичних цементних і бетонних структур, бетонів із вбудованим архітектурним армуванням, багатофункціональних бетонополімерних систем та композитів з вираженими міжфазними межами. Для вибраних архітектур буде побудовано скінченноелементні моделі напружено-деформованого стану за статичного навантаження, а також базові когезійно-зонні моделі зародження тріщин, руйнування інтерфейсів і посттріщинної поведінки. Буде виконано параметричний аналіз впливу геометрії внутрішньої архітектури на локалізацію напружень, траєкторії тріщин і ефективність архітектурних «пасток тріщин».</w:t>
       </w:r>
     </w:p>
     <w:p>
       <w:pPr/>
-      <w:r>
-        <w:t>Етап 2 (2028 р.). Моделювання статичного, циклічного і динамічного руйнування, міжфазної деградації та експериментальна верифікація. На цьому етапі буде розвинено побудовані моделі для складніших умов навантаження, характерних для дорожньої та цивільної інфраструктури, включаючи імпульсне, циклічне та динамічне навантаження. Окремий блок робіт буде присвячено межам полімер-цемент, армування-матриця, включення-покриття-матриця та ремонтний шар-основа з побудовою когезійних моделей змішаного руйнування. Передбачається чисельно-експериментальна верифікація за схемами стиску, згину, непрямого розтягу та SCB-випробувань, а також формулювання рекомендацій щодо створення тріщиностійких композитів для дорожніх покриттів, мостових настилів, плитних елементів, захисних і ремонтних шарів.</w:t>
+      <w:r/>
+      <w:r/>
+      <w:r/>
+      <w:r/>
+      <w:r/>
+      <w:r/>
+      <w:r>
+        <w:t>Етап 2 (2028 р.). Динамічне, міжфазне та експериментально верифіковане моделювання тріщиностійкості інфраструктурних метакомпозитів. На цьому етапі буде розвинено побудовані моделі для складніших умов навантаження, характерних для дорожньої та цивільної інфраструктури, включаючи імпульсне, циклічне та динамічне навантаження. Окремий блок робіт буде присвячено межам полімер-цемент, армування-матриця, включення-покриття-матриця та ремонтний шар-основа з побудовою когезійних моделей змішаного руйнування. Передбачається чисельно-експериментальна верифікація за схемами стиску, згину, непрямого розтягу та SCB-випробувань, а також формулювання рекомендацій щодо створення тріщиностійких композитів для аеродромних і дорожніх покриттів, мостових настилів, плитних елементів, захисних і ремонтних шарів.</w:t>
       </w:r>
     </w:p>
     <w:p>
@@ -6868,8 +6911,13 @@
     </w:p>
     <w:p>
       <w:pPr/>
-      <w:r>
-        <w:t>1. Актуальність та економічна значущість. Сучасна дорожня, транспортна та цивільна інфраструктура працює в умовах накопичення пошкоджень, де одним із головних чинників втрати працездатності є зародження та розвиток тріщин. Традиційні методи підвищення довговічності, орієнтовані переважно на зміну складу матеріалу, не забезпечують повного контролю над траєкторіями руйнування, міжфазним відшаруванням і динамічною відповіддю. Запропонований підхід дає змогу розглядати внутрішню архітектуру композиту як активний інструмент підвищення тріщиностійкості, що потенційно зменшує частоту ремонтів, подовжує строк служби дорожніх покриттів, мостових настилів і захисних шарів та підвищує надійність критичної інфраструктури.</w:t>
+      <w:r/>
+      <w:r/>
+      <w:r/>
+      <w:r/>
+      <w:r/>
+      <w:r>
+        <w:t>1. Актуальність та економічна значущість. Сучасна дорожня, транспортна та цивільна інфраструктура працює в умовах накопичення пошкоджень, де одним із головних чинників втрати працездатності є зародження та розвиток тріщин. Традиційні методи підвищення довговічності, орієнтовані переважно на зміну складу матеріалу, не забезпечують повного контролю над траєкторіями руйнування, міжфазним відшаруванням і динамічною відповіддю. Запропонований підхід дає змогу розглядати внутрішню архітектуру композиту як активний інструмент підвищення тріщиностійкості, що потенційно зменшує частоту ремонтів, подовжує строк служби аеродромних і дорожніх покриттів, мостових настилів і захисних шарів та підвищує надійність критичної інфраструктури.</w:t>
       </w:r>
     </w:p>
     <w:p>
@@ -8362,8 +8410,13 @@
                 <w:rtl w:val="0"/>
               </w:rPr>
             </w:r>
-            <w:r>
-              <w:t>Використання під час попереднього проєктування, порівняльного аналізу архітектурних рішень, оцінювання ресурсу і довговічності дорожніх покриттів, мостових настилів, ремонтних та захисних шарів.</w:t>
+            <w:r/>
+            <w:r/>
+            <w:r/>
+            <w:r/>
+            <w:r/>
+            <w:r>
+              <w:t>Використання під час попереднього проєктування, порівняльного аналізу архітектурних рішень, оцінювання ресурсу і довговічності аеродромних і дорожніх покриттів, мостових настилів, ремонтних та захисних шарів.</w:t>
             </w:r>
           </w:p>
         </w:tc>
@@ -11171,12 +11224,14 @@
           <w:u w:val="single"/>
           <w:rtl w:val="0"/>
         </w:rPr>
-        <w:t xml:space="preserve">Механіка руйнування метаматеріально-орієнтованих інфраструктурних композитів з акцентом на системи дорожнього покриття за статичного та динамічного навантаження</w:t>
-      </w:r>
-      <w:r>
-        <w:rPr>
-          <w:rtl w:val="0"/>
-        </w:rPr>
+      </w:r>
+      <w:r>
+        <w:rPr>
+          <w:rtl w:val="0"/>
+        </w:rPr>
+      </w:r>
+      <w:r>
+        <w:t>Механіка руйнування метаматеріально-орієнтованих інфраструктурних композитів для потреб оборони та безпеки держави (з акцентом на системи аеродромного та дорожнього покриття за статичного та динамічного навантаження)</w:t>
       </w:r>
     </w:p>
     <w:p>
@@ -11571,12 +11626,14 @@
           <w:u w:val="single"/>
           <w:rtl w:val="0"/>
         </w:rPr>
-        <w:t xml:space="preserve">Механіка, математичні проблеми механіки</w:t>
-      </w:r>
-      <w:r>
-        <w:rPr>
-          <w:rtl w:val="0"/>
-        </w:rPr>
+      </w:r>
+      <w:r>
+        <w:rPr>
+          <w:rtl w:val="0"/>
+        </w:rPr>
+      </w:r>
+      <w:r>
+        <w:t>2. Механіка ракетно-космічних, авіаційних й енергетичних систем, матеріалів і конструкцій для потреб оборони та безпеки держави (2027-2028 рр).</w:t>
       </w:r>
     </w:p>
     <w:p>
@@ -12161,8 +12218,25 @@
             </w:pPr>
             <w:r>
               <w:rPr>
-                <w:rtl w:val="0"/>
-              </w:rPr>
+                <w:b/>
+                <w:rtl w:val="0"/>
+              </w:rPr>
+            </w:r>
+            <w:r>
+              <w:rPr>
+                <w:b/>
+              </w:rPr>
+            </w:r>
+            <w:r>
+              <w:rPr>
+                <w:b/>
+              </w:rPr>
+            </w:r>
+            <w:r>
+              <w:rPr>
+                <w:b/>
+              </w:rPr>
+              <w:t>№ з/п</w:t>
             </w:r>
           </w:p>
         </w:tc>
@@ -12187,8 +12261,25 @@
             </w:pPr>
             <w:r>
               <w:rPr>
-                <w:rtl w:val="0"/>
-              </w:rPr>
+                <w:b/>
+                <w:rtl w:val="0"/>
+              </w:rPr>
+            </w:r>
+            <w:r>
+              <w:rPr>
+                <w:b/>
+              </w:rPr>
+            </w:r>
+            <w:r>
+              <w:rPr>
+                <w:b/>
+              </w:rPr>
+            </w:r>
+            <w:r>
+              <w:rPr>
+                <w:b/>
+              </w:rPr>
+              <w:t>Найменування основного етапу роботи</w:t>
             </w:r>
           </w:p>
         </w:tc>
@@ -12213,8 +12304,25 @@
             </w:pPr>
             <w:r>
               <w:rPr>
-                <w:rtl w:val="0"/>
-              </w:rPr>
+                <w:b/>
+                <w:rtl w:val="0"/>
+              </w:rPr>
+            </w:r>
+            <w:r>
+              <w:rPr>
+                <w:b/>
+              </w:rPr>
+            </w:r>
+            <w:r>
+              <w:rPr>
+                <w:b/>
+              </w:rPr>
+            </w:r>
+            <w:r>
+              <w:rPr>
+                <w:b/>
+              </w:rPr>
+              <w:t>Термін виконання</w:t>
             </w:r>
           </w:p>
         </w:tc>
@@ -12239,8 +12347,25 @@
             </w:pPr>
             <w:r>
               <w:rPr>
-                <w:rtl w:val="0"/>
-              </w:rPr>
+                <w:b/>
+                <w:rtl w:val="0"/>
+              </w:rPr>
+            </w:r>
+            <w:r>
+              <w:rPr>
+                <w:b/>
+              </w:rPr>
+            </w:r>
+            <w:r>
+              <w:rPr>
+                <w:b/>
+              </w:rPr>
+            </w:r>
+            <w:r>
+              <w:rPr>
+                <w:b/>
+              </w:rPr>
+              <w:t>Відповідальний виконавець</w:t>
             </w:r>
           </w:p>
         </w:tc>
@@ -12273,6 +12398,11 @@
               <w:rPr>
                 <w:rtl w:val="0"/>
               </w:rPr>
+            </w:r>
+            <w:r/>
+            <w:r/>
+            <w:r>
+              <w:t>1</w:t>
             </w:r>
           </w:p>
         </w:tc>
@@ -12325,6 +12455,13 @@
                 <w:rtl w:val="0"/>
               </w:rPr>
             </w:r>
+            <w:r/>
+            <w:r/>
+            <w:r/>
+            <w:r/>
+            <w:r>
+              <w:t>Теоретико-чисельні моделі руйнування та вибір архітектур метаматеріально-орієнтованих композитів для аеродромних і дорожніх покриттів</w:t>
+            </w:r>
           </w:p>
         </w:tc>
         <w:tc>
@@ -12351,6 +12488,11 @@
                 <w:rtl w:val="0"/>
               </w:rPr>
             </w:r>
+            <w:r/>
+            <w:r/>
+            <w:r>
+              <w:t>01 січня 2027 р. - 31 грудня 2027 р.</w:t>
+            </w:r>
           </w:p>
         </w:tc>
         <w:tc>
@@ -12377,6 +12519,11 @@
                 <w:rtl w:val="0"/>
               </w:rPr>
             </w:r>
+            <w:r/>
+            <w:r/>
+            <w:r>
+              <w:t>д.ф.-м.н., чл.-кор. НАН України М.Ф. Селіванов</w:t>
+            </w:r>
           </w:p>
         </w:tc>
       </w:tr>
@@ -12407,6 +12554,11 @@
               <w:rPr>
                 <w:rtl w:val="0"/>
               </w:rPr>
+            </w:r>
+            <w:r/>
+            <w:r/>
+            <w:r>
+              <w:t>2</w:t>
             </w:r>
           </w:p>
         </w:tc>
@@ -12459,6 +12611,11 @@
                 <w:rtl w:val="0"/>
               </w:rPr>
             </w:r>
+            <w:r/>
+            <w:r/>
+            <w:r>
+              <w:t>Динамічне, міжфазне та експериментально верифіковане моделювання тріщиностійкості інфраструктурних метакомпозитів</w:t>
+            </w:r>
           </w:p>
         </w:tc>
         <w:tc>
@@ -12484,6 +12641,11 @@
                 <w:rtl w:val="0"/>
               </w:rPr>
             </w:r>
+            <w:r/>
+            <w:r/>
+            <w:r>
+              <w:t>01 січня 2028 р. - 31 грудня 2028 р.</w:t>
+            </w:r>
           </w:p>
         </w:tc>
         <w:tc>
@@ -12508,6 +12670,11 @@
               <w:rPr>
                 <w:rtl w:val="0"/>
               </w:rPr>
+            </w:r>
+            <w:r/>
+            <w:r/>
+            <w:r>
+              <w:t>д.ф.-м.н., чл.-кор. НАН України М.Ф. Селіванов</w:t>
             </w:r>
           </w:p>
         </w:tc>
@@ -13451,8 +13618,9 @@
     </w:p>
     <w:p>
       <w:pPr/>
-      <w:r>
-        <w:t>Дослідження мають теоретичну, чисельну та чисельно-експериментальну спрямованість і присвячені розробленню механіко-математичних моделей, чисельних методик та критеріїв оцінювання руйнування метаматеріально-орієнтованих інфраструктурних композитів з акцентом на системи дорожнього покриття за статичного, циклічного та динамічного навантаження.</w:t>
+      <w:r/>
+      <w:r>
+        <w:t>Дослідження мають теоретичну, чисельну та чисельно-експериментальну спрямованість і присвячені розробленню механіко-математичних моделей, чисельних методик та критеріїв оцінювання руйнування метаматеріально-орієнтованих інфраструктурних композитів з акцентом на системи аеродромного та дорожнього покриття за статичного, циклічного та динамічного навантаження.</w:t>
       </w:r>
     </w:p>
     <w:p>
@@ -13549,8 +13717,13 @@
     </w:p>
     <w:p>
       <w:pPr/>
-      <w:r>
-        <w:t>6. Рекомендації щодо вибору геометричних, матеріальних і міжфазних параметрів тріщиностійких композитів для дорожніх покриттів, мостових настилів, плитних елементів, захисних і ремонтних шарів інфраструктурних об'єктів.</w:t>
+      <w:r/>
+      <w:r/>
+      <w:r/>
+      <w:r/>
+      <w:r/>
+      <w:r>
+        <w:t>6. Рекомендації щодо вибору геометричних, матеріальних і міжфазних параметрів тріщиностійких композитів для аеродромних і дорожніх покриттів, мостових настилів, плитних елементів, захисних і ремонтних шарів інфраструктурних об'єктів.</w:t>
       </w:r>
     </w:p>
     <w:p>
@@ -14358,7 +14531,6 @@
           <w:u w:val="single"/>
           <w:rtl w:val="0"/>
         </w:rPr>
-        <w:t xml:space="preserve">Механіка руйнування метаматеріально-орієнтованих інфраструктурних композитів з акцентом на системи дорожнього покриття за статичного та динамічного навантаження</w:t>
       </w:r>
       <w:r>
         <w:rPr>
@@ -14366,12 +14538,14 @@
           <w:bCs w:val="1"/>
           <w:rtl w:val="0"/>
         </w:rPr>
-        <w:t xml:space="preserve"> </w:t>
-      </w:r>
-      <w:r>
-        <w:rPr>
-          <w:rtl w:val="0"/>
-        </w:rPr>
+      </w:r>
+      <w:r>
+        <w:rPr>
+          <w:rtl w:val="0"/>
+        </w:rPr>
+      </w:r>
+      <w:r>
+        <w:t xml:space="preserve">Механіка руйнування метаматеріально-орієнтованих інфраструктурних композитів для потреб оборони та безпеки держави (з акцентом на системи аеродромного та дорожнього покриття за статичного та динамічного навантаження) </w:t>
       </w:r>
     </w:p>
     <w:p>
@@ -15913,12 +16087,14 @@
           <w:u w:val="single"/>
           <w:rtl w:val="0"/>
         </w:rPr>
-        <w:t xml:space="preserve">Механіка руйнування метаматеріально-орієнтованих інфраструктурних композитів з акцентом на системи дорожнього покриття за статичного та динамічного навантаження</w:t>
-      </w:r>
-      <w:r>
-        <w:rPr>
-          <w:rtl w:val="0"/>
-        </w:rPr>
+      </w:r>
+      <w:r>
+        <w:rPr>
+          <w:rtl w:val="0"/>
+        </w:rPr>
+      </w:r>
+      <w:r>
+        <w:t>Механіка руйнування метаматеріально-орієнтованих інфраструктурних композитів для потреб оборони та безпеки держави (з акцентом на системи аеродромного та дорожнього покриття за статичного та динамічного навантаження)</w:t>
       </w:r>
     </w:p>
     <w:p>
@@ -17847,12 +18023,14 @@
           <w:u w:val="single"/>
           <w:rtl w:val="0"/>
         </w:rPr>
-        <w:t xml:space="preserve">Механіка руйнування метаматеріально-орієнтованих інфраструктурних композитів з акцентом на системи дорожнього покриття за статичного та динамічного навантаження</w:t>
-      </w:r>
-      <w:r>
-        <w:rPr>
-          <w:rtl w:val="0"/>
-        </w:rPr>
+      </w:r>
+      <w:r>
+        <w:rPr>
+          <w:rtl w:val="0"/>
+        </w:rPr>
+      </w:r>
+      <w:r>
+        <w:t>Механіка руйнування метаматеріально-орієнтованих інфраструктурних композитів для потреб оборони та безпеки держави (з акцентом на системи аеродромного та дорожнього покриття за статичного та динамічного навантаження)</w:t>
       </w:r>
     </w:p>
     <w:p>

</xml_diff>

<commit_message>
Align proposal structure and author experience
</commit_message>
<xml_diff>
--- a/Proposal2027-2028.improved.docx
+++ b/Proposal2027-2028.improved.docx
@@ -1130,78 +1130,6 @@
         <w:rPr>
           <w:rtl w:val="0"/>
         </w:rPr>
-      </w:r>
-    </w:p>
-    <w:p>
-      <w:pPr>
-        <w:spacing w:line="252.00000000000003" w:lineRule="auto"/>
-        <w:rPr/>
-      </w:pPr>
-      <w:r>
-        <w:rPr>
-          <w:b w:val="1"/>
-          <w:bCs w:val="1"/>
-          <w:rtl w:val="0"/>
-        </w:rPr>
-        <w:t xml:space="preserve">10. Наукові (науково-технічні) результати, що очікуються за основними етапами та роботою в цілому</w:t>
-      </w:r>
-      <w:r>
-        <w:rPr>
-          <w:rtl w:val="0"/>
-        </w:rPr>
-      </w:r>
-    </w:p>
-    <w:p>
-      <w:pPr/>
-      <w:r>
-        <w:t>1. На першому етапі буде створено базовий комплекс механіко-математичних і скінченноелементних моделей руйнування метаматеріально-орієнтованих інфраструктурних композитів за статичного навантаження. Буде обрано репрезентативні типи внутрішньої архітектури (комірчасті, ауксетичні, резонансні, перфоровані та армувальні структури), побудовано початкові когезійно-зонні моделі для матриці, лігаментів і міжфазних меж, а також сформовано чисельні карти локалізації напружень, зон зародження тріщин і можливих траєкторій їхнього поширення.</w:t>
-      </w:r>
-    </w:p>
-    <w:p>
-      <w:pPr/>
-      <w:r>
-        <w:t>2. На другому етапі буде розроблено уточнені моделі руйнування за статичного, циклічного й динамічного навантаження з урахуванням міжфазної деградації, crack-bridging механізмів, динамічної функціональності та можливого середовищно-індукованого пошкодження полімерних архітектурних елементів. Передбачається чисельно-експериментальна верифікація моделей через випробування на стиск, згин, непрямий розтяг та SCB-випробування, а також ідентифікація параметрів когезійних моделей для гібридних систем.</w:t>
-      </w:r>
-    </w:p>
-    <w:p>
-      <w:pPr/>
-      <w:r>
-        <w:t>За результатами роботи в цілому очікується створення цілісного науково обґрунтованого підходу до аналізу та проєктування тріщиностійких інфраструктурних композитів, у яких внутрішня архітектура використовується як активний інструмент керування руйнуванням. Головними результатами стануть:</w:t>
-      </w:r>
-    </w:p>
-    <w:p>
-      <w:pPr/>
-      <w:r>
-        <w:t>механіко-математичні моделі та алгоритми прогнозування умов зародження, поширення, відхилення, кiнкування та зупинки тріщин у композитах з внутрішньою архітектурою;</w:t>
-      </w:r>
-    </w:p>
-    <w:p>
-      <w:pPr/>
-      <w:r>
-        <w:t>когезійно-зонні моделі міжфазної деградації для систем полімер-цемент, армування-матриця, включення-покриття-матриця та ремонтний шар-основа;</w:t>
-      </w:r>
-    </w:p>
-    <w:p>
-      <w:pPr/>
-      <w:r>
-        <w:t>критерії оцінювання ефективності внутрішніх архітектурних елементів як «пасток тріщин» і чисельні карти руйнування для характерних метаматеріально-орієнтованих композитів;</w:t>
-      </w:r>
-    </w:p>
-    <w:p>
-      <w:pPr/>
-      <w:r>
-        <w:t>методика експериментальної ідентифікації параметрів тріщиностійкості, енергопоглинання, посттріщинної поведінки та міжфазного руйнування;</w:t>
-      </w:r>
-    </w:p>
-    <w:p>
-      <w:pPr/>
-      <w:r/>
-      <w:r/>
-      <w:r/>
-      <w:r/>
-      <w:r/>
-      <w:r>
-        <w:t>рекомендації щодо вибору геометричних, матеріальних і міжфазних параметрів тріщиностійких композитів для аеродромних і дорожніх покриттів, мостових настилів, плитних елементів, захисних і ремонтних шарів.</w:t>
       </w:r>
     </w:p>
     <w:p>
@@ -1450,90 +1378,6 @@
               <w:rPr>
                 <w:rtl w:val="0"/>
               </w:rPr>
-              <w:t xml:space="preserve">Шикула Олена Миколаївна</w:t>
-            </w:r>
-          </w:p>
-        </w:tc>
-        <w:tc>
-          <w:tcPr>
-            <w:gridSpan w:val="2"/>
-            <w:tcMar>
-              <w:top w:w="35.0" w:type="dxa"/>
-              <w:left w:w="55.0" w:type="dxa"/>
-              <w:bottom w:w="35.0" w:type="dxa"/>
-              <w:right w:w="55.0" w:type="dxa"/>
-            </w:tcMar>
-            <w:vAlign w:val="center"/>
-          </w:tcPr>
-          <w:p>
-            <w:pPr>
-              <w:spacing w:line="276" w:lineRule="auto"/>
-              <w:rPr/>
-            </w:pPr>
-            <w:r>
-              <w:rPr>
-                <w:rtl w:val="0"/>
-              </w:rPr>
-              <w:t xml:space="preserve">д.ф.-м.н., проф.,</w:t>
-              <w:br w:type="textWrapping"/>
-              <w:t xml:space="preserve">провідний науковий співробітник,</w:t>
-              <w:br w:type="textWrapping"/>
-              <w:t xml:space="preserve">ІМех ім. С.П. Тимошенка НАН України,</w:t>
-              <w:br w:type="textWrapping"/>
-              <w:t xml:space="preserve">тел.: +38 044 596 7715,</w:t>
-              <w:br w:type="textWrapping"/>
-              <w:t xml:space="preserve">e-mail: shykulaom@nas.gov.ua</w:t>
-            </w:r>
-          </w:p>
-        </w:tc>
-        <w:tc>
-          <w:tcPr>
-            <w:tcMar>
-              <w:top w:w="35.0" w:type="dxa"/>
-              <w:left w:w="55.0" w:type="dxa"/>
-              <w:bottom w:w="35.0" w:type="dxa"/>
-              <w:right w:w="55.0" w:type="dxa"/>
-            </w:tcMar>
-            <w:vAlign w:val="center"/>
-          </w:tcPr>
-          <w:p>
-            <w:pPr>
-              <w:spacing w:line="276" w:lineRule="auto"/>
-              <w:jc w:val="center"/>
-              <w:rPr/>
-            </w:pPr>
-            <w:r>
-              <w:rPr>
-                <w:rtl w:val="0"/>
-              </w:rPr>
-            </w:r>
-          </w:p>
-        </w:tc>
-      </w:tr>
-      <w:tr>
-        <w:trPr>
-          <w:cantSplit w:val="1"/>
-          <w:tblHeader w:val="0"/>
-        </w:trPr>
-        <w:tc>
-          <w:tcPr>
-            <w:tcMar>
-              <w:top w:w="35.0" w:type="dxa"/>
-              <w:left w:w="55.0" w:type="dxa"/>
-              <w:bottom w:w="35.0" w:type="dxa"/>
-              <w:right w:w="55.0" w:type="dxa"/>
-            </w:tcMar>
-            <w:vAlign w:val="center"/>
-          </w:tcPr>
-          <w:p>
-            <w:pPr>
-              <w:spacing w:line="276" w:lineRule="auto"/>
-              <w:rPr/>
-            </w:pPr>
-            <w:r>
-              <w:rPr>
-                <w:rtl w:val="0"/>
-              </w:rPr>
               <w:t xml:space="preserve">Декрет Володимир Анатолійович</w:t>
             </w:r>
           </w:p>
@@ -4045,2651 +3889,45 @@
       </w:r>
     </w:p>
     <w:p>
-      <w:pPr>
-        <w:spacing w:line="252.00000000000003" w:lineRule="auto"/>
-        <w:jc w:val="both"/>
-        <w:rPr/>
-      </w:pPr>
-      <w:r>
-        <w:rPr>
-          <w:rtl w:val="0"/>
-        </w:rPr>
-        <w:t xml:space="preserve">Авторський колектив має суттєвий науковий доробок у галузі механіки руйнування композитних та неоднорідних матеріалів, що є фундаментальною основою для виконання завдань пропонованої теми. Досвід авторів охоплює розроблення аналітичних і чисельних методів аналізу напружено-деформованого стану та прогнозування довговічності елементів конструкцій із тріщинами.</w:t>
-      </w:r>
-    </w:p>
-    <w:p>
-      <w:pPr>
-        <w:spacing w:line="252.00000000000003" w:lineRule="auto"/>
-        <w:ind w:left="425" w:firstLine="0"/>
-        <w:jc w:val="both"/>
-        <w:rPr/>
-      </w:pPr>
-      <w:r>
-        <w:rPr>
-          <w:rtl w:val="0"/>
-        </w:rPr>
-        <w:t xml:space="preserve">Ключові напрями попередніх досліджень авторів:</w:t>
-      </w:r>
-    </w:p>
-    <w:p>
-      <w:pPr>
-        <w:spacing w:line="252.00000000000003" w:lineRule="auto"/>
-        <w:ind w:firstLine="426"/>
-        <w:jc w:val="both"/>
-        <w:rPr/>
-      </w:pPr>
-      <w:r>
-        <w:rPr>
-          <w:rtl w:val="0"/>
-        </w:rPr>
-        <w:t xml:space="preserve">Механіка міжфазного руйнування та моделювання ламаних меж поділу: розроблено моделі структури привершинної області міжфазної тріщини на ламаній межі розділу матеріалів.</w:t>
-      </w:r>
-    </w:p>
-    <w:p>
-      <w:pPr>
-        <w:spacing w:line="252.00000000000003" w:lineRule="auto"/>
-        <w:ind w:firstLine="426"/>
-        <w:jc w:val="both"/>
-        <w:rPr/>
-      </w:pPr>
-      <w:r>
-        <w:rPr>
-          <w:rtl w:val="0"/>
-        </w:rPr>
-        <w:t xml:space="preserve">Досліджено закономірності зародження, повороту та зрушення міжфазних тріщин під дією стискальних і складних навантажень.</w:t>
-      </w:r>
-    </w:p>
-    <w:p>
-      <w:pPr>
-        <w:spacing w:line="252.00000000000003" w:lineRule="auto"/>
-        <w:ind w:firstLine="426"/>
-        <w:jc w:val="both"/>
-        <w:rPr/>
-      </w:pPr>
-      <w:r>
-        <w:rPr>
-          <w:rtl w:val="0"/>
-        </w:rPr>
-        <w:t xml:space="preserve">Застосування когезійно-зонних моделей (CZM): розроблено та впроваджено методики використання мультилінійних когезійних законів для моделювання повільного та квазістатичного поширення крайових тріщин в ізотропних та ортотропних тілах.</w:t>
-      </w:r>
-    </w:p>
-    <w:p>
-      <w:pPr>
-        <w:spacing w:line="252.00000000000003" w:lineRule="auto"/>
-        <w:ind w:firstLine="426"/>
-        <w:jc w:val="both"/>
-        <w:rPr/>
-      </w:pPr>
-      <w:r>
-        <w:rPr>
-          <w:rtl w:val="0"/>
-        </w:rPr>
-        <w:t xml:space="preserve">Механіка руйнування нелінійно-пружних та в'язкопружних середовищ: побудовано визначальні рівняння та розв’язано крайові задачі для нелінійних анізотропних тіл з урахуванням зон передруйнування. Досліджено процеси субкритичного росту тріщин у в'язкопружних середовищах із використанням операторних методів.</w:t>
-      </w:r>
-    </w:p>
-    <w:p>
-      <w:pPr>
-        <w:spacing w:line="252.00000000000003" w:lineRule="auto"/>
-        <w:ind w:firstLine="426"/>
-        <w:jc w:val="both"/>
-        <w:rPr/>
-      </w:pPr>
-      <w:r>
-        <w:rPr>
-          <w:rtl w:val="0"/>
-        </w:rPr>
-        <w:t xml:space="preserve">Аналітичне моделювання зон процесу (process zones): створено двопараметричні моделі та аналітичні розв’язки для опису зон зчеплення у вершинах тріщин у квазікрихких матеріалах.</w:t>
-      </w:r>
-    </w:p>
-    <w:p>
-      <w:pPr>
-        <w:spacing w:line="252.00000000000003" w:lineRule="auto"/>
-        <w:ind w:firstLine="426"/>
-        <w:jc w:val="both"/>
-        <w:rPr/>
-      </w:pPr>
-      <w:r>
-        <w:rPr>
-          <w:rtl w:val="0"/>
-        </w:rPr>
-        <w:t xml:space="preserve">Дослідження гібридних та сендвічевих систем: вивчено механіку міжфазного відшарування (debonding) у композитних сендвічевих балках із стільниковим заповнювачем, що безпосередньо корелює з задачами руйнування інфраструктурних метакомпозитів.</w:t>
-      </w:r>
-    </w:p>
-    <w:p>
-      <w:pPr>
-        <w:spacing w:after="280" w:before="280" w:line="252.00000000000003" w:lineRule="auto"/>
-        <w:ind w:firstLine="426"/>
-        <w:jc w:val="both"/>
-        <w:rPr/>
-      </w:pPr>
-      <w:r>
-        <w:rPr>
-          <w:rtl w:val="0"/>
-        </w:rPr>
-        <w:t xml:space="preserve">Результати досліджень у 2021–2026 роках відображено у таких основних наукових публікаціях:</w:t>
-      </w:r>
-    </w:p>
-    <w:p>
-      <w:pPr>
-        <w:keepNext w:val="0"/>
-        <w:keepLines w:val="0"/>
-        <w:pageBreakBefore w:val="0"/>
-        <w:widowControl w:val="1"/>
-        <w:numPr>
-          <w:ilvl w:val="1"/>
-          <w:numId w:val="7"/>
-        </w:numPr>
-        <w:pBdr>
-          <w:top w:space="0" w:sz="0" w:val="nil"/>
-          <w:left w:space="0" w:sz="0" w:val="nil"/>
-          <w:bottom w:space="0" w:sz="0" w:val="nil"/>
-          <w:right w:space="0" w:sz="0" w:val="nil"/>
-          <w:between w:space="0" w:sz="0" w:val="nil"/>
-        </w:pBdr>
-        <w:shd w:fill="auto" w:val="clear"/>
-        <w:tabs>
-          <w:tab w:val="center" w:leader="none" w:pos="4677"/>
-          <w:tab w:val="right" w:leader="none" w:pos="9355"/>
-          <w:tab w:val="center" w:leader="none" w:pos="426"/>
-        </w:tabs>
-        <w:spacing w:after="0" w:before="0" w:line="252.00000000000003" w:lineRule="auto"/>
-        <w:ind w:left="426" w:right="0" w:hanging="426"/>
-        <w:jc w:val="left"/>
-        <w:rPr>
-          <w:rFonts w:ascii="Times New Roman" w:cs="Times New Roman" w:eastAsia="Times New Roman" w:hAnsi="Times New Roman"/>
-          <w:b w:val="0"/>
-          <w:bCs w:val="0"/>
-          <w:i w:val="0"/>
-          <w:iCs w:val="0"/>
-          <w:smallCaps w:val="0"/>
-          <w:strike w:val="0"/>
-          <w:color w:val="000000"/>
-          <w:sz w:val="24"/>
-          <w:szCs w:val="24"/>
-          <w:u w:val="none"/>
-          <w:shd w:fill="auto" w:val="clear"/>
-          <w:vertAlign w:val="baseline"/>
-        </w:rPr>
-      </w:pPr>
-      <w:r>
-        <w:rPr>
-          <w:rFonts w:ascii="Times New Roman" w:cs="Times New Roman" w:eastAsia="Times New Roman" w:hAnsi="Times New Roman"/>
-          <w:b w:val="0"/>
-          <w:bCs w:val="0"/>
-          <w:i w:val="0"/>
-          <w:iCs w:val="0"/>
-          <w:smallCaps w:val="0"/>
-          <w:strike w:val="0"/>
-          <w:color w:val="000000"/>
-          <w:sz w:val="24"/>
-          <w:szCs w:val="24"/>
-          <w:u w:val="none"/>
-          <w:shd w:fill="auto" w:val="clear"/>
-          <w:vertAlign w:val="baseline"/>
-          <w:rtl w:val="0"/>
-        </w:rPr>
-        <w:t xml:space="preserve">Камінський А. О., Дудик М. В., Решітник Ю. В. Моделі структури привершинної області міжфазної тріщини на ламаній межі розділу матеріалів : монографія. Бровари : АНФ груп, 2020. 137 с. </w:t>
-      </w:r>
-    </w:p>
-    <w:p>
-      <w:pPr>
-        <w:keepNext w:val="0"/>
-        <w:keepLines w:val="0"/>
-        <w:pageBreakBefore w:val="0"/>
-        <w:widowControl w:val="1"/>
-        <w:numPr>
-          <w:ilvl w:val="1"/>
-          <w:numId w:val="7"/>
-        </w:numPr>
-        <w:pBdr>
-          <w:top w:space="0" w:sz="0" w:val="nil"/>
-          <w:left w:space="0" w:sz="0" w:val="nil"/>
-          <w:bottom w:space="0" w:sz="0" w:val="nil"/>
-          <w:right w:space="0" w:sz="0" w:val="nil"/>
-          <w:between w:space="0" w:sz="0" w:val="nil"/>
-        </w:pBdr>
-        <w:shd w:fill="auto" w:val="clear"/>
-        <w:tabs>
-          <w:tab w:val="center" w:leader="none" w:pos="4677"/>
-          <w:tab w:val="right" w:leader="none" w:pos="9355"/>
-          <w:tab w:val="center" w:leader="none" w:pos="426"/>
-        </w:tabs>
-        <w:spacing w:after="0" w:before="0" w:line="252.00000000000003" w:lineRule="auto"/>
-        <w:ind w:left="426" w:right="0" w:hanging="426"/>
-        <w:jc w:val="left"/>
-        <w:rPr>
-          <w:rFonts w:ascii="Times New Roman" w:cs="Times New Roman" w:eastAsia="Times New Roman" w:hAnsi="Times New Roman"/>
-          <w:b w:val="0"/>
-          <w:bCs w:val="0"/>
-          <w:i w:val="0"/>
-          <w:iCs w:val="0"/>
-          <w:smallCaps w:val="0"/>
-          <w:strike w:val="0"/>
-          <w:color w:val="000000"/>
-          <w:sz w:val="24"/>
-          <w:szCs w:val="24"/>
-          <w:u w:val="none"/>
-          <w:shd w:fill="auto" w:val="clear"/>
-          <w:vertAlign w:val="baseline"/>
-        </w:rPr>
-      </w:pPr>
-      <w:r>
-        <w:rPr>
-          <w:rFonts w:ascii="Times New Roman" w:cs="Times New Roman" w:eastAsia="Times New Roman" w:hAnsi="Times New Roman"/>
-          <w:b w:val="0"/>
-          <w:bCs w:val="0"/>
-          <w:i w:val="0"/>
-          <w:iCs w:val="0"/>
-          <w:smallCaps w:val="0"/>
-          <w:strike w:val="0"/>
-          <w:color w:val="000000"/>
-          <w:sz w:val="24"/>
-          <w:szCs w:val="24"/>
-          <w:u w:val="none"/>
-          <w:shd w:fill="auto" w:val="clear"/>
-          <w:vertAlign w:val="baseline"/>
-          <w:rtl w:val="0"/>
-        </w:rPr>
-        <w:t xml:space="preserve">Камінський А. О., Дудик М. В., Решітник Ю. В., Феньків В. М. Дослідження початкового етапу руйнування кусково-однорідного тіла з міжфазною тріщиною при стисканні вздовж межі поділу // Математичні методи та фізико-механічні поля. 2020. Т. 63, № 4. С. 109–121. </w:t>
-      </w:r>
-    </w:p>
-    <w:p>
-      <w:pPr>
-        <w:keepNext w:val="0"/>
-        <w:keepLines w:val="0"/>
-        <w:pageBreakBefore w:val="0"/>
-        <w:widowControl w:val="1"/>
-        <w:numPr>
-          <w:ilvl w:val="1"/>
-          <w:numId w:val="7"/>
-        </w:numPr>
-        <w:pBdr>
-          <w:top w:space="0" w:sz="0" w:val="nil"/>
-          <w:left w:space="0" w:sz="0" w:val="nil"/>
-          <w:bottom w:space="0" w:sz="0" w:val="nil"/>
-          <w:right w:space="0" w:sz="0" w:val="nil"/>
-          <w:between w:space="0" w:sz="0" w:val="nil"/>
-        </w:pBdr>
-        <w:shd w:fill="auto" w:val="clear"/>
-        <w:tabs>
-          <w:tab w:val="center" w:leader="none" w:pos="4677"/>
-          <w:tab w:val="right" w:leader="none" w:pos="9355"/>
-          <w:tab w:val="center" w:leader="none" w:pos="426"/>
-        </w:tabs>
-        <w:spacing w:after="0" w:before="0" w:line="252.00000000000003" w:lineRule="auto"/>
-        <w:ind w:left="426" w:right="0" w:hanging="426"/>
-        <w:jc w:val="left"/>
-        <w:rPr>
-          <w:rFonts w:ascii="Times New Roman" w:cs="Times New Roman" w:eastAsia="Times New Roman" w:hAnsi="Times New Roman"/>
-          <w:b w:val="0"/>
-          <w:bCs w:val="0"/>
-          <w:i w:val="0"/>
-          <w:iCs w:val="0"/>
-          <w:smallCaps w:val="0"/>
-          <w:strike w:val="0"/>
-          <w:color w:val="000000"/>
-          <w:sz w:val="24"/>
-          <w:szCs w:val="24"/>
-          <w:u w:val="none"/>
-          <w:shd w:fill="auto" w:val="clear"/>
-          <w:vertAlign w:val="baseline"/>
-        </w:rPr>
-      </w:pPr>
-      <w:r>
-        <w:rPr>
-          <w:rFonts w:ascii="Times New Roman" w:cs="Times New Roman" w:eastAsia="Times New Roman" w:hAnsi="Times New Roman"/>
-          <w:b w:val="0"/>
-          <w:bCs w:val="0"/>
-          <w:i w:val="0"/>
-          <w:iCs w:val="0"/>
-          <w:smallCaps w:val="0"/>
-          <w:strike w:val="0"/>
-          <w:color w:val="000000"/>
-          <w:sz w:val="24"/>
-          <w:szCs w:val="24"/>
-          <w:u w:val="none"/>
-          <w:shd w:fill="auto" w:val="clear"/>
-          <w:vertAlign w:val="baseline"/>
-          <w:rtl w:val="0"/>
-        </w:rPr>
-        <w:t xml:space="preserve">Kaminsky A. O. Studies of subcritical crack growth in viscoelastic anisotropic bodies using the continued fraction operator method: synthesis end summary // International Applied Mechanics. 2021. Vol. 57, № 3. P. 263–281. </w:t>
-      </w:r>
-    </w:p>
-    <w:p>
-      <w:pPr>
-        <w:keepNext w:val="0"/>
-        <w:keepLines w:val="0"/>
-        <w:pageBreakBefore w:val="0"/>
-        <w:widowControl w:val="1"/>
-        <w:numPr>
-          <w:ilvl w:val="1"/>
-          <w:numId w:val="7"/>
-        </w:numPr>
-        <w:pBdr>
-          <w:top w:space="0" w:sz="0" w:val="nil"/>
-          <w:left w:space="0" w:sz="0" w:val="nil"/>
-          <w:bottom w:space="0" w:sz="0" w:val="nil"/>
-          <w:right w:space="0" w:sz="0" w:val="nil"/>
-          <w:between w:space="0" w:sz="0" w:val="nil"/>
-        </w:pBdr>
-        <w:shd w:fill="auto" w:val="clear"/>
-        <w:tabs>
-          <w:tab w:val="center" w:leader="none" w:pos="4677"/>
-          <w:tab w:val="right" w:leader="none" w:pos="9355"/>
-          <w:tab w:val="center" w:leader="none" w:pos="426"/>
-        </w:tabs>
-        <w:spacing w:after="0" w:before="0" w:line="252.00000000000003" w:lineRule="auto"/>
-        <w:ind w:left="426" w:right="0" w:hanging="426"/>
-        <w:jc w:val="left"/>
-        <w:rPr>
-          <w:rFonts w:ascii="Times New Roman" w:cs="Times New Roman" w:eastAsia="Times New Roman" w:hAnsi="Times New Roman"/>
-          <w:b w:val="0"/>
-          <w:bCs w:val="0"/>
-          <w:i w:val="0"/>
-          <w:iCs w:val="0"/>
-          <w:smallCaps w:val="0"/>
-          <w:strike w:val="0"/>
-          <w:color w:val="000000"/>
-          <w:sz w:val="24"/>
-          <w:szCs w:val="24"/>
-          <w:u w:val="none"/>
-          <w:shd w:fill="auto" w:val="clear"/>
-          <w:vertAlign w:val="baseline"/>
-        </w:rPr>
-      </w:pPr>
-      <w:r>
-        <w:rPr>
-          <w:rFonts w:ascii="Times New Roman" w:cs="Times New Roman" w:eastAsia="Times New Roman" w:hAnsi="Times New Roman"/>
-          <w:b w:val="0"/>
-          <w:bCs w:val="0"/>
-          <w:i w:val="0"/>
-          <w:iCs w:val="0"/>
-          <w:smallCaps w:val="0"/>
-          <w:strike w:val="0"/>
-          <w:color w:val="000000"/>
-          <w:sz w:val="24"/>
-          <w:szCs w:val="24"/>
-          <w:u w:val="none"/>
-          <w:shd w:fill="auto" w:val="clear"/>
-          <w:vertAlign w:val="baseline"/>
-          <w:rtl w:val="0"/>
-        </w:rPr>
-        <w:t xml:space="preserve">Камінський А., Дудик М., Решітник Ю., Феньків В. Модель зрушення міжфазної тріщини під дією стискального навантаження, паралельного до її берегів // Сучасні проблеми термомеханіки – 2021 : зб. наук. праць Міжнар. наук. конф. та міні-симпозіумів (Львів, 2021) / за заг. ред. Р. М. Кушніра і Ю. В. Токового. Львів : ІППММ ім. Я. С. Підстригача НАН України, 2021. С. 17–18. </w:t>
-      </w:r>
-    </w:p>
-    <w:p>
-      <w:pPr>
-        <w:keepNext w:val="0"/>
-        <w:keepLines w:val="0"/>
-        <w:pageBreakBefore w:val="0"/>
-        <w:widowControl w:val="1"/>
-        <w:numPr>
-          <w:ilvl w:val="1"/>
-          <w:numId w:val="7"/>
-        </w:numPr>
-        <w:pBdr>
-          <w:top w:space="0" w:sz="0" w:val="nil"/>
-          <w:left w:space="0" w:sz="0" w:val="nil"/>
-          <w:bottom w:space="0" w:sz="0" w:val="nil"/>
-          <w:right w:space="0" w:sz="0" w:val="nil"/>
-          <w:between w:space="0" w:sz="0" w:val="nil"/>
-        </w:pBdr>
-        <w:shd w:fill="auto" w:val="clear"/>
-        <w:tabs>
-          <w:tab w:val="center" w:leader="none" w:pos="4677"/>
-          <w:tab w:val="right" w:leader="none" w:pos="9355"/>
-          <w:tab w:val="center" w:leader="none" w:pos="426"/>
-        </w:tabs>
-        <w:spacing w:after="0" w:before="0" w:line="252.00000000000003" w:lineRule="auto"/>
-        <w:ind w:left="426" w:right="0" w:hanging="426"/>
-        <w:jc w:val="left"/>
-        <w:rPr>
-          <w:rFonts w:ascii="Times New Roman" w:cs="Times New Roman" w:eastAsia="Times New Roman" w:hAnsi="Times New Roman"/>
-          <w:b w:val="0"/>
-          <w:bCs w:val="0"/>
-          <w:i w:val="0"/>
-          <w:iCs w:val="0"/>
-          <w:smallCaps w:val="0"/>
-          <w:strike w:val="0"/>
-          <w:color w:val="000000"/>
-          <w:sz w:val="24"/>
-          <w:szCs w:val="24"/>
-          <w:u w:val="none"/>
-          <w:shd w:fill="auto" w:val="clear"/>
-          <w:vertAlign w:val="baseline"/>
-        </w:rPr>
-      </w:pPr>
-      <w:r>
-        <w:rPr>
-          <w:rFonts w:ascii="Times New Roman" w:cs="Times New Roman" w:eastAsia="Times New Roman" w:hAnsi="Times New Roman"/>
-          <w:b w:val="0"/>
-          <w:bCs w:val="0"/>
-          <w:i w:val="0"/>
-          <w:iCs w:val="0"/>
-          <w:smallCaps w:val="0"/>
-          <w:strike w:val="0"/>
-          <w:color w:val="000000"/>
-          <w:sz w:val="24"/>
-          <w:szCs w:val="24"/>
-          <w:u w:val="none"/>
-          <w:shd w:fill="auto" w:val="clear"/>
-          <w:vertAlign w:val="baseline"/>
-          <w:rtl w:val="0"/>
-        </w:rPr>
-        <w:t xml:space="preserve">Селіванов М. Ф., Чорноіван Ю. О. Застосування моделі мультилінійної когезійної зони до задачі про крайову тріщину в ізотропному та ортотропному тілі // Сучасні проблеми механіки : матеріали VI Міжнар. наук. конф. (Київ, 30–31 серпня 2021 р.). Київ : КНУ, 2021. С. 71. </w:t>
-      </w:r>
-    </w:p>
-    <w:p>
-      <w:pPr>
-        <w:keepNext w:val="0"/>
-        <w:keepLines w:val="0"/>
-        <w:pageBreakBefore w:val="0"/>
-        <w:widowControl w:val="1"/>
-        <w:numPr>
-          <w:ilvl w:val="1"/>
-          <w:numId w:val="7"/>
-        </w:numPr>
-        <w:pBdr>
-          <w:top w:space="0" w:sz="0" w:val="nil"/>
-          <w:left w:space="0" w:sz="0" w:val="nil"/>
-          <w:bottom w:space="0" w:sz="0" w:val="nil"/>
-          <w:right w:space="0" w:sz="0" w:val="nil"/>
-          <w:between w:space="0" w:sz="0" w:val="nil"/>
-        </w:pBdr>
-        <w:shd w:fill="auto" w:val="clear"/>
-        <w:tabs>
-          <w:tab w:val="center" w:leader="none" w:pos="4677"/>
-          <w:tab w:val="right" w:leader="none" w:pos="9355"/>
-          <w:tab w:val="center" w:leader="none" w:pos="426"/>
-        </w:tabs>
-        <w:spacing w:after="0" w:before="0" w:line="252.00000000000003" w:lineRule="auto"/>
-        <w:ind w:left="426" w:right="0" w:hanging="426"/>
-        <w:jc w:val="left"/>
-        <w:rPr>
-          <w:rFonts w:ascii="Times New Roman" w:cs="Times New Roman" w:eastAsia="Times New Roman" w:hAnsi="Times New Roman"/>
-          <w:b w:val="0"/>
-          <w:bCs w:val="0"/>
-          <w:i w:val="0"/>
-          <w:iCs w:val="0"/>
-          <w:smallCaps w:val="0"/>
-          <w:strike w:val="0"/>
-          <w:color w:val="000000"/>
-          <w:sz w:val="24"/>
-          <w:szCs w:val="24"/>
-          <w:u w:val="none"/>
-          <w:shd w:fill="auto" w:val="clear"/>
-          <w:vertAlign w:val="baseline"/>
-        </w:rPr>
-      </w:pPr>
-      <w:r>
-        <w:rPr>
-          <w:rFonts w:ascii="Times New Roman" w:cs="Times New Roman" w:eastAsia="Times New Roman" w:hAnsi="Times New Roman"/>
-          <w:b w:val="0"/>
-          <w:bCs w:val="0"/>
-          <w:i w:val="0"/>
-          <w:iCs w:val="0"/>
-          <w:smallCaps w:val="0"/>
-          <w:strike w:val="0"/>
-          <w:color w:val="000000"/>
-          <w:sz w:val="24"/>
-          <w:szCs w:val="24"/>
-          <w:u w:val="none"/>
-          <w:shd w:fill="auto" w:val="clear"/>
-          <w:vertAlign w:val="baseline"/>
-          <w:rtl w:val="0"/>
-        </w:rPr>
-        <w:t xml:space="preserve">Selivanov M., Nazarenko L., Altenbach H. Modeling the slow crack growth of an edge crack within the cohesive zone model approach // Theoretical Analyses, Computations, and Experiments of Multiscale Materials: A Tribute to Francesco dell'Isola / eds. I. Giorgio et al. Cham : Springer International Publishing, 2022. P. 505–535. </w:t>
-      </w:r>
-    </w:p>
-    <w:p>
-      <w:pPr>
-        <w:keepNext w:val="0"/>
-        <w:keepLines w:val="0"/>
-        <w:pageBreakBefore w:val="0"/>
-        <w:widowControl w:val="1"/>
-        <w:numPr>
-          <w:ilvl w:val="1"/>
-          <w:numId w:val="7"/>
-        </w:numPr>
-        <w:pBdr>
-          <w:top w:space="0" w:sz="0" w:val="nil"/>
-          <w:left w:space="0" w:sz="0" w:val="nil"/>
-          <w:bottom w:space="0" w:sz="0" w:val="nil"/>
-          <w:right w:space="0" w:sz="0" w:val="nil"/>
-          <w:between w:space="0" w:sz="0" w:val="nil"/>
-        </w:pBdr>
-        <w:shd w:fill="auto" w:val="clear"/>
-        <w:tabs>
-          <w:tab w:val="center" w:leader="none" w:pos="4677"/>
-          <w:tab w:val="right" w:leader="none" w:pos="9355"/>
-          <w:tab w:val="center" w:leader="none" w:pos="426"/>
-        </w:tabs>
-        <w:spacing w:after="0" w:before="0" w:line="252.00000000000003" w:lineRule="auto"/>
-        <w:ind w:left="426" w:right="0" w:hanging="426"/>
-        <w:jc w:val="left"/>
-        <w:rPr>
-          <w:rFonts w:ascii="Times New Roman" w:cs="Times New Roman" w:eastAsia="Times New Roman" w:hAnsi="Times New Roman"/>
-          <w:b w:val="0"/>
-          <w:bCs w:val="0"/>
-          <w:i w:val="0"/>
-          <w:iCs w:val="0"/>
-          <w:smallCaps w:val="0"/>
-          <w:strike w:val="0"/>
-          <w:color w:val="000000"/>
-          <w:sz w:val="24"/>
-          <w:szCs w:val="24"/>
-          <w:u w:val="none"/>
-          <w:shd w:fill="auto" w:val="clear"/>
-          <w:vertAlign w:val="baseline"/>
-        </w:rPr>
-      </w:pPr>
-      <w:r>
-        <w:rPr>
-          <w:rFonts w:ascii="Times New Roman" w:cs="Times New Roman" w:eastAsia="Times New Roman" w:hAnsi="Times New Roman"/>
-          <w:b w:val="0"/>
-          <w:bCs w:val="0"/>
-          <w:i w:val="0"/>
-          <w:iCs w:val="0"/>
-          <w:smallCaps w:val="0"/>
-          <w:strike w:val="0"/>
-          <w:color w:val="000000"/>
-          <w:sz w:val="24"/>
-          <w:szCs w:val="24"/>
-          <w:u w:val="none"/>
-          <w:shd w:fill="auto" w:val="clear"/>
-          <w:vertAlign w:val="baseline"/>
-          <w:rtl w:val="0"/>
-        </w:rPr>
-        <w:t xml:space="preserve">Selivanov M., Protsan V. Solving the problem on the subcritical state // Dopov. Nac. akad. nauk Ukr. 2022. № 1. P. 39–47. </w:t>
-      </w:r>
-    </w:p>
-    <w:p>
-      <w:pPr>
-        <w:keepNext w:val="0"/>
-        <w:keepLines w:val="0"/>
-        <w:pageBreakBefore w:val="0"/>
-        <w:widowControl w:val="1"/>
-        <w:numPr>
-          <w:ilvl w:val="1"/>
-          <w:numId w:val="7"/>
-        </w:numPr>
-        <w:pBdr>
-          <w:top w:space="0" w:sz="0" w:val="nil"/>
-          <w:left w:space="0" w:sz="0" w:val="nil"/>
-          <w:bottom w:space="0" w:sz="0" w:val="nil"/>
-          <w:right w:space="0" w:sz="0" w:val="nil"/>
-          <w:between w:space="0" w:sz="0" w:val="nil"/>
-        </w:pBdr>
-        <w:shd w:fill="auto" w:val="clear"/>
-        <w:tabs>
-          <w:tab w:val="center" w:leader="none" w:pos="4677"/>
-          <w:tab w:val="right" w:leader="none" w:pos="9355"/>
-          <w:tab w:val="center" w:leader="none" w:pos="426"/>
-        </w:tabs>
-        <w:spacing w:after="0" w:before="0" w:line="252.00000000000003" w:lineRule="auto"/>
-        <w:ind w:left="426" w:right="0" w:hanging="426"/>
-        <w:jc w:val="left"/>
-        <w:rPr>
-          <w:rFonts w:ascii="Times New Roman" w:cs="Times New Roman" w:eastAsia="Times New Roman" w:hAnsi="Times New Roman"/>
-          <w:b w:val="0"/>
-          <w:bCs w:val="0"/>
-          <w:i w:val="0"/>
-          <w:iCs w:val="0"/>
-          <w:smallCaps w:val="0"/>
-          <w:strike w:val="0"/>
-          <w:color w:val="000000"/>
-          <w:sz w:val="24"/>
-          <w:szCs w:val="24"/>
-          <w:u w:val="none"/>
-          <w:shd w:fill="auto" w:val="clear"/>
-          <w:vertAlign w:val="baseline"/>
-        </w:rPr>
-      </w:pPr>
-      <w:r>
-        <w:rPr>
-          <w:rFonts w:ascii="Times New Roman" w:cs="Times New Roman" w:eastAsia="Times New Roman" w:hAnsi="Times New Roman"/>
-          <w:b w:val="0"/>
-          <w:bCs w:val="0"/>
-          <w:i w:val="0"/>
-          <w:iCs w:val="0"/>
-          <w:smallCaps w:val="0"/>
-          <w:strike w:val="0"/>
-          <w:color w:val="000000"/>
-          <w:sz w:val="24"/>
-          <w:szCs w:val="24"/>
-          <w:u w:val="none"/>
-          <w:shd w:fill="auto" w:val="clear"/>
-          <w:vertAlign w:val="baseline"/>
-          <w:rtl w:val="0"/>
-        </w:rPr>
-        <w:t xml:space="preserve">Kaminsky A. O., Kurchakov E. E. Tensor-Nonlinear Constitutive Equations for an Elastic Body with Primary Anisotropy // International Applied Mechanics. 2022. Vol. 58, № 2. P. 154–159. </w:t>
-      </w:r>
-    </w:p>
-    <w:p>
-      <w:pPr>
-        <w:keepNext w:val="0"/>
-        <w:keepLines w:val="0"/>
-        <w:pageBreakBefore w:val="0"/>
-        <w:widowControl w:val="1"/>
-        <w:numPr>
-          <w:ilvl w:val="1"/>
-          <w:numId w:val="7"/>
-        </w:numPr>
-        <w:pBdr>
-          <w:top w:space="0" w:sz="0" w:val="nil"/>
-          <w:left w:space="0" w:sz="0" w:val="nil"/>
-          <w:bottom w:space="0" w:sz="0" w:val="nil"/>
-          <w:right w:space="0" w:sz="0" w:val="nil"/>
-          <w:between w:space="0" w:sz="0" w:val="nil"/>
-        </w:pBdr>
-        <w:shd w:fill="auto" w:val="clear"/>
-        <w:tabs>
-          <w:tab w:val="center" w:leader="none" w:pos="4677"/>
-          <w:tab w:val="right" w:leader="none" w:pos="9355"/>
-          <w:tab w:val="center" w:leader="none" w:pos="426"/>
-        </w:tabs>
-        <w:spacing w:after="0" w:before="0" w:line="252.00000000000003" w:lineRule="auto"/>
-        <w:ind w:left="426" w:right="0" w:hanging="426"/>
-        <w:jc w:val="left"/>
-        <w:rPr>
-          <w:rFonts w:ascii="Times New Roman" w:cs="Times New Roman" w:eastAsia="Times New Roman" w:hAnsi="Times New Roman"/>
-          <w:b w:val="0"/>
-          <w:bCs w:val="0"/>
-          <w:i w:val="0"/>
-          <w:iCs w:val="0"/>
-          <w:smallCaps w:val="0"/>
-          <w:strike w:val="0"/>
-          <w:color w:val="000000"/>
-          <w:sz w:val="24"/>
-          <w:szCs w:val="24"/>
-          <w:u w:val="none"/>
-          <w:shd w:fill="auto" w:val="clear"/>
-          <w:vertAlign w:val="baseline"/>
-        </w:rPr>
-      </w:pPr>
-      <w:r>
-        <w:rPr>
-          <w:rFonts w:ascii="Times New Roman" w:cs="Times New Roman" w:eastAsia="Times New Roman" w:hAnsi="Times New Roman"/>
-          <w:b w:val="0"/>
-          <w:bCs w:val="0"/>
-          <w:i w:val="0"/>
-          <w:iCs w:val="0"/>
-          <w:smallCaps w:val="0"/>
-          <w:strike w:val="0"/>
-          <w:color w:val="000000"/>
-          <w:sz w:val="24"/>
-          <w:szCs w:val="24"/>
-          <w:u w:val="none"/>
-          <w:shd w:fill="auto" w:val="clear"/>
-          <w:vertAlign w:val="baseline"/>
-          <w:rtl w:val="0"/>
-        </w:rPr>
-        <w:t xml:space="preserve">Kaminsky A. O., Kurchakov E. E., Chornoivan Yu. O. Boundary-value problems of fracture mechanics for a nonlinear anisotropic body // International Applied Mechanics. 2022. Vol. 58, № 3. P. 243–279. </w:t>
-      </w:r>
-    </w:p>
-    <w:p>
-      <w:pPr>
-        <w:keepNext w:val="0"/>
-        <w:keepLines w:val="0"/>
-        <w:pageBreakBefore w:val="0"/>
-        <w:widowControl w:val="1"/>
-        <w:numPr>
-          <w:ilvl w:val="1"/>
-          <w:numId w:val="7"/>
-        </w:numPr>
-        <w:pBdr>
-          <w:top w:space="0" w:sz="0" w:val="nil"/>
-          <w:left w:space="0" w:sz="0" w:val="nil"/>
-          <w:bottom w:space="0" w:sz="0" w:val="nil"/>
-          <w:right w:space="0" w:sz="0" w:val="nil"/>
-          <w:between w:space="0" w:sz="0" w:val="nil"/>
-        </w:pBdr>
-        <w:shd w:fill="auto" w:val="clear"/>
-        <w:tabs>
-          <w:tab w:val="center" w:leader="none" w:pos="4677"/>
-          <w:tab w:val="right" w:leader="none" w:pos="9355"/>
-          <w:tab w:val="center" w:leader="none" w:pos="426"/>
-        </w:tabs>
-        <w:spacing w:after="0" w:before="0" w:line="252.00000000000003" w:lineRule="auto"/>
-        <w:ind w:left="426" w:right="0" w:hanging="426"/>
-        <w:jc w:val="left"/>
-        <w:rPr>
-          <w:rFonts w:ascii="Times New Roman" w:cs="Times New Roman" w:eastAsia="Times New Roman" w:hAnsi="Times New Roman"/>
-          <w:b w:val="0"/>
-          <w:bCs w:val="0"/>
-          <w:i w:val="0"/>
-          <w:iCs w:val="0"/>
-          <w:smallCaps w:val="0"/>
-          <w:strike w:val="0"/>
-          <w:color w:val="000000"/>
-          <w:sz w:val="24"/>
-          <w:szCs w:val="24"/>
-          <w:u w:val="none"/>
-          <w:shd w:fill="auto" w:val="clear"/>
-          <w:vertAlign w:val="baseline"/>
-        </w:rPr>
-      </w:pPr>
-      <w:r>
-        <w:rPr>
-          <w:rFonts w:ascii="Times New Roman" w:cs="Times New Roman" w:eastAsia="Times New Roman" w:hAnsi="Times New Roman"/>
-          <w:b w:val="0"/>
-          <w:bCs w:val="0"/>
-          <w:i w:val="0"/>
-          <w:iCs w:val="0"/>
-          <w:smallCaps w:val="0"/>
-          <w:strike w:val="0"/>
-          <w:color w:val="000000"/>
-          <w:sz w:val="24"/>
-          <w:szCs w:val="24"/>
-          <w:u w:val="none"/>
-          <w:shd w:fill="auto" w:val="clear"/>
-          <w:vertAlign w:val="baseline"/>
-          <w:rtl w:val="0"/>
-        </w:rPr>
-        <w:t xml:space="preserve">Камінський А. О., Дудик М. В., Феньків В. М., Чорноіван Ю. О. Про границі застосовності і обмеження моделі Комніноу для тріщини з ламаною межею розділу // Прикладна механіка. 2022. Т. 58, № 4. С. 32–44. </w:t>
-      </w:r>
-    </w:p>
-    <w:p>
-      <w:pPr>
-        <w:keepNext w:val="0"/>
-        <w:keepLines w:val="0"/>
-        <w:pageBreakBefore w:val="0"/>
-        <w:widowControl w:val="1"/>
-        <w:numPr>
-          <w:ilvl w:val="1"/>
-          <w:numId w:val="7"/>
-        </w:numPr>
-        <w:pBdr>
-          <w:top w:space="0" w:sz="0" w:val="nil"/>
-          <w:left w:space="0" w:sz="0" w:val="nil"/>
-          <w:bottom w:space="0" w:sz="0" w:val="nil"/>
-          <w:right w:space="0" w:sz="0" w:val="nil"/>
-          <w:between w:space="0" w:sz="0" w:val="nil"/>
-        </w:pBdr>
-        <w:shd w:fill="auto" w:val="clear"/>
-        <w:tabs>
-          <w:tab w:val="center" w:leader="none" w:pos="4677"/>
-          <w:tab w:val="right" w:leader="none" w:pos="9355"/>
-          <w:tab w:val="center" w:leader="none" w:pos="426"/>
-        </w:tabs>
-        <w:spacing w:after="0" w:before="0" w:line="252.00000000000003" w:lineRule="auto"/>
-        <w:ind w:left="426" w:right="0" w:hanging="426"/>
-        <w:jc w:val="left"/>
-        <w:rPr>
-          <w:rFonts w:ascii="Times New Roman" w:cs="Times New Roman" w:eastAsia="Times New Roman" w:hAnsi="Times New Roman"/>
-          <w:b w:val="0"/>
-          <w:bCs w:val="0"/>
-          <w:i w:val="0"/>
-          <w:iCs w:val="0"/>
-          <w:smallCaps w:val="0"/>
-          <w:strike w:val="0"/>
-          <w:color w:val="000000"/>
-          <w:sz w:val="24"/>
-          <w:szCs w:val="24"/>
-          <w:u w:val="none"/>
-          <w:shd w:fill="auto" w:val="clear"/>
-          <w:vertAlign w:val="baseline"/>
-        </w:rPr>
-      </w:pPr>
-      <w:r>
-        <w:rPr>
-          <w:rFonts w:ascii="Times New Roman" w:cs="Times New Roman" w:eastAsia="Times New Roman" w:hAnsi="Times New Roman"/>
-          <w:b w:val="0"/>
-          <w:bCs w:val="0"/>
-          <w:i w:val="0"/>
-          <w:iCs w:val="0"/>
-          <w:smallCaps w:val="0"/>
-          <w:strike w:val="0"/>
-          <w:color w:val="000000"/>
-          <w:sz w:val="24"/>
-          <w:szCs w:val="24"/>
-          <w:u w:val="none"/>
-          <w:shd w:fill="auto" w:val="clear"/>
-          <w:vertAlign w:val="baseline"/>
-          <w:rtl w:val="0"/>
-        </w:rPr>
-        <w:t xml:space="preserve">Камінський А. О., Дудик М. В., Феньків В. М. Про зрушення міжфазної тріщини з контактом берегів від кутової точки ламаної межі розділу // Прикладна механіка. 2022. Т. 58, № 5. С. 39–51. </w:t>
-      </w:r>
-    </w:p>
-    <w:p>
-      <w:pPr>
-        <w:keepNext w:val="0"/>
-        <w:keepLines w:val="0"/>
-        <w:pageBreakBefore w:val="0"/>
-        <w:widowControl w:val="1"/>
-        <w:numPr>
-          <w:ilvl w:val="1"/>
-          <w:numId w:val="7"/>
-        </w:numPr>
-        <w:pBdr>
-          <w:top w:space="0" w:sz="0" w:val="nil"/>
-          <w:left w:space="0" w:sz="0" w:val="nil"/>
-          <w:bottom w:space="0" w:sz="0" w:val="nil"/>
-          <w:right w:space="0" w:sz="0" w:val="nil"/>
-          <w:between w:space="0" w:sz="0" w:val="nil"/>
-        </w:pBdr>
-        <w:shd w:fill="auto" w:val="clear"/>
-        <w:tabs>
-          <w:tab w:val="center" w:leader="none" w:pos="4677"/>
-          <w:tab w:val="right" w:leader="none" w:pos="9355"/>
-          <w:tab w:val="center" w:leader="none" w:pos="426"/>
-        </w:tabs>
-        <w:spacing w:after="0" w:before="0" w:line="252.00000000000003" w:lineRule="auto"/>
-        <w:ind w:left="426" w:right="0" w:hanging="426"/>
-        <w:jc w:val="left"/>
-        <w:rPr>
-          <w:rFonts w:ascii="Times New Roman" w:cs="Times New Roman" w:eastAsia="Times New Roman" w:hAnsi="Times New Roman"/>
-          <w:b w:val="0"/>
-          <w:bCs w:val="0"/>
-          <w:i w:val="0"/>
-          <w:iCs w:val="0"/>
-          <w:smallCaps w:val="0"/>
-          <w:strike w:val="0"/>
-          <w:color w:val="000000"/>
-          <w:sz w:val="24"/>
-          <w:szCs w:val="24"/>
-          <w:u w:val="none"/>
-          <w:shd w:fill="auto" w:val="clear"/>
-          <w:vertAlign w:val="baseline"/>
-        </w:rPr>
-      </w:pPr>
-      <w:r>
-        <w:rPr>
-          <w:rFonts w:ascii="Times New Roman" w:cs="Times New Roman" w:eastAsia="Times New Roman" w:hAnsi="Times New Roman"/>
-          <w:b w:val="0"/>
-          <w:bCs w:val="0"/>
-          <w:i w:val="0"/>
-          <w:iCs w:val="0"/>
-          <w:smallCaps w:val="0"/>
-          <w:strike w:val="0"/>
-          <w:color w:val="000000"/>
-          <w:sz w:val="24"/>
-          <w:szCs w:val="24"/>
-          <w:u w:val="none"/>
-          <w:shd w:fill="auto" w:val="clear"/>
-          <w:vertAlign w:val="baseline"/>
-          <w:rtl w:val="0"/>
-        </w:rPr>
-        <w:t xml:space="preserve">Kaminsky A., Dudyk M., Reshitnyk Yu., Chornoivan Yu. An analytical method of modeling the process zone near the tip of an interface crack due to its kinking from the interface of quasi-elastic materials // International Journal of Solids and Structures. 2023. Vol. 267. 112117. </w:t>
-      </w:r>
-    </w:p>
-    <w:p>
-      <w:pPr>
-        <w:keepNext w:val="0"/>
-        <w:keepLines w:val="0"/>
-        <w:pageBreakBefore w:val="0"/>
-        <w:widowControl w:val="1"/>
-        <w:numPr>
-          <w:ilvl w:val="1"/>
-          <w:numId w:val="7"/>
-        </w:numPr>
-        <w:pBdr>
-          <w:top w:space="0" w:sz="0" w:val="nil"/>
-          <w:left w:space="0" w:sz="0" w:val="nil"/>
-          <w:bottom w:space="0" w:sz="0" w:val="nil"/>
-          <w:right w:space="0" w:sz="0" w:val="nil"/>
-          <w:between w:space="0" w:sz="0" w:val="nil"/>
-        </w:pBdr>
-        <w:shd w:fill="auto" w:val="clear"/>
-        <w:tabs>
-          <w:tab w:val="center" w:leader="none" w:pos="4677"/>
-          <w:tab w:val="right" w:leader="none" w:pos="9355"/>
-          <w:tab w:val="center" w:leader="none" w:pos="426"/>
-        </w:tabs>
-        <w:spacing w:after="0" w:before="0" w:line="252.00000000000003" w:lineRule="auto"/>
-        <w:ind w:left="426" w:right="0" w:hanging="426"/>
-        <w:jc w:val="left"/>
-        <w:rPr>
-          <w:rFonts w:ascii="Times New Roman" w:cs="Times New Roman" w:eastAsia="Times New Roman" w:hAnsi="Times New Roman"/>
-          <w:b w:val="0"/>
-          <w:bCs w:val="0"/>
-          <w:i w:val="0"/>
-          <w:iCs w:val="0"/>
-          <w:smallCaps w:val="0"/>
-          <w:strike w:val="0"/>
-          <w:color w:val="000000"/>
-          <w:sz w:val="24"/>
-          <w:szCs w:val="24"/>
-          <w:u w:val="none"/>
-          <w:shd w:fill="auto" w:val="clear"/>
-          <w:vertAlign w:val="baseline"/>
-        </w:rPr>
-      </w:pPr>
-      <w:r>
-        <w:rPr>
-          <w:rFonts w:ascii="Times New Roman" w:cs="Times New Roman" w:eastAsia="Times New Roman" w:hAnsi="Times New Roman"/>
-          <w:b w:val="0"/>
-          <w:bCs w:val="0"/>
-          <w:i w:val="0"/>
-          <w:iCs w:val="0"/>
-          <w:smallCaps w:val="0"/>
-          <w:strike w:val="0"/>
-          <w:color w:val="000000"/>
-          <w:sz w:val="24"/>
-          <w:szCs w:val="24"/>
-          <w:u w:val="none"/>
-          <w:shd w:fill="auto" w:val="clear"/>
-          <w:vertAlign w:val="baseline"/>
-          <w:rtl w:val="0"/>
-        </w:rPr>
-        <w:t xml:space="preserve">Selivanov M., Bogdanov V., Altenbach H. Solving some problems of crack mechanics for a normal edge crack in orthotropic solid within the cohesive zone model approach // Mechanics of Composite Materials. 2023. Vol. 59, № 2. P. 335–362. </w:t>
-      </w:r>
-    </w:p>
-    <w:p>
-      <w:pPr>
-        <w:keepNext w:val="0"/>
-        <w:keepLines w:val="0"/>
-        <w:pageBreakBefore w:val="0"/>
-        <w:widowControl w:val="1"/>
-        <w:numPr>
-          <w:ilvl w:val="1"/>
-          <w:numId w:val="7"/>
-        </w:numPr>
-        <w:pBdr>
-          <w:top w:space="0" w:sz="0" w:val="nil"/>
-          <w:left w:space="0" w:sz="0" w:val="nil"/>
-          <w:bottom w:space="0" w:sz="0" w:val="nil"/>
-          <w:right w:space="0" w:sz="0" w:val="nil"/>
-          <w:between w:space="0" w:sz="0" w:val="nil"/>
-        </w:pBdr>
-        <w:shd w:fill="auto" w:val="clear"/>
-        <w:tabs>
-          <w:tab w:val="center" w:leader="none" w:pos="4677"/>
-          <w:tab w:val="right" w:leader="none" w:pos="9355"/>
-          <w:tab w:val="center" w:leader="none" w:pos="426"/>
-        </w:tabs>
-        <w:spacing w:after="0" w:before="0" w:line="252.00000000000003" w:lineRule="auto"/>
-        <w:ind w:left="426" w:right="0" w:hanging="426"/>
-        <w:jc w:val="left"/>
-        <w:rPr>
-          <w:rFonts w:ascii="Times New Roman" w:cs="Times New Roman" w:eastAsia="Times New Roman" w:hAnsi="Times New Roman"/>
-          <w:b w:val="0"/>
-          <w:bCs w:val="0"/>
-          <w:i w:val="0"/>
-          <w:iCs w:val="0"/>
-          <w:smallCaps w:val="0"/>
-          <w:strike w:val="0"/>
-          <w:color w:val="000000"/>
-          <w:sz w:val="24"/>
-          <w:szCs w:val="24"/>
-          <w:u w:val="none"/>
-          <w:shd w:fill="auto" w:val="clear"/>
-          <w:vertAlign w:val="baseline"/>
-        </w:rPr>
-      </w:pPr>
-      <w:r>
-        <w:rPr>
-          <w:rFonts w:ascii="Times New Roman" w:cs="Times New Roman" w:eastAsia="Times New Roman" w:hAnsi="Times New Roman"/>
-          <w:b w:val="0"/>
-          <w:bCs w:val="0"/>
-          <w:i w:val="0"/>
-          <w:iCs w:val="0"/>
-          <w:smallCaps w:val="0"/>
-          <w:strike w:val="0"/>
-          <w:color w:val="000000"/>
-          <w:sz w:val="24"/>
-          <w:szCs w:val="24"/>
-          <w:u w:val="none"/>
-          <w:shd w:fill="auto" w:val="clear"/>
-          <w:vertAlign w:val="baseline"/>
-          <w:rtl w:val="0"/>
-        </w:rPr>
-        <w:t xml:space="preserve">Kamins’kyi A. O., Dudyk M. V., Reshitnyk Yu. V., Fen’kiv V. M. Investigation of the initial stage of fracture of a piecewise homogeneous body with interface crack compressed along the interface // Journal of Mathematical Sciences. 2023. Vol. 273, № 6. P. 1016–1030. </w:t>
-      </w:r>
-    </w:p>
-    <w:p>
-      <w:pPr>
-        <w:keepNext w:val="0"/>
-        <w:keepLines w:val="0"/>
-        <w:pageBreakBefore w:val="0"/>
-        <w:widowControl w:val="1"/>
-        <w:numPr>
-          <w:ilvl w:val="1"/>
-          <w:numId w:val="7"/>
-        </w:numPr>
-        <w:pBdr>
-          <w:top w:space="0" w:sz="0" w:val="nil"/>
-          <w:left w:space="0" w:sz="0" w:val="nil"/>
-          <w:bottom w:space="0" w:sz="0" w:val="nil"/>
-          <w:right w:space="0" w:sz="0" w:val="nil"/>
-          <w:between w:space="0" w:sz="0" w:val="nil"/>
-        </w:pBdr>
-        <w:shd w:fill="auto" w:val="clear"/>
-        <w:tabs>
-          <w:tab w:val="center" w:leader="none" w:pos="4677"/>
-          <w:tab w:val="right" w:leader="none" w:pos="9355"/>
-          <w:tab w:val="center" w:leader="none" w:pos="426"/>
-        </w:tabs>
-        <w:spacing w:after="0" w:before="0" w:line="252.00000000000003" w:lineRule="auto"/>
-        <w:ind w:left="426" w:right="0" w:hanging="426"/>
-        <w:jc w:val="left"/>
-        <w:rPr>
-          <w:rFonts w:ascii="Times New Roman" w:cs="Times New Roman" w:eastAsia="Times New Roman" w:hAnsi="Times New Roman"/>
-          <w:b w:val="0"/>
-          <w:bCs w:val="0"/>
-          <w:i w:val="0"/>
-          <w:iCs w:val="0"/>
-          <w:smallCaps w:val="0"/>
-          <w:strike w:val="0"/>
-          <w:color w:val="000000"/>
-          <w:sz w:val="24"/>
-          <w:szCs w:val="24"/>
-          <w:u w:val="none"/>
-          <w:shd w:fill="auto" w:val="clear"/>
-          <w:vertAlign w:val="baseline"/>
-        </w:rPr>
-      </w:pPr>
-      <w:r>
-        <w:rPr>
-          <w:rFonts w:ascii="Times New Roman" w:cs="Times New Roman" w:eastAsia="Times New Roman" w:hAnsi="Times New Roman"/>
-          <w:b w:val="0"/>
-          <w:bCs w:val="0"/>
-          <w:i w:val="0"/>
-          <w:iCs w:val="0"/>
-          <w:smallCaps w:val="0"/>
-          <w:strike w:val="0"/>
-          <w:color w:val="000000"/>
-          <w:sz w:val="24"/>
-          <w:szCs w:val="24"/>
-          <w:u w:val="none"/>
-          <w:shd w:fill="auto" w:val="clear"/>
-          <w:vertAlign w:val="baseline"/>
-          <w:rtl w:val="0"/>
-        </w:rPr>
-        <w:t xml:space="preserve">Камінський А. О., Дудик М. В. Аналітичні методи моделювання зони передруйнування біля вершини міжфазної тріщини (огляд) // Прикладна механіка. 2023. Т. 59, № 5. С. 3–43. </w:t>
-      </w:r>
-    </w:p>
-    <w:p>
-      <w:pPr>
-        <w:keepNext w:val="0"/>
-        <w:keepLines w:val="0"/>
-        <w:pageBreakBefore w:val="0"/>
-        <w:widowControl w:val="1"/>
-        <w:numPr>
-          <w:ilvl w:val="1"/>
-          <w:numId w:val="7"/>
-        </w:numPr>
-        <w:pBdr>
-          <w:top w:space="0" w:sz="0" w:val="nil"/>
-          <w:left w:space="0" w:sz="0" w:val="nil"/>
-          <w:bottom w:space="0" w:sz="0" w:val="nil"/>
-          <w:right w:space="0" w:sz="0" w:val="nil"/>
-          <w:between w:space="0" w:sz="0" w:val="nil"/>
-        </w:pBdr>
-        <w:shd w:fill="auto" w:val="clear"/>
-        <w:tabs>
-          <w:tab w:val="center" w:leader="none" w:pos="4677"/>
-          <w:tab w:val="right" w:leader="none" w:pos="9355"/>
-          <w:tab w:val="center" w:leader="none" w:pos="426"/>
-        </w:tabs>
-        <w:spacing w:after="0" w:before="0" w:line="252.00000000000003" w:lineRule="auto"/>
-        <w:ind w:left="426" w:right="0" w:hanging="426"/>
-        <w:jc w:val="left"/>
-        <w:rPr>
-          <w:rFonts w:ascii="Times New Roman" w:cs="Times New Roman" w:eastAsia="Times New Roman" w:hAnsi="Times New Roman"/>
-          <w:b w:val="0"/>
-          <w:bCs w:val="0"/>
-          <w:i w:val="0"/>
-          <w:iCs w:val="0"/>
-          <w:smallCaps w:val="0"/>
-          <w:strike w:val="0"/>
-          <w:color w:val="000000"/>
-          <w:sz w:val="24"/>
-          <w:szCs w:val="24"/>
-          <w:u w:val="none"/>
-          <w:shd w:fill="auto" w:val="clear"/>
-          <w:vertAlign w:val="baseline"/>
-        </w:rPr>
-      </w:pPr>
-      <w:r>
-        <w:rPr>
-          <w:rFonts w:ascii="Times New Roman" w:cs="Times New Roman" w:eastAsia="Times New Roman" w:hAnsi="Times New Roman"/>
-          <w:b w:val="0"/>
-          <w:bCs w:val="0"/>
-          <w:i w:val="0"/>
-          <w:iCs w:val="0"/>
-          <w:smallCaps w:val="0"/>
-          <w:strike w:val="0"/>
-          <w:color w:val="000000"/>
-          <w:sz w:val="24"/>
-          <w:szCs w:val="24"/>
-          <w:u w:val="none"/>
-          <w:shd w:fill="auto" w:val="clear"/>
-          <w:vertAlign w:val="baseline"/>
-          <w:rtl w:val="0"/>
-        </w:rPr>
-        <w:t xml:space="preserve">Selivanov M., Fernati P. Determining the change of stress concentration with time in a 3-D viscoelastic transverse isotropic plate // Dopov. Nac. akad. nauk Ukr. 2023. № 1. P. 33–39. </w:t>
-      </w:r>
-    </w:p>
-    <w:p>
-      <w:pPr>
-        <w:keepNext w:val="0"/>
-        <w:keepLines w:val="0"/>
-        <w:pageBreakBefore w:val="0"/>
-        <w:widowControl w:val="1"/>
-        <w:numPr>
-          <w:ilvl w:val="1"/>
-          <w:numId w:val="7"/>
-        </w:numPr>
-        <w:pBdr>
-          <w:top w:space="0" w:sz="0" w:val="nil"/>
-          <w:left w:space="0" w:sz="0" w:val="nil"/>
-          <w:bottom w:space="0" w:sz="0" w:val="nil"/>
-          <w:right w:space="0" w:sz="0" w:val="nil"/>
-          <w:between w:space="0" w:sz="0" w:val="nil"/>
-        </w:pBdr>
-        <w:shd w:fill="auto" w:val="clear"/>
-        <w:tabs>
-          <w:tab w:val="center" w:leader="none" w:pos="4677"/>
-          <w:tab w:val="right" w:leader="none" w:pos="9355"/>
-          <w:tab w:val="center" w:leader="none" w:pos="426"/>
-        </w:tabs>
-        <w:spacing w:after="0" w:before="0" w:line="252.00000000000003" w:lineRule="auto"/>
-        <w:ind w:left="426" w:right="0" w:hanging="426"/>
-        <w:jc w:val="left"/>
-        <w:rPr>
-          <w:rFonts w:ascii="Times New Roman" w:cs="Times New Roman" w:eastAsia="Times New Roman" w:hAnsi="Times New Roman"/>
-          <w:b w:val="0"/>
-          <w:bCs w:val="0"/>
-          <w:i w:val="0"/>
-          <w:iCs w:val="0"/>
-          <w:smallCaps w:val="0"/>
-          <w:strike w:val="0"/>
-          <w:color w:val="000000"/>
-          <w:sz w:val="24"/>
-          <w:szCs w:val="24"/>
-          <w:u w:val="none"/>
-          <w:shd w:fill="auto" w:val="clear"/>
-          <w:vertAlign w:val="baseline"/>
-        </w:rPr>
-      </w:pPr>
-      <w:r>
-        <w:rPr>
-          <w:rFonts w:ascii="Times New Roman" w:cs="Times New Roman" w:eastAsia="Times New Roman" w:hAnsi="Times New Roman"/>
-          <w:b w:val="0"/>
-          <w:bCs w:val="0"/>
-          <w:i w:val="0"/>
-          <w:iCs w:val="0"/>
-          <w:smallCaps w:val="0"/>
-          <w:strike w:val="0"/>
-          <w:color w:val="000000"/>
-          <w:sz w:val="24"/>
-          <w:szCs w:val="24"/>
-          <w:u w:val="none"/>
-          <w:shd w:fill="auto" w:val="clear"/>
-          <w:vertAlign w:val="baseline"/>
-          <w:rtl w:val="0"/>
-        </w:rPr>
-        <w:t xml:space="preserve">Selivanov M., Fernati P. Modelling the quasistatic crack propagation in a viscoelastic orthotropic medium using the incrementalization of constitutive equations // Dopov. Nac. akad. nauk Ukr. 2023. № 2. P. 65–75. </w:t>
-      </w:r>
-    </w:p>
-    <w:p>
-      <w:pPr>
-        <w:keepNext w:val="0"/>
-        <w:keepLines w:val="0"/>
-        <w:pageBreakBefore w:val="0"/>
-        <w:widowControl w:val="1"/>
-        <w:numPr>
-          <w:ilvl w:val="1"/>
-          <w:numId w:val="7"/>
-        </w:numPr>
-        <w:pBdr>
-          <w:top w:space="0" w:sz="0" w:val="nil"/>
-          <w:left w:space="0" w:sz="0" w:val="nil"/>
-          <w:bottom w:space="0" w:sz="0" w:val="nil"/>
-          <w:right w:space="0" w:sz="0" w:val="nil"/>
-          <w:between w:space="0" w:sz="0" w:val="nil"/>
-        </w:pBdr>
-        <w:shd w:fill="auto" w:val="clear"/>
-        <w:tabs>
-          <w:tab w:val="center" w:leader="none" w:pos="4677"/>
-          <w:tab w:val="right" w:leader="none" w:pos="9355"/>
-          <w:tab w:val="center" w:leader="none" w:pos="426"/>
-        </w:tabs>
-        <w:spacing w:after="0" w:before="0" w:line="252.00000000000003" w:lineRule="auto"/>
-        <w:ind w:left="426" w:right="0" w:hanging="426"/>
-        <w:jc w:val="left"/>
-        <w:rPr>
-          <w:rFonts w:ascii="Times New Roman" w:cs="Times New Roman" w:eastAsia="Times New Roman" w:hAnsi="Times New Roman"/>
-          <w:b w:val="0"/>
-          <w:bCs w:val="0"/>
-          <w:i w:val="0"/>
-          <w:iCs w:val="0"/>
-          <w:smallCaps w:val="0"/>
-          <w:strike w:val="0"/>
-          <w:color w:val="000000"/>
-          <w:sz w:val="24"/>
-          <w:szCs w:val="24"/>
-          <w:u w:val="none"/>
-          <w:shd w:fill="auto" w:val="clear"/>
-          <w:vertAlign w:val="baseline"/>
-        </w:rPr>
-      </w:pPr>
-      <w:r>
-        <w:rPr>
-          <w:rFonts w:ascii="Times New Roman" w:cs="Times New Roman" w:eastAsia="Times New Roman" w:hAnsi="Times New Roman"/>
-          <w:b w:val="0"/>
-          <w:bCs w:val="0"/>
-          <w:i w:val="0"/>
-          <w:iCs w:val="0"/>
-          <w:smallCaps w:val="0"/>
-          <w:strike w:val="0"/>
-          <w:color w:val="000000"/>
-          <w:sz w:val="24"/>
-          <w:szCs w:val="24"/>
-          <w:u w:val="none"/>
-          <w:shd w:fill="auto" w:val="clear"/>
-          <w:vertAlign w:val="baseline"/>
-          <w:rtl w:val="0"/>
-        </w:rPr>
-        <w:t xml:space="preserve">Selivanov M., Fernati P. Initiation and slow propagation of a crack along the plane of symmetry of a 3-d viscoelastic transversely isotropic plate // Dopov. Nac. akad. nauk Ukr. 2023. № 4. P. 26–32. </w:t>
-      </w:r>
-    </w:p>
-    <w:p>
-      <w:pPr>
-        <w:keepNext w:val="0"/>
-        <w:keepLines w:val="0"/>
-        <w:pageBreakBefore w:val="0"/>
-        <w:widowControl w:val="1"/>
-        <w:numPr>
-          <w:ilvl w:val="1"/>
-          <w:numId w:val="7"/>
-        </w:numPr>
-        <w:pBdr>
-          <w:top w:space="0" w:sz="0" w:val="nil"/>
-          <w:left w:space="0" w:sz="0" w:val="nil"/>
-          <w:bottom w:space="0" w:sz="0" w:val="nil"/>
-          <w:right w:space="0" w:sz="0" w:val="nil"/>
-          <w:between w:space="0" w:sz="0" w:val="nil"/>
-        </w:pBdr>
-        <w:shd w:fill="auto" w:val="clear"/>
-        <w:tabs>
-          <w:tab w:val="center" w:leader="none" w:pos="4677"/>
-          <w:tab w:val="right" w:leader="none" w:pos="9355"/>
-          <w:tab w:val="center" w:leader="none" w:pos="426"/>
-        </w:tabs>
-        <w:spacing w:after="0" w:before="0" w:line="252.00000000000003" w:lineRule="auto"/>
-        <w:ind w:left="426" w:right="0" w:hanging="426"/>
-        <w:jc w:val="left"/>
-        <w:rPr>
-          <w:rFonts w:ascii="Times New Roman" w:cs="Times New Roman" w:eastAsia="Times New Roman" w:hAnsi="Times New Roman"/>
-          <w:b w:val="0"/>
-          <w:bCs w:val="0"/>
-          <w:i w:val="0"/>
-          <w:iCs w:val="0"/>
-          <w:smallCaps w:val="0"/>
-          <w:strike w:val="0"/>
-          <w:color w:val="000000"/>
-          <w:sz w:val="24"/>
-          <w:szCs w:val="24"/>
-          <w:u w:val="none"/>
-          <w:shd w:fill="auto" w:val="clear"/>
-          <w:vertAlign w:val="baseline"/>
-        </w:rPr>
-      </w:pPr>
-      <w:r>
-        <w:rPr>
-          <w:rFonts w:ascii="Times New Roman" w:cs="Times New Roman" w:eastAsia="Times New Roman" w:hAnsi="Times New Roman"/>
-          <w:b w:val="0"/>
-          <w:bCs w:val="0"/>
-          <w:i w:val="0"/>
-          <w:iCs w:val="0"/>
-          <w:smallCaps w:val="0"/>
-          <w:strike w:val="0"/>
-          <w:color w:val="000000"/>
-          <w:sz w:val="24"/>
-          <w:szCs w:val="24"/>
-          <w:u w:val="none"/>
-          <w:shd w:fill="auto" w:val="clear"/>
-          <w:vertAlign w:val="baseline"/>
-          <w:rtl w:val="0"/>
-        </w:rPr>
-        <w:t xml:space="preserve">Kaminsky A. O., Kurchakov E. E., Chornoivan Yu. O. Fracture Process Zone in Cracked Nonlinear Orthotropic Body // International Applied Mechanics. 2024. Vol. 60, № 1. P. 34–58. </w:t>
-      </w:r>
-    </w:p>
-    <w:p>
-      <w:pPr>
-        <w:keepNext w:val="0"/>
-        <w:keepLines w:val="0"/>
-        <w:pageBreakBefore w:val="0"/>
-        <w:widowControl w:val="1"/>
-        <w:numPr>
-          <w:ilvl w:val="1"/>
-          <w:numId w:val="7"/>
-        </w:numPr>
-        <w:pBdr>
-          <w:top w:space="0" w:sz="0" w:val="nil"/>
-          <w:left w:space="0" w:sz="0" w:val="nil"/>
-          <w:bottom w:space="0" w:sz="0" w:val="nil"/>
-          <w:right w:space="0" w:sz="0" w:val="nil"/>
-          <w:between w:space="0" w:sz="0" w:val="nil"/>
-        </w:pBdr>
-        <w:shd w:fill="auto" w:val="clear"/>
-        <w:tabs>
-          <w:tab w:val="center" w:leader="none" w:pos="4677"/>
-          <w:tab w:val="right" w:leader="none" w:pos="9355"/>
-          <w:tab w:val="center" w:leader="none" w:pos="426"/>
-        </w:tabs>
-        <w:spacing w:after="0" w:before="0" w:line="252.00000000000003" w:lineRule="auto"/>
-        <w:ind w:left="426" w:right="0" w:hanging="426"/>
-        <w:jc w:val="left"/>
-        <w:rPr>
-          <w:rFonts w:ascii="Times New Roman" w:cs="Times New Roman" w:eastAsia="Times New Roman" w:hAnsi="Times New Roman"/>
-          <w:b w:val="0"/>
-          <w:bCs w:val="0"/>
-          <w:i w:val="0"/>
-          <w:iCs w:val="0"/>
-          <w:smallCaps w:val="0"/>
-          <w:strike w:val="0"/>
-          <w:color w:val="000000"/>
-          <w:sz w:val="24"/>
-          <w:szCs w:val="24"/>
-          <w:u w:val="none"/>
-          <w:shd w:fill="auto" w:val="clear"/>
-          <w:vertAlign w:val="baseline"/>
-        </w:rPr>
-      </w:pPr>
-      <w:r>
-        <w:rPr>
-          <w:rFonts w:ascii="Times New Roman" w:cs="Times New Roman" w:eastAsia="Times New Roman" w:hAnsi="Times New Roman"/>
-          <w:b w:val="0"/>
-          <w:bCs w:val="0"/>
-          <w:i w:val="0"/>
-          <w:iCs w:val="0"/>
-          <w:smallCaps w:val="0"/>
-          <w:strike w:val="0"/>
-          <w:color w:val="000000"/>
-          <w:sz w:val="24"/>
-          <w:szCs w:val="24"/>
-          <w:u w:val="none"/>
-          <w:shd w:fill="auto" w:val="clear"/>
-          <w:vertAlign w:val="baseline"/>
-          <w:rtl w:val="0"/>
-        </w:rPr>
-        <w:t xml:space="preserve">Xue P., Wei X., Li Z., Wang Y., Selivanov M. F., Xiong J. Mechanics of inner core debonding of composite sandwich beam with CFRP hexagonal honeycomb // International Journal of Solids and Structures. 2024. Vol. 293. 112760. </w:t>
-      </w:r>
-    </w:p>
-    <w:p>
-      <w:pPr>
-        <w:keepNext w:val="0"/>
-        <w:keepLines w:val="0"/>
-        <w:pageBreakBefore w:val="0"/>
-        <w:widowControl w:val="1"/>
-        <w:numPr>
-          <w:ilvl w:val="1"/>
-          <w:numId w:val="7"/>
-        </w:numPr>
-        <w:pBdr>
-          <w:top w:space="0" w:sz="0" w:val="nil"/>
-          <w:left w:space="0" w:sz="0" w:val="nil"/>
-          <w:bottom w:space="0" w:sz="0" w:val="nil"/>
-          <w:right w:space="0" w:sz="0" w:val="nil"/>
-          <w:between w:space="0" w:sz="0" w:val="nil"/>
-        </w:pBdr>
-        <w:shd w:fill="auto" w:val="clear"/>
-        <w:tabs>
-          <w:tab w:val="center" w:leader="none" w:pos="4677"/>
-          <w:tab w:val="right" w:leader="none" w:pos="9355"/>
-          <w:tab w:val="center" w:leader="none" w:pos="426"/>
-        </w:tabs>
-        <w:spacing w:after="0" w:before="0" w:line="252.00000000000003" w:lineRule="auto"/>
-        <w:ind w:left="426" w:right="0" w:hanging="426"/>
-        <w:jc w:val="left"/>
-        <w:rPr>
-          <w:rFonts w:ascii="Times New Roman" w:cs="Times New Roman" w:eastAsia="Times New Roman" w:hAnsi="Times New Roman"/>
-          <w:b w:val="0"/>
-          <w:bCs w:val="0"/>
-          <w:i w:val="0"/>
-          <w:iCs w:val="0"/>
-          <w:smallCaps w:val="0"/>
-          <w:strike w:val="0"/>
-          <w:color w:val="000000"/>
-          <w:sz w:val="24"/>
-          <w:szCs w:val="24"/>
-          <w:u w:val="none"/>
-          <w:shd w:fill="auto" w:val="clear"/>
-          <w:vertAlign w:val="baseline"/>
-        </w:rPr>
-      </w:pPr>
-      <w:r>
-        <w:rPr>
-          <w:rFonts w:ascii="Times New Roman" w:cs="Times New Roman" w:eastAsia="Times New Roman" w:hAnsi="Times New Roman"/>
-          <w:b w:val="0"/>
-          <w:bCs w:val="0"/>
-          <w:i w:val="0"/>
-          <w:iCs w:val="0"/>
-          <w:smallCaps w:val="0"/>
-          <w:strike w:val="0"/>
-          <w:color w:val="000000"/>
-          <w:sz w:val="24"/>
-          <w:szCs w:val="24"/>
-          <w:u w:val="none"/>
-          <w:shd w:fill="auto" w:val="clear"/>
-          <w:vertAlign w:val="baseline"/>
-          <w:rtl w:val="0"/>
-        </w:rPr>
-        <w:t xml:space="preserve">Kaminsky A. O., Dudyk M. V. Analytical Methods of Modeling the Prefracture Zone near an Interfacial Crack Tip (Review) // International Applied Mechanics. 2023. Vol. 59. P. 505–539. </w:t>
-      </w:r>
-    </w:p>
-    <w:p>
-      <w:pPr>
-        <w:keepNext w:val="0"/>
-        <w:keepLines w:val="0"/>
-        <w:pageBreakBefore w:val="0"/>
-        <w:widowControl w:val="1"/>
-        <w:numPr>
-          <w:ilvl w:val="1"/>
-          <w:numId w:val="7"/>
-        </w:numPr>
-        <w:pBdr>
-          <w:top w:space="0" w:sz="0" w:val="nil"/>
-          <w:left w:space="0" w:sz="0" w:val="nil"/>
-          <w:bottom w:space="0" w:sz="0" w:val="nil"/>
-          <w:right w:space="0" w:sz="0" w:val="nil"/>
-          <w:between w:space="0" w:sz="0" w:val="nil"/>
-        </w:pBdr>
-        <w:shd w:fill="auto" w:val="clear"/>
-        <w:tabs>
-          <w:tab w:val="center" w:leader="none" w:pos="4677"/>
-          <w:tab w:val="right" w:leader="none" w:pos="9355"/>
-          <w:tab w:val="center" w:leader="none" w:pos="426"/>
-        </w:tabs>
-        <w:spacing w:after="0" w:before="0" w:line="252.00000000000003" w:lineRule="auto"/>
-        <w:ind w:left="426" w:right="0" w:hanging="426"/>
-        <w:jc w:val="left"/>
-        <w:rPr>
-          <w:rFonts w:ascii="Times New Roman" w:cs="Times New Roman" w:eastAsia="Times New Roman" w:hAnsi="Times New Roman"/>
-          <w:b w:val="0"/>
-          <w:bCs w:val="0"/>
-          <w:i w:val="0"/>
-          <w:iCs w:val="0"/>
-          <w:smallCaps w:val="0"/>
-          <w:strike w:val="0"/>
-          <w:color w:val="000000"/>
-          <w:sz w:val="24"/>
-          <w:szCs w:val="24"/>
-          <w:u w:val="none"/>
-          <w:shd w:fill="auto" w:val="clear"/>
-          <w:vertAlign w:val="baseline"/>
-        </w:rPr>
-      </w:pPr>
-      <w:r>
-        <w:rPr>
-          <w:rFonts w:ascii="Times New Roman" w:cs="Times New Roman" w:eastAsia="Times New Roman" w:hAnsi="Times New Roman"/>
-          <w:b w:val="0"/>
-          <w:bCs w:val="0"/>
-          <w:i w:val="0"/>
-          <w:iCs w:val="0"/>
-          <w:smallCaps w:val="0"/>
-          <w:strike w:val="0"/>
-          <w:color w:val="000000"/>
-          <w:sz w:val="24"/>
-          <w:szCs w:val="24"/>
-          <w:u w:val="none"/>
-          <w:shd w:fill="auto" w:val="clear"/>
-          <w:vertAlign w:val="baseline"/>
-          <w:rtl w:val="0"/>
-        </w:rPr>
-        <w:t xml:space="preserve">Kaminsky A. O., Dudyk M. V., Reshitnyk Yu. V. Two-parameter model of the prefracture zone in a quasi-elastic material near the tip of an interface crack // Bulletin of the Taras Shevchenko National University of Kyiv. Physics and Mathematics. 2023. № 2. P. 116–119. </w:t>
-      </w:r>
-    </w:p>
-    <w:p>
-      <w:pPr>
-        <w:keepNext w:val="0"/>
-        <w:keepLines w:val="0"/>
-        <w:pageBreakBefore w:val="0"/>
-        <w:widowControl w:val="1"/>
-        <w:numPr>
-          <w:ilvl w:val="1"/>
-          <w:numId w:val="7"/>
-        </w:numPr>
-        <w:pBdr>
-          <w:top w:space="0" w:sz="0" w:val="nil"/>
-          <w:left w:space="0" w:sz="0" w:val="nil"/>
-          <w:bottom w:space="0" w:sz="0" w:val="nil"/>
-          <w:right w:space="0" w:sz="0" w:val="nil"/>
-          <w:between w:space="0" w:sz="0" w:val="nil"/>
-        </w:pBdr>
-        <w:shd w:fill="auto" w:val="clear"/>
-        <w:tabs>
-          <w:tab w:val="center" w:leader="none" w:pos="4677"/>
-          <w:tab w:val="right" w:leader="none" w:pos="9355"/>
-          <w:tab w:val="center" w:leader="none" w:pos="426"/>
-        </w:tabs>
-        <w:spacing w:after="0" w:before="0" w:line="252.00000000000003" w:lineRule="auto"/>
-        <w:ind w:left="426" w:right="0" w:hanging="426"/>
-        <w:jc w:val="left"/>
-        <w:rPr>
-          <w:rFonts w:ascii="Times New Roman" w:cs="Times New Roman" w:eastAsia="Times New Roman" w:hAnsi="Times New Roman"/>
-          <w:b w:val="0"/>
-          <w:bCs w:val="0"/>
-          <w:i w:val="0"/>
-          <w:iCs w:val="0"/>
-          <w:smallCaps w:val="0"/>
-          <w:strike w:val="0"/>
-          <w:color w:val="000000"/>
-          <w:sz w:val="24"/>
-          <w:szCs w:val="24"/>
-          <w:u w:val="none"/>
-          <w:shd w:fill="auto" w:val="clear"/>
-          <w:vertAlign w:val="baseline"/>
-        </w:rPr>
-      </w:pPr>
-      <w:r>
-        <w:rPr>
-          <w:rFonts w:ascii="Times New Roman" w:cs="Times New Roman" w:eastAsia="Times New Roman" w:hAnsi="Times New Roman"/>
-          <w:b w:val="0"/>
-          <w:bCs w:val="0"/>
-          <w:i w:val="0"/>
-          <w:iCs w:val="0"/>
-          <w:smallCaps w:val="0"/>
-          <w:strike w:val="0"/>
-          <w:color w:val="000000"/>
-          <w:sz w:val="24"/>
-          <w:szCs w:val="24"/>
-          <w:u w:val="none"/>
-          <w:shd w:fill="auto" w:val="clear"/>
-          <w:vertAlign w:val="baseline"/>
-          <w:rtl w:val="0"/>
-        </w:rPr>
-        <w:t xml:space="preserve">Kaminsky A. O., Dudyk M. V. Development of plastic zone near tip of interfacial crack with contacting faces // International Applied Mechanics. 2024. Vol. 60, № 2. P. 149–162. </w:t>
-      </w:r>
-    </w:p>
-    <w:p>
-      <w:pPr>
-        <w:keepNext w:val="0"/>
-        <w:keepLines w:val="0"/>
-        <w:pageBreakBefore w:val="0"/>
-        <w:widowControl w:val="1"/>
-        <w:numPr>
-          <w:ilvl w:val="1"/>
-          <w:numId w:val="7"/>
-        </w:numPr>
-        <w:pBdr>
-          <w:top w:space="0" w:sz="0" w:val="nil"/>
-          <w:left w:space="0" w:sz="0" w:val="nil"/>
-          <w:bottom w:space="0" w:sz="0" w:val="nil"/>
-          <w:right w:space="0" w:sz="0" w:val="nil"/>
-          <w:between w:space="0" w:sz="0" w:val="nil"/>
-        </w:pBdr>
-        <w:shd w:fill="auto" w:val="clear"/>
-        <w:tabs>
-          <w:tab w:val="center" w:leader="none" w:pos="4677"/>
-          <w:tab w:val="right" w:leader="none" w:pos="9355"/>
-          <w:tab w:val="center" w:leader="none" w:pos="426"/>
-        </w:tabs>
-        <w:spacing w:after="0" w:before="0" w:line="252.00000000000003" w:lineRule="auto"/>
-        <w:ind w:left="426" w:right="0" w:hanging="426"/>
-        <w:jc w:val="left"/>
-        <w:rPr>
-          <w:rFonts w:ascii="Times New Roman" w:cs="Times New Roman" w:eastAsia="Times New Roman" w:hAnsi="Times New Roman"/>
-          <w:b w:val="0"/>
-          <w:bCs w:val="0"/>
-          <w:i w:val="0"/>
-          <w:iCs w:val="0"/>
-          <w:smallCaps w:val="0"/>
-          <w:strike w:val="0"/>
-          <w:color w:val="000000"/>
-          <w:sz w:val="24"/>
-          <w:szCs w:val="24"/>
-          <w:u w:val="none"/>
-          <w:shd w:fill="auto" w:val="clear"/>
-          <w:vertAlign w:val="baseline"/>
-        </w:rPr>
-      </w:pPr>
-      <w:r>
-        <w:rPr>
-          <w:rFonts w:ascii="Times New Roman" w:cs="Times New Roman" w:eastAsia="Times New Roman" w:hAnsi="Times New Roman"/>
-          <w:b w:val="0"/>
-          <w:bCs w:val="0"/>
-          <w:i w:val="0"/>
-          <w:iCs w:val="0"/>
-          <w:smallCaps w:val="0"/>
-          <w:strike w:val="0"/>
-          <w:color w:val="000000"/>
-          <w:sz w:val="24"/>
-          <w:szCs w:val="24"/>
-          <w:u w:val="none"/>
-          <w:shd w:fill="auto" w:val="clear"/>
-          <w:vertAlign w:val="baseline"/>
-          <w:rtl w:val="0"/>
-        </w:rPr>
-        <w:t xml:space="preserve">Камінський А. О., Дудик М. В., Поліщук Т. В. Модель зародження тріщини у пружному кусково-однорідному тілі з ламаною межею поділу // Прикладна механіка. 2024. Т. 60, № 6. С. 41–52. </w:t>
-      </w:r>
-    </w:p>
-    <w:p>
-      <w:pPr>
-        <w:keepNext w:val="0"/>
-        <w:keepLines w:val="0"/>
-        <w:pageBreakBefore w:val="0"/>
-        <w:widowControl w:val="1"/>
-        <w:numPr>
-          <w:ilvl w:val="1"/>
-          <w:numId w:val="7"/>
-        </w:numPr>
-        <w:pBdr>
-          <w:top w:space="0" w:sz="0" w:val="nil"/>
-          <w:left w:space="0" w:sz="0" w:val="nil"/>
-          <w:bottom w:space="0" w:sz="0" w:val="nil"/>
-          <w:right w:space="0" w:sz="0" w:val="nil"/>
-          <w:between w:space="0" w:sz="0" w:val="nil"/>
-        </w:pBdr>
-        <w:shd w:fill="auto" w:val="clear"/>
-        <w:tabs>
-          <w:tab w:val="center" w:leader="none" w:pos="4677"/>
-          <w:tab w:val="right" w:leader="none" w:pos="9355"/>
-          <w:tab w:val="center" w:leader="none" w:pos="426"/>
-        </w:tabs>
-        <w:spacing w:after="0" w:before="0" w:line="252.00000000000003" w:lineRule="auto"/>
-        <w:ind w:left="426" w:right="0" w:hanging="426"/>
-        <w:jc w:val="left"/>
-        <w:rPr>
-          <w:rFonts w:ascii="Times New Roman" w:cs="Times New Roman" w:eastAsia="Times New Roman" w:hAnsi="Times New Roman"/>
-          <w:b w:val="0"/>
-          <w:bCs w:val="0"/>
-          <w:i w:val="0"/>
-          <w:iCs w:val="0"/>
-          <w:smallCaps w:val="0"/>
-          <w:strike w:val="0"/>
-          <w:color w:val="000000"/>
-          <w:sz w:val="24"/>
-          <w:szCs w:val="24"/>
-          <w:u w:val="none"/>
-          <w:shd w:fill="auto" w:val="clear"/>
-          <w:vertAlign w:val="baseline"/>
-        </w:rPr>
-      </w:pPr>
-      <w:r>
-        <w:rPr>
-          <w:rFonts w:ascii="Times New Roman" w:cs="Times New Roman" w:eastAsia="Times New Roman" w:hAnsi="Times New Roman"/>
-          <w:b w:val="0"/>
-          <w:bCs w:val="0"/>
-          <w:i w:val="0"/>
-          <w:iCs w:val="0"/>
-          <w:smallCaps w:val="0"/>
-          <w:strike w:val="0"/>
-          <w:color w:val="000000"/>
-          <w:sz w:val="24"/>
-          <w:szCs w:val="24"/>
-          <w:u w:val="none"/>
-          <w:shd w:fill="auto" w:val="clear"/>
-          <w:vertAlign w:val="baseline"/>
-          <w:rtl w:val="0"/>
-        </w:rPr>
-        <w:t xml:space="preserve">Streliaev Y. M., Martynyak R. M. Partial Slipping of Flat Punch in Thermomechanical Contact with Elastic Half-Space // International Applied Mechanics. 2024. Vol. 60, № 2. P. 212–220. </w:t>
-      </w:r>
-    </w:p>
-    <w:p>
-      <w:pPr>
-        <w:keepNext w:val="0"/>
-        <w:keepLines w:val="0"/>
-        <w:pageBreakBefore w:val="0"/>
-        <w:widowControl w:val="1"/>
-        <w:numPr>
-          <w:ilvl w:val="1"/>
-          <w:numId w:val="7"/>
-        </w:numPr>
-        <w:pBdr>
-          <w:top w:space="0" w:sz="0" w:val="nil"/>
-          <w:left w:space="0" w:sz="0" w:val="nil"/>
-          <w:bottom w:space="0" w:sz="0" w:val="nil"/>
-          <w:right w:space="0" w:sz="0" w:val="nil"/>
-          <w:between w:space="0" w:sz="0" w:val="nil"/>
-        </w:pBdr>
-        <w:shd w:fill="auto" w:val="clear"/>
-        <w:tabs>
-          <w:tab w:val="center" w:leader="none" w:pos="4677"/>
-          <w:tab w:val="right" w:leader="none" w:pos="9355"/>
-          <w:tab w:val="center" w:leader="none" w:pos="426"/>
-        </w:tabs>
-        <w:spacing w:after="0" w:before="0" w:line="252.00000000000003" w:lineRule="auto"/>
-        <w:ind w:left="426" w:right="0" w:hanging="426"/>
-        <w:jc w:val="left"/>
-        <w:rPr>
-          <w:rFonts w:ascii="Times New Roman" w:cs="Times New Roman" w:eastAsia="Times New Roman" w:hAnsi="Times New Roman"/>
-          <w:b w:val="0"/>
-          <w:bCs w:val="0"/>
-          <w:i w:val="0"/>
-          <w:iCs w:val="0"/>
-          <w:smallCaps w:val="0"/>
-          <w:strike w:val="0"/>
-          <w:color w:val="000000"/>
-          <w:sz w:val="24"/>
-          <w:szCs w:val="24"/>
-          <w:u w:val="none"/>
-          <w:shd w:fill="auto" w:val="clear"/>
-          <w:vertAlign w:val="baseline"/>
-        </w:rPr>
-      </w:pPr>
-      <w:r>
-        <w:rPr>
-          <w:rFonts w:ascii="Times New Roman" w:cs="Times New Roman" w:eastAsia="Times New Roman" w:hAnsi="Times New Roman"/>
-          <w:b w:val="0"/>
-          <w:bCs w:val="0"/>
-          <w:i w:val="0"/>
-          <w:iCs w:val="0"/>
-          <w:smallCaps w:val="0"/>
-          <w:strike w:val="0"/>
-          <w:color w:val="000000"/>
-          <w:sz w:val="24"/>
-          <w:szCs w:val="24"/>
-          <w:u w:val="none"/>
-          <w:shd w:fill="auto" w:val="clear"/>
-          <w:vertAlign w:val="baseline"/>
-          <w:rtl w:val="0"/>
-        </w:rPr>
-        <w:t xml:space="preserve">Dudyk M., Kaminsky A., Reshitnyk Yu., Chornoivan Yu. On analytical model of interface crack in bonding quasi-brittle material between distinct elastic media // European Conference on Fracture 2024: Book of Abstracts (Zagreb, Croatia, August 26–30, 2024). Zagreb : University of Zagreb, 2024. P. 8. </w:t>
-      </w:r>
-    </w:p>
-    <w:p>
-      <w:pPr>
-        <w:keepNext w:val="0"/>
-        <w:keepLines w:val="0"/>
-        <w:pageBreakBefore w:val="0"/>
-        <w:widowControl w:val="1"/>
-        <w:numPr>
-          <w:ilvl w:val="1"/>
-          <w:numId w:val="7"/>
-        </w:numPr>
-        <w:pBdr>
-          <w:top w:space="0" w:sz="0" w:val="nil"/>
-          <w:left w:space="0" w:sz="0" w:val="nil"/>
-          <w:bottom w:space="0" w:sz="0" w:val="nil"/>
-          <w:right w:space="0" w:sz="0" w:val="nil"/>
-          <w:between w:space="0" w:sz="0" w:val="nil"/>
-        </w:pBdr>
-        <w:shd w:fill="auto" w:val="clear"/>
-        <w:tabs>
-          <w:tab w:val="center" w:leader="none" w:pos="4677"/>
-          <w:tab w:val="right" w:leader="none" w:pos="9355"/>
-          <w:tab w:val="center" w:leader="none" w:pos="426"/>
-        </w:tabs>
-        <w:spacing w:after="0" w:before="0" w:line="252.00000000000003" w:lineRule="auto"/>
-        <w:ind w:left="426" w:right="0" w:hanging="426"/>
-        <w:jc w:val="left"/>
-        <w:rPr>
-          <w:rFonts w:ascii="Times New Roman" w:cs="Times New Roman" w:eastAsia="Times New Roman" w:hAnsi="Times New Roman"/>
-          <w:b w:val="0"/>
-          <w:bCs w:val="0"/>
-          <w:i w:val="0"/>
-          <w:iCs w:val="0"/>
-          <w:smallCaps w:val="0"/>
-          <w:strike w:val="0"/>
-          <w:color w:val="000000"/>
-          <w:sz w:val="24"/>
-          <w:szCs w:val="24"/>
-          <w:u w:val="none"/>
-          <w:shd w:fill="auto" w:val="clear"/>
-          <w:vertAlign w:val="baseline"/>
-        </w:rPr>
-      </w:pPr>
-      <w:r>
-        <w:rPr>
-          <w:rFonts w:ascii="Times New Roman" w:cs="Times New Roman" w:eastAsia="Times New Roman" w:hAnsi="Times New Roman"/>
-          <w:b w:val="0"/>
-          <w:bCs w:val="0"/>
-          <w:i w:val="0"/>
-          <w:iCs w:val="0"/>
-          <w:smallCaps w:val="0"/>
-          <w:strike w:val="0"/>
-          <w:color w:val="000000"/>
-          <w:sz w:val="24"/>
-          <w:szCs w:val="24"/>
-          <w:u w:val="none"/>
-          <w:shd w:fill="auto" w:val="clear"/>
-          <w:vertAlign w:val="baseline"/>
-          <w:rtl w:val="0"/>
-        </w:rPr>
-        <w:t xml:space="preserve">Богданова О., Дудик М., Камінський А., Решітник Ю. Модель повороту міжфазної тріщини у квазікрихкий матеріал біматеріального тіла у кутовій точці ламаної межі поділу // Математичні проблеми механіки неоднорідних структур : зб. наук. праць 11-ї Міжнар. наук. конф. Львів : ІППММ ім. Я. С. Підстригача НАН України, 2024. Вип. 6. С. 127–128. </w:t>
-      </w:r>
-    </w:p>
-    <w:p>
-      <w:pPr>
-        <w:keepNext w:val="0"/>
-        <w:keepLines w:val="0"/>
-        <w:pageBreakBefore w:val="0"/>
-        <w:widowControl w:val="1"/>
-        <w:numPr>
-          <w:ilvl w:val="1"/>
-          <w:numId w:val="7"/>
-        </w:numPr>
-        <w:pBdr>
-          <w:top w:space="0" w:sz="0" w:val="nil"/>
-          <w:left w:space="0" w:sz="0" w:val="nil"/>
-          <w:bottom w:space="0" w:sz="0" w:val="nil"/>
-          <w:right w:space="0" w:sz="0" w:val="nil"/>
-          <w:between w:space="0" w:sz="0" w:val="nil"/>
-        </w:pBdr>
-        <w:shd w:fill="auto" w:val="clear"/>
-        <w:tabs>
-          <w:tab w:val="center" w:leader="none" w:pos="4677"/>
-          <w:tab w:val="right" w:leader="none" w:pos="9355"/>
-          <w:tab w:val="center" w:leader="none" w:pos="426"/>
-        </w:tabs>
-        <w:spacing w:after="0" w:before="0" w:line="252.00000000000003" w:lineRule="auto"/>
-        <w:ind w:left="426" w:right="0" w:hanging="426"/>
-        <w:jc w:val="left"/>
-        <w:rPr>
-          <w:rFonts w:ascii="Times New Roman" w:cs="Times New Roman" w:eastAsia="Times New Roman" w:hAnsi="Times New Roman"/>
-          <w:b w:val="0"/>
-          <w:bCs w:val="0"/>
-          <w:i w:val="0"/>
-          <w:iCs w:val="0"/>
-          <w:smallCaps w:val="0"/>
-          <w:strike w:val="0"/>
-          <w:color w:val="000000"/>
-          <w:sz w:val="24"/>
-          <w:szCs w:val="24"/>
-          <w:u w:val="none"/>
-          <w:shd w:fill="auto" w:val="clear"/>
-          <w:vertAlign w:val="baseline"/>
-        </w:rPr>
-      </w:pPr>
-      <w:r>
-        <w:rPr>
-          <w:rFonts w:ascii="Times New Roman" w:cs="Times New Roman" w:eastAsia="Times New Roman" w:hAnsi="Times New Roman"/>
-          <w:b w:val="0"/>
-          <w:bCs w:val="0"/>
-          <w:i w:val="0"/>
-          <w:iCs w:val="0"/>
-          <w:smallCaps w:val="0"/>
-          <w:strike w:val="0"/>
-          <w:color w:val="000000"/>
-          <w:sz w:val="24"/>
-          <w:szCs w:val="24"/>
-          <w:u w:val="none"/>
-          <w:shd w:fill="auto" w:val="clear"/>
-          <w:vertAlign w:val="baseline"/>
-          <w:rtl w:val="0"/>
-        </w:rPr>
-        <w:t xml:space="preserve">Богданова О. С., Дудик М. В., Камінський А. О., Решітник Ю. В. Поворот міжфазної тріщини у квазікрихкий матеріал біматеріального тіла у кутовій точці ламаної межі поділу // Механіка: сучасність і перспективи – 2024 : матеріали Міжнар. наук. конф. (Київ, 7–11 жовтня 2024 р.). Київ : Інститут механіки ім. С. П. Тимошенка НАН України, 2024. С. 259–260. </w:t>
-      </w:r>
-    </w:p>
-    <w:p>
-      <w:pPr>
-        <w:keepNext w:val="0"/>
-        <w:keepLines w:val="0"/>
-        <w:pageBreakBefore w:val="0"/>
-        <w:widowControl w:val="1"/>
-        <w:numPr>
-          <w:ilvl w:val="1"/>
-          <w:numId w:val="7"/>
-        </w:numPr>
-        <w:pBdr>
-          <w:top w:space="0" w:sz="0" w:val="nil"/>
-          <w:left w:space="0" w:sz="0" w:val="nil"/>
-          <w:bottom w:space="0" w:sz="0" w:val="nil"/>
-          <w:right w:space="0" w:sz="0" w:val="nil"/>
-          <w:between w:space="0" w:sz="0" w:val="nil"/>
-        </w:pBdr>
-        <w:shd w:fill="auto" w:val="clear"/>
-        <w:tabs>
-          <w:tab w:val="center" w:leader="none" w:pos="4677"/>
-          <w:tab w:val="right" w:leader="none" w:pos="9355"/>
-          <w:tab w:val="center" w:leader="none" w:pos="426"/>
-        </w:tabs>
-        <w:spacing w:after="0" w:before="0" w:line="252.00000000000003" w:lineRule="auto"/>
-        <w:ind w:left="426" w:right="0" w:hanging="426"/>
-        <w:jc w:val="left"/>
-        <w:rPr>
-          <w:rFonts w:ascii="Times New Roman" w:cs="Times New Roman" w:eastAsia="Times New Roman" w:hAnsi="Times New Roman"/>
-          <w:b w:val="0"/>
-          <w:bCs w:val="0"/>
-          <w:i w:val="0"/>
-          <w:iCs w:val="0"/>
-          <w:smallCaps w:val="0"/>
-          <w:strike w:val="0"/>
-          <w:color w:val="000000"/>
-          <w:sz w:val="24"/>
-          <w:szCs w:val="24"/>
-          <w:u w:val="none"/>
-          <w:shd w:fill="auto" w:val="clear"/>
-          <w:vertAlign w:val="baseline"/>
-        </w:rPr>
-      </w:pPr>
-      <w:r>
-        <w:rPr>
-          <w:rFonts w:ascii="Times New Roman" w:cs="Times New Roman" w:eastAsia="Times New Roman" w:hAnsi="Times New Roman"/>
-          <w:b w:val="0"/>
-          <w:bCs w:val="0"/>
-          <w:i w:val="0"/>
-          <w:iCs w:val="0"/>
-          <w:smallCaps w:val="0"/>
-          <w:strike w:val="0"/>
-          <w:color w:val="000000"/>
-          <w:sz w:val="24"/>
-          <w:szCs w:val="24"/>
-          <w:u w:val="none"/>
-          <w:shd w:fill="auto" w:val="clear"/>
-          <w:vertAlign w:val="baseline"/>
-          <w:rtl w:val="0"/>
-        </w:rPr>
-        <w:t xml:space="preserve">Богданова О. С. Вплив двовісності навантаження на граничний стан ортотропної пластини з періодичною системою колінеарних тріщин // Механіка: сучасність і перспективи – 2024 : матеріали Міжнар. наук. конф. (Київ, 7–11 жовтня 2024 р.). Київ : Інститут механіки ім. С. П. Тимошенка НАН України, 2024. С. 280–282. </w:t>
-      </w:r>
-    </w:p>
-    <w:p>
-      <w:pPr>
-        <w:keepNext w:val="0"/>
-        <w:keepLines w:val="0"/>
-        <w:pageBreakBefore w:val="0"/>
-        <w:widowControl w:val="1"/>
-        <w:numPr>
-          <w:ilvl w:val="1"/>
-          <w:numId w:val="7"/>
-        </w:numPr>
-        <w:pBdr>
-          <w:top w:space="0" w:sz="0" w:val="nil"/>
-          <w:left w:space="0" w:sz="0" w:val="nil"/>
-          <w:bottom w:space="0" w:sz="0" w:val="nil"/>
-          <w:right w:space="0" w:sz="0" w:val="nil"/>
-          <w:between w:space="0" w:sz="0" w:val="nil"/>
-        </w:pBdr>
-        <w:shd w:fill="auto" w:val="clear"/>
-        <w:tabs>
-          <w:tab w:val="center" w:leader="none" w:pos="4677"/>
-          <w:tab w:val="right" w:leader="none" w:pos="9355"/>
-          <w:tab w:val="center" w:leader="none" w:pos="426"/>
-        </w:tabs>
-        <w:spacing w:after="0" w:before="0" w:line="252.00000000000003" w:lineRule="auto"/>
-        <w:ind w:left="426" w:right="0" w:hanging="426"/>
-        <w:jc w:val="left"/>
-        <w:rPr>
-          <w:rFonts w:ascii="Times New Roman" w:cs="Times New Roman" w:eastAsia="Times New Roman" w:hAnsi="Times New Roman"/>
-          <w:b w:val="0"/>
-          <w:bCs w:val="0"/>
-          <w:i w:val="0"/>
-          <w:iCs w:val="0"/>
-          <w:smallCaps w:val="0"/>
-          <w:strike w:val="0"/>
-          <w:color w:val="000000"/>
-          <w:sz w:val="24"/>
-          <w:szCs w:val="24"/>
-          <w:u w:val="none"/>
-          <w:shd w:fill="auto" w:val="clear"/>
-          <w:vertAlign w:val="baseline"/>
-        </w:rPr>
-      </w:pPr>
-      <w:r>
-        <w:rPr>
-          <w:rFonts w:ascii="Times New Roman" w:cs="Times New Roman" w:eastAsia="Times New Roman" w:hAnsi="Times New Roman"/>
-          <w:b w:val="0"/>
-          <w:bCs w:val="0"/>
-          <w:i w:val="0"/>
-          <w:iCs w:val="0"/>
-          <w:smallCaps w:val="0"/>
-          <w:strike w:val="0"/>
-          <w:color w:val="000000"/>
-          <w:sz w:val="24"/>
-          <w:szCs w:val="24"/>
-          <w:u w:val="none"/>
-          <w:shd w:fill="auto" w:val="clear"/>
-          <w:vertAlign w:val="baseline"/>
-          <w:rtl w:val="0"/>
-        </w:rPr>
-        <w:t xml:space="preserve">Терещенко Л. М., Ткаченко В. О., Абрамова Л. П. Математичне моделювання взаємодії та поширення хвиль в околі проникного хвилелому // MODERN RESEARCH IN SCIENCE AND EDUCATION : XI Int. Sci.-Prac. Conf. (Chicago, USA, June 27–29, 2024). P. 153–157. </w:t>
-      </w:r>
-    </w:p>
-    <w:p>
-      <w:pPr>
-        <w:keepNext w:val="0"/>
-        <w:keepLines w:val="0"/>
-        <w:pageBreakBefore w:val="0"/>
-        <w:widowControl w:val="1"/>
-        <w:numPr>
-          <w:ilvl w:val="1"/>
-          <w:numId w:val="7"/>
-        </w:numPr>
-        <w:pBdr>
-          <w:top w:space="0" w:sz="0" w:val="nil"/>
-          <w:left w:space="0" w:sz="0" w:val="nil"/>
-          <w:bottom w:space="0" w:sz="0" w:val="nil"/>
-          <w:right w:space="0" w:sz="0" w:val="nil"/>
-          <w:between w:space="0" w:sz="0" w:val="nil"/>
-        </w:pBdr>
-        <w:shd w:fill="auto" w:val="clear"/>
-        <w:tabs>
-          <w:tab w:val="center" w:leader="none" w:pos="4677"/>
-          <w:tab w:val="right" w:leader="none" w:pos="9355"/>
-          <w:tab w:val="center" w:leader="none" w:pos="426"/>
-        </w:tabs>
-        <w:spacing w:after="0" w:before="0" w:line="252.00000000000003" w:lineRule="auto"/>
-        <w:ind w:left="426" w:right="0" w:hanging="426"/>
-        <w:jc w:val="left"/>
-        <w:rPr>
-          <w:rFonts w:ascii="Times New Roman" w:cs="Times New Roman" w:eastAsia="Times New Roman" w:hAnsi="Times New Roman"/>
-          <w:b w:val="0"/>
-          <w:bCs w:val="0"/>
-          <w:i w:val="0"/>
-          <w:iCs w:val="0"/>
-          <w:smallCaps w:val="0"/>
-          <w:strike w:val="0"/>
-          <w:color w:val="000000"/>
-          <w:sz w:val="24"/>
-          <w:szCs w:val="24"/>
-          <w:u w:val="none"/>
-          <w:shd w:fill="auto" w:val="clear"/>
-          <w:vertAlign w:val="baseline"/>
-        </w:rPr>
-      </w:pPr>
-      <w:r>
-        <w:rPr>
-          <w:rFonts w:ascii="Times New Roman" w:cs="Times New Roman" w:eastAsia="Times New Roman" w:hAnsi="Times New Roman"/>
-          <w:b w:val="0"/>
-          <w:bCs w:val="0"/>
-          <w:i w:val="0"/>
-          <w:iCs w:val="0"/>
-          <w:smallCaps w:val="0"/>
-          <w:strike w:val="0"/>
-          <w:color w:val="000000"/>
-          <w:sz w:val="24"/>
-          <w:szCs w:val="24"/>
-          <w:u w:val="none"/>
-          <w:shd w:fill="auto" w:val="clear"/>
-          <w:vertAlign w:val="baseline"/>
-          <w:rtl w:val="0"/>
-        </w:rPr>
-        <w:t xml:space="preserve">Селіванов М. Ф., Фернаті П. В., Терещенко Л. М. Визначення траєкторії розвитку тріщини з використанням адаптивної розбивки із регулярною частиною // Механіка: сучасність і перспективи – 2024 : матеріали Міжнар. наук. конф. (Київ, 7–11 жовтня 2024 р.). Київ : Інститут механіки ім. С. П. Тимошенка НАН України, 2024. С. 254–257. </w:t>
-      </w:r>
-    </w:p>
-    <w:p>
-      <w:pPr>
-        <w:keepNext w:val="0"/>
-        <w:keepLines w:val="0"/>
-        <w:pageBreakBefore w:val="0"/>
-        <w:widowControl w:val="1"/>
-        <w:numPr>
-          <w:ilvl w:val="1"/>
-          <w:numId w:val="7"/>
-        </w:numPr>
-        <w:pBdr>
-          <w:top w:space="0" w:sz="0" w:val="nil"/>
-          <w:left w:space="0" w:sz="0" w:val="nil"/>
-          <w:bottom w:space="0" w:sz="0" w:val="nil"/>
-          <w:right w:space="0" w:sz="0" w:val="nil"/>
-          <w:between w:space="0" w:sz="0" w:val="nil"/>
-        </w:pBdr>
-        <w:shd w:fill="auto" w:val="clear"/>
-        <w:tabs>
-          <w:tab w:val="center" w:leader="none" w:pos="4677"/>
-          <w:tab w:val="right" w:leader="none" w:pos="9355"/>
-          <w:tab w:val="center" w:leader="none" w:pos="426"/>
-        </w:tabs>
-        <w:spacing w:after="0" w:before="0" w:line="252.00000000000003" w:lineRule="auto"/>
-        <w:ind w:left="426" w:right="0" w:hanging="426"/>
-        <w:jc w:val="left"/>
-        <w:rPr>
-          <w:rFonts w:ascii="Times New Roman" w:cs="Times New Roman" w:eastAsia="Times New Roman" w:hAnsi="Times New Roman"/>
-          <w:b w:val="0"/>
-          <w:bCs w:val="0"/>
-          <w:i w:val="0"/>
-          <w:iCs w:val="0"/>
-          <w:smallCaps w:val="0"/>
-          <w:strike w:val="0"/>
-          <w:color w:val="000000"/>
-          <w:sz w:val="24"/>
-          <w:szCs w:val="24"/>
-          <w:u w:val="none"/>
-          <w:shd w:fill="auto" w:val="clear"/>
-          <w:vertAlign w:val="baseline"/>
-        </w:rPr>
-      </w:pPr>
-      <w:r>
-        <w:rPr>
-          <w:rFonts w:ascii="Times New Roman" w:cs="Times New Roman" w:eastAsia="Times New Roman" w:hAnsi="Times New Roman"/>
-          <w:b w:val="0"/>
-          <w:bCs w:val="0"/>
-          <w:i w:val="0"/>
-          <w:iCs w:val="0"/>
-          <w:smallCaps w:val="0"/>
-          <w:strike w:val="0"/>
-          <w:color w:val="000000"/>
-          <w:sz w:val="24"/>
-          <w:szCs w:val="24"/>
-          <w:u w:val="none"/>
-          <w:shd w:fill="auto" w:val="clear"/>
-          <w:vertAlign w:val="baseline"/>
-          <w:rtl w:val="0"/>
-        </w:rPr>
-        <w:t xml:space="preserve">Kaminsky A. A., Dudyk M. V., Chornoivan Y. O. An Analytical Solution for the Interface Crack in a Quasi-Brittle Bonding Material // Fatigue &amp; Fracture of Engineering Materials &amp; Structures. 2025. Vol. 48, № 7. P. 2995–3006. </w:t>
-      </w:r>
-    </w:p>
-    <w:p>
-      <w:pPr>
-        <w:keepNext w:val="0"/>
-        <w:keepLines w:val="0"/>
-        <w:pageBreakBefore w:val="0"/>
-        <w:widowControl w:val="1"/>
-        <w:numPr>
-          <w:ilvl w:val="1"/>
-          <w:numId w:val="7"/>
-        </w:numPr>
-        <w:pBdr>
-          <w:top w:space="0" w:sz="0" w:val="nil"/>
-          <w:left w:space="0" w:sz="0" w:val="nil"/>
-          <w:bottom w:space="0" w:sz="0" w:val="nil"/>
-          <w:right w:space="0" w:sz="0" w:val="nil"/>
-          <w:between w:space="0" w:sz="0" w:val="nil"/>
-        </w:pBdr>
-        <w:shd w:fill="auto" w:val="clear"/>
-        <w:tabs>
-          <w:tab w:val="center" w:leader="none" w:pos="4677"/>
-          <w:tab w:val="right" w:leader="none" w:pos="9355"/>
-          <w:tab w:val="center" w:leader="none" w:pos="426"/>
-        </w:tabs>
-        <w:spacing w:after="0" w:before="0" w:line="252.00000000000003" w:lineRule="auto"/>
-        <w:ind w:left="426" w:right="0" w:hanging="426"/>
-        <w:jc w:val="left"/>
-        <w:rPr>
-          <w:rFonts w:ascii="Times New Roman" w:cs="Times New Roman" w:eastAsia="Times New Roman" w:hAnsi="Times New Roman"/>
-          <w:b w:val="0"/>
-          <w:bCs w:val="0"/>
-          <w:i w:val="0"/>
-          <w:iCs w:val="0"/>
-          <w:smallCaps w:val="0"/>
-          <w:strike w:val="0"/>
-          <w:color w:val="000000"/>
-          <w:sz w:val="24"/>
-          <w:szCs w:val="24"/>
-          <w:u w:val="none"/>
-          <w:shd w:fill="auto" w:val="clear"/>
-          <w:vertAlign w:val="baseline"/>
-        </w:rPr>
-      </w:pPr>
-      <w:r>
-        <w:rPr>
-          <w:rFonts w:ascii="Times New Roman" w:cs="Times New Roman" w:eastAsia="Times New Roman" w:hAnsi="Times New Roman"/>
-          <w:b w:val="0"/>
-          <w:bCs w:val="0"/>
-          <w:i w:val="0"/>
-          <w:iCs w:val="0"/>
-          <w:smallCaps w:val="0"/>
-          <w:strike w:val="0"/>
-          <w:color w:val="000000"/>
-          <w:sz w:val="24"/>
-          <w:szCs w:val="24"/>
-          <w:u w:val="none"/>
-          <w:shd w:fill="auto" w:val="clear"/>
-          <w:vertAlign w:val="baseline"/>
-          <w:rtl w:val="0"/>
-        </w:rPr>
-        <w:t xml:space="preserve">Kaminsky A. O., Dudyk M. V., Polishchuk T. V. Crack Initiation Model in Elastic Piecewise Homogeneous Body with Broken Interface // International Applied Mechanics. 2024. Vol. 60, № 6. P. 677–688. </w:t>
-      </w:r>
-    </w:p>
-    <w:p>
-      <w:pPr>
-        <w:keepNext w:val="0"/>
-        <w:keepLines w:val="0"/>
-        <w:pageBreakBefore w:val="0"/>
-        <w:widowControl w:val="1"/>
-        <w:numPr>
-          <w:ilvl w:val="1"/>
-          <w:numId w:val="7"/>
-        </w:numPr>
-        <w:pBdr>
-          <w:top w:space="0" w:sz="0" w:val="nil"/>
-          <w:left w:space="0" w:sz="0" w:val="nil"/>
-          <w:bottom w:space="0" w:sz="0" w:val="nil"/>
-          <w:right w:space="0" w:sz="0" w:val="nil"/>
-          <w:between w:space="0" w:sz="0" w:val="nil"/>
-        </w:pBdr>
-        <w:shd w:fill="auto" w:val="clear"/>
-        <w:tabs>
-          <w:tab w:val="center" w:leader="none" w:pos="4677"/>
-          <w:tab w:val="right" w:leader="none" w:pos="9355"/>
-          <w:tab w:val="center" w:leader="none" w:pos="426"/>
-        </w:tabs>
-        <w:spacing w:after="0" w:before="0" w:line="252.00000000000003" w:lineRule="auto"/>
-        <w:ind w:left="426" w:right="0" w:hanging="426"/>
-        <w:jc w:val="left"/>
-        <w:rPr>
-          <w:rFonts w:ascii="Times New Roman" w:cs="Times New Roman" w:eastAsia="Times New Roman" w:hAnsi="Times New Roman"/>
-          <w:b w:val="0"/>
-          <w:bCs w:val="0"/>
-          <w:i w:val="0"/>
-          <w:iCs w:val="0"/>
-          <w:smallCaps w:val="0"/>
-          <w:strike w:val="0"/>
-          <w:color w:val="000000"/>
-          <w:sz w:val="24"/>
-          <w:szCs w:val="24"/>
-          <w:u w:val="none"/>
-          <w:shd w:fill="auto" w:val="clear"/>
-          <w:vertAlign w:val="baseline"/>
-        </w:rPr>
-      </w:pPr>
-      <w:r>
-        <w:rPr>
-          <w:rFonts w:ascii="Times New Roman" w:cs="Times New Roman" w:eastAsia="Times New Roman" w:hAnsi="Times New Roman"/>
-          <w:b w:val="0"/>
-          <w:bCs w:val="0"/>
-          <w:i w:val="0"/>
-          <w:iCs w:val="0"/>
-          <w:smallCaps w:val="0"/>
-          <w:strike w:val="0"/>
-          <w:color w:val="000000"/>
-          <w:sz w:val="24"/>
-          <w:szCs w:val="24"/>
-          <w:u w:val="none"/>
-          <w:shd w:fill="auto" w:val="clear"/>
-          <w:vertAlign w:val="baseline"/>
-          <w:rtl w:val="0"/>
-        </w:rPr>
-        <w:t xml:space="preserve">Dudyk M., Kaminsky A., Reshitnyk Yu., Chornoivan Yu. On analytical model of interface crack in bonding quasi-brittle material between distinct elastic media // Procedia Structural Integrity. 2025. Vol. 68. P. 53–58. </w:t>
-      </w:r>
-    </w:p>
-    <w:p>
-      <w:pPr>
-        <w:keepNext w:val="0"/>
-        <w:keepLines w:val="0"/>
-        <w:pageBreakBefore w:val="0"/>
-        <w:widowControl w:val="1"/>
-        <w:numPr>
-          <w:ilvl w:val="1"/>
-          <w:numId w:val="7"/>
-        </w:numPr>
-        <w:pBdr>
-          <w:top w:space="0" w:sz="0" w:val="nil"/>
-          <w:left w:space="0" w:sz="0" w:val="nil"/>
-          <w:bottom w:space="0" w:sz="0" w:val="nil"/>
-          <w:right w:space="0" w:sz="0" w:val="nil"/>
-          <w:between w:space="0" w:sz="0" w:val="nil"/>
-        </w:pBdr>
-        <w:shd w:fill="auto" w:val="clear"/>
-        <w:tabs>
-          <w:tab w:val="center" w:leader="none" w:pos="4677"/>
-          <w:tab w:val="right" w:leader="none" w:pos="9355"/>
-          <w:tab w:val="center" w:leader="none" w:pos="426"/>
-        </w:tabs>
-        <w:spacing w:after="0" w:before="0" w:line="252.00000000000003" w:lineRule="auto"/>
-        <w:ind w:left="426" w:right="0" w:hanging="426"/>
-        <w:jc w:val="left"/>
-        <w:rPr>
-          <w:rFonts w:ascii="Times New Roman" w:cs="Times New Roman" w:eastAsia="Times New Roman" w:hAnsi="Times New Roman"/>
-          <w:b w:val="0"/>
-          <w:bCs w:val="0"/>
-          <w:i w:val="0"/>
-          <w:iCs w:val="0"/>
-          <w:smallCaps w:val="0"/>
-          <w:strike w:val="0"/>
-          <w:color w:val="000000"/>
-          <w:sz w:val="24"/>
-          <w:szCs w:val="24"/>
-          <w:u w:val="none"/>
-          <w:shd w:fill="auto" w:val="clear"/>
-          <w:vertAlign w:val="baseline"/>
-        </w:rPr>
-      </w:pPr>
-      <w:r>
-        <w:rPr>
-          <w:rFonts w:ascii="Times New Roman" w:cs="Times New Roman" w:eastAsia="Times New Roman" w:hAnsi="Times New Roman"/>
-          <w:b w:val="0"/>
-          <w:bCs w:val="0"/>
-          <w:i w:val="0"/>
-          <w:iCs w:val="0"/>
-          <w:smallCaps w:val="0"/>
-          <w:strike w:val="0"/>
-          <w:color w:val="000000"/>
-          <w:sz w:val="24"/>
-          <w:szCs w:val="24"/>
-          <w:u w:val="none"/>
-          <w:shd w:fill="auto" w:val="clear"/>
-          <w:vertAlign w:val="baseline"/>
-          <w:rtl w:val="0"/>
-        </w:rPr>
-        <w:t xml:space="preserve">Chugunova M., Ji H., Taranets R., Vasylyeva N. Analysis of a Radiotherapy Model for Brain Tumors // Studies in Applied Mathematics. 2025. Vol. 155, № 1. e70074. </w:t>
-      </w:r>
-    </w:p>
-    <w:p>
-      <w:pPr>
-        <w:keepNext w:val="0"/>
-        <w:keepLines w:val="0"/>
-        <w:pageBreakBefore w:val="0"/>
-        <w:widowControl w:val="1"/>
-        <w:numPr>
-          <w:ilvl w:val="1"/>
-          <w:numId w:val="7"/>
-        </w:numPr>
-        <w:pBdr>
-          <w:top w:space="0" w:sz="0" w:val="nil"/>
-          <w:left w:space="0" w:sz="0" w:val="nil"/>
-          <w:bottom w:space="0" w:sz="0" w:val="nil"/>
-          <w:right w:space="0" w:sz="0" w:val="nil"/>
-          <w:between w:space="0" w:sz="0" w:val="nil"/>
-        </w:pBdr>
-        <w:shd w:fill="auto" w:val="clear"/>
-        <w:tabs>
-          <w:tab w:val="center" w:leader="none" w:pos="4677"/>
-          <w:tab w:val="right" w:leader="none" w:pos="9355"/>
-          <w:tab w:val="center" w:leader="none" w:pos="426"/>
-        </w:tabs>
-        <w:spacing w:after="0" w:before="0" w:line="252.00000000000003" w:lineRule="auto"/>
-        <w:ind w:left="426" w:right="0" w:hanging="426"/>
-        <w:jc w:val="left"/>
-        <w:rPr>
-          <w:rFonts w:ascii="Times New Roman" w:cs="Times New Roman" w:eastAsia="Times New Roman" w:hAnsi="Times New Roman"/>
-          <w:b w:val="0"/>
-          <w:bCs w:val="0"/>
-          <w:i w:val="0"/>
-          <w:iCs w:val="0"/>
-          <w:smallCaps w:val="0"/>
-          <w:strike w:val="0"/>
-          <w:color w:val="000000"/>
-          <w:sz w:val="24"/>
-          <w:szCs w:val="24"/>
-          <w:u w:val="none"/>
-          <w:shd w:fill="auto" w:val="clear"/>
-          <w:vertAlign w:val="baseline"/>
-        </w:rPr>
-      </w:pPr>
-      <w:r>
-        <w:rPr>
-          <w:rFonts w:ascii="Times New Roman" w:cs="Times New Roman" w:eastAsia="Times New Roman" w:hAnsi="Times New Roman"/>
-          <w:b w:val="0"/>
-          <w:bCs w:val="0"/>
-          <w:i w:val="0"/>
-          <w:iCs w:val="0"/>
-          <w:smallCaps w:val="0"/>
-          <w:strike w:val="0"/>
-          <w:color w:val="000000"/>
-          <w:sz w:val="24"/>
-          <w:szCs w:val="24"/>
-          <w:u w:val="none"/>
-          <w:shd w:fill="auto" w:val="clear"/>
-          <w:vertAlign w:val="baseline"/>
-          <w:rtl w:val="0"/>
-        </w:rPr>
-        <w:t xml:space="preserve">Pata V., Siryk S. V., Vasylyeva N. Multi-term fractional linear equations modeling oxygen subdiffusion through capillaries // Applicable Analysis. 2025. P. 1–39. </w:t>
-      </w:r>
-    </w:p>
-    <w:p>
-      <w:pPr>
-        <w:keepNext w:val="0"/>
-        <w:keepLines w:val="0"/>
-        <w:pageBreakBefore w:val="0"/>
-        <w:widowControl w:val="1"/>
-        <w:numPr>
-          <w:ilvl w:val="1"/>
-          <w:numId w:val="7"/>
-        </w:numPr>
-        <w:pBdr>
-          <w:top w:space="0" w:sz="0" w:val="nil"/>
-          <w:left w:space="0" w:sz="0" w:val="nil"/>
-          <w:bottom w:space="0" w:sz="0" w:val="nil"/>
-          <w:right w:space="0" w:sz="0" w:val="nil"/>
-          <w:between w:space="0" w:sz="0" w:val="nil"/>
-        </w:pBdr>
-        <w:shd w:fill="auto" w:val="clear"/>
-        <w:tabs>
-          <w:tab w:val="center" w:leader="none" w:pos="4677"/>
-          <w:tab w:val="right" w:leader="none" w:pos="9355"/>
-          <w:tab w:val="center" w:leader="none" w:pos="426"/>
-        </w:tabs>
-        <w:spacing w:after="0" w:before="0" w:line="252.00000000000003" w:lineRule="auto"/>
-        <w:ind w:left="426" w:right="0" w:hanging="426"/>
-        <w:jc w:val="left"/>
-        <w:rPr>
-          <w:rFonts w:ascii="Times New Roman" w:cs="Times New Roman" w:eastAsia="Times New Roman" w:hAnsi="Times New Roman"/>
-          <w:b w:val="0"/>
-          <w:bCs w:val="0"/>
-          <w:i w:val="0"/>
-          <w:iCs w:val="0"/>
-          <w:smallCaps w:val="0"/>
-          <w:strike w:val="0"/>
-          <w:color w:val="000000"/>
-          <w:sz w:val="24"/>
-          <w:szCs w:val="24"/>
-          <w:u w:val="none"/>
-          <w:shd w:fill="auto" w:val="clear"/>
-          <w:vertAlign w:val="baseline"/>
-        </w:rPr>
-      </w:pPr>
-      <w:r>
-        <w:rPr>
-          <w:rFonts w:ascii="Times New Roman" w:cs="Times New Roman" w:eastAsia="Times New Roman" w:hAnsi="Times New Roman"/>
-          <w:b w:val="0"/>
-          <w:bCs w:val="0"/>
-          <w:i w:val="0"/>
-          <w:iCs w:val="0"/>
-          <w:smallCaps w:val="0"/>
-          <w:strike w:val="0"/>
-          <w:color w:val="000000"/>
-          <w:sz w:val="24"/>
-          <w:szCs w:val="24"/>
-          <w:u w:val="none"/>
-          <w:shd w:fill="auto" w:val="clear"/>
-          <w:vertAlign w:val="baseline"/>
-          <w:rtl w:val="0"/>
-        </w:rPr>
-        <w:t xml:space="preserve">Pereverzyev S., Siryk S. V., Vasylyeva N. Identification of the memory order in multi-term subdiffusion equations // Numerical Functional Analysis and Optimization. 2025. Vol. 46, № 3. P. 275–309. </w:t>
-      </w:r>
-    </w:p>
-    <w:p>
-      <w:pPr>
-        <w:keepNext w:val="0"/>
-        <w:keepLines w:val="0"/>
-        <w:pageBreakBefore w:val="0"/>
-        <w:widowControl w:val="1"/>
-        <w:numPr>
-          <w:ilvl w:val="1"/>
-          <w:numId w:val="7"/>
-        </w:numPr>
-        <w:pBdr>
-          <w:top w:space="0" w:sz="0" w:val="nil"/>
-          <w:left w:space="0" w:sz="0" w:val="nil"/>
-          <w:bottom w:space="0" w:sz="0" w:val="nil"/>
-          <w:right w:space="0" w:sz="0" w:val="nil"/>
-          <w:between w:space="0" w:sz="0" w:val="nil"/>
-        </w:pBdr>
-        <w:shd w:fill="auto" w:val="clear"/>
-        <w:tabs>
-          <w:tab w:val="center" w:leader="none" w:pos="4677"/>
-          <w:tab w:val="right" w:leader="none" w:pos="9355"/>
-          <w:tab w:val="center" w:leader="none" w:pos="426"/>
-        </w:tabs>
-        <w:spacing w:after="0" w:before="0" w:line="252.00000000000003" w:lineRule="auto"/>
-        <w:ind w:left="426" w:right="0" w:hanging="426"/>
-        <w:jc w:val="left"/>
-        <w:rPr>
-          <w:rFonts w:ascii="Times New Roman" w:cs="Times New Roman" w:eastAsia="Times New Roman" w:hAnsi="Times New Roman"/>
-          <w:b w:val="0"/>
-          <w:bCs w:val="0"/>
-          <w:i w:val="0"/>
-          <w:iCs w:val="0"/>
-          <w:smallCaps w:val="0"/>
-          <w:strike w:val="0"/>
-          <w:color w:val="000000"/>
-          <w:sz w:val="24"/>
-          <w:szCs w:val="24"/>
-          <w:u w:val="none"/>
-          <w:shd w:fill="auto" w:val="clear"/>
-          <w:vertAlign w:val="baseline"/>
-        </w:rPr>
-      </w:pPr>
-      <w:r>
-        <w:rPr>
-          <w:rFonts w:ascii="Times New Roman" w:cs="Times New Roman" w:eastAsia="Times New Roman" w:hAnsi="Times New Roman"/>
-          <w:b w:val="0"/>
-          <w:bCs w:val="0"/>
-          <w:i w:val="0"/>
-          <w:iCs w:val="0"/>
-          <w:smallCaps w:val="0"/>
-          <w:strike w:val="0"/>
-          <w:color w:val="000000"/>
-          <w:sz w:val="24"/>
-          <w:szCs w:val="24"/>
-          <w:u w:val="none"/>
-          <w:shd w:fill="auto" w:val="clear"/>
-          <w:vertAlign w:val="baseline"/>
-          <w:rtl w:val="0"/>
-        </w:rPr>
-        <w:t xml:space="preserve">Kaminsky A. O., Kurchakov E. E., Chornoivan Yu. O., Gusev V. V. Numerical Analysis of Boundary Effects in Nonlinear Orthotropic Body with Crack // International Applied Mechanics. 2025. Vol. 61, № 1. P. 81–95. </w:t>
-      </w:r>
-    </w:p>
-    <w:p>
-      <w:pPr>
-        <w:keepNext w:val="0"/>
-        <w:keepLines w:val="0"/>
-        <w:pageBreakBefore w:val="0"/>
-        <w:widowControl w:val="1"/>
-        <w:numPr>
-          <w:ilvl w:val="1"/>
-          <w:numId w:val="7"/>
-        </w:numPr>
-        <w:pBdr>
-          <w:top w:space="0" w:sz="0" w:val="nil"/>
-          <w:left w:space="0" w:sz="0" w:val="nil"/>
-          <w:bottom w:space="0" w:sz="0" w:val="nil"/>
-          <w:right w:space="0" w:sz="0" w:val="nil"/>
-          <w:between w:space="0" w:sz="0" w:val="nil"/>
-        </w:pBdr>
-        <w:shd w:fill="auto" w:val="clear"/>
-        <w:tabs>
-          <w:tab w:val="center" w:leader="none" w:pos="4677"/>
-          <w:tab w:val="right" w:leader="none" w:pos="9355"/>
-          <w:tab w:val="center" w:leader="none" w:pos="426"/>
-        </w:tabs>
-        <w:spacing w:after="0" w:before="0" w:line="252.00000000000003" w:lineRule="auto"/>
-        <w:ind w:left="426" w:right="0" w:hanging="426"/>
-        <w:jc w:val="left"/>
-        <w:rPr>
-          <w:rFonts w:ascii="Times New Roman" w:cs="Times New Roman" w:eastAsia="Times New Roman" w:hAnsi="Times New Roman"/>
-          <w:b w:val="0"/>
-          <w:bCs w:val="0"/>
-          <w:i w:val="0"/>
-          <w:iCs w:val="0"/>
-          <w:smallCaps w:val="0"/>
-          <w:strike w:val="0"/>
-          <w:color w:val="000000"/>
-          <w:sz w:val="24"/>
-          <w:szCs w:val="24"/>
-          <w:u w:val="none"/>
-          <w:shd w:fill="auto" w:val="clear"/>
-          <w:vertAlign w:val="baseline"/>
-        </w:rPr>
-      </w:pPr>
-      <w:r>
-        <w:rPr>
-          <w:rFonts w:ascii="Times New Roman" w:cs="Times New Roman" w:eastAsia="Times New Roman" w:hAnsi="Times New Roman"/>
-          <w:b w:val="0"/>
-          <w:bCs w:val="0"/>
-          <w:i w:val="0"/>
-          <w:iCs w:val="0"/>
-          <w:smallCaps w:val="0"/>
-          <w:strike w:val="0"/>
-          <w:color w:val="000000"/>
-          <w:sz w:val="24"/>
-          <w:szCs w:val="24"/>
-          <w:u w:val="none"/>
-          <w:shd w:fill="auto" w:val="clear"/>
-          <w:vertAlign w:val="baseline"/>
-          <w:rtl w:val="0"/>
-        </w:rPr>
-        <w:t xml:space="preserve">Martynyak R. M., Mykytyn M. M., Malanchuk N. I. Thermomechanical contact of an elastic half-space and a rigid base under the action of a circular heat sink // Materials Science. 2025. Vol. 61. P. 129–136. </w:t>
-      </w:r>
-    </w:p>
-    <w:p>
-      <w:pPr>
-        <w:keepNext w:val="0"/>
-        <w:keepLines w:val="0"/>
-        <w:pageBreakBefore w:val="0"/>
-        <w:widowControl w:val="1"/>
-        <w:numPr>
-          <w:ilvl w:val="1"/>
-          <w:numId w:val="7"/>
-        </w:numPr>
-        <w:pBdr>
-          <w:top w:space="0" w:sz="0" w:val="nil"/>
-          <w:left w:space="0" w:sz="0" w:val="nil"/>
-          <w:bottom w:space="0" w:sz="0" w:val="nil"/>
-          <w:right w:space="0" w:sz="0" w:val="nil"/>
-          <w:between w:space="0" w:sz="0" w:val="nil"/>
-        </w:pBdr>
-        <w:shd w:fill="auto" w:val="clear"/>
-        <w:tabs>
-          <w:tab w:val="center" w:leader="none" w:pos="4677"/>
-          <w:tab w:val="right" w:leader="none" w:pos="9355"/>
-          <w:tab w:val="center" w:leader="none" w:pos="426"/>
-        </w:tabs>
-        <w:spacing w:after="0" w:before="0" w:line="252.00000000000003" w:lineRule="auto"/>
-        <w:ind w:left="426" w:right="0" w:hanging="426"/>
-        <w:jc w:val="left"/>
-        <w:rPr>
-          <w:rFonts w:ascii="Times New Roman" w:cs="Times New Roman" w:eastAsia="Times New Roman" w:hAnsi="Times New Roman"/>
-          <w:b w:val="0"/>
-          <w:bCs w:val="0"/>
-          <w:i w:val="0"/>
-          <w:iCs w:val="0"/>
-          <w:smallCaps w:val="0"/>
-          <w:strike w:val="0"/>
-          <w:color w:val="000000"/>
-          <w:sz w:val="24"/>
-          <w:szCs w:val="24"/>
-          <w:u w:val="none"/>
-          <w:shd w:fill="auto" w:val="clear"/>
-          <w:vertAlign w:val="baseline"/>
-        </w:rPr>
-      </w:pPr>
-      <w:r>
-        <w:rPr>
-          <w:rFonts w:ascii="Times New Roman" w:cs="Times New Roman" w:eastAsia="Times New Roman" w:hAnsi="Times New Roman"/>
-          <w:b w:val="0"/>
-          <w:bCs w:val="0"/>
-          <w:i w:val="0"/>
-          <w:iCs w:val="0"/>
-          <w:smallCaps w:val="0"/>
-          <w:strike w:val="0"/>
-          <w:color w:val="000000"/>
-          <w:sz w:val="24"/>
-          <w:szCs w:val="24"/>
-          <w:u w:val="none"/>
-          <w:shd w:fill="auto" w:val="clear"/>
-          <w:vertAlign w:val="baseline"/>
-          <w:rtl w:val="0"/>
-        </w:rPr>
-        <w:t xml:space="preserve">Kaminsky, A.A., Dudyk, M.V. &amp; Chornoivan, Y.O. An analytical evaluation of T-stress influence in the process zone modelling for the interface crack kinking. Int J Fract 250, 22 (2026).</w:t>
-      </w:r>
-    </w:p>
-    <w:p>
-      <w:pPr>
-        <w:keepNext w:val="0"/>
-        <w:keepLines w:val="0"/>
-        <w:pageBreakBefore w:val="0"/>
-        <w:widowControl w:val="1"/>
-        <w:pBdr>
-          <w:top w:space="0" w:sz="0" w:val="nil"/>
-          <w:left w:space="0" w:sz="0" w:val="nil"/>
-          <w:bottom w:space="0" w:sz="0" w:val="nil"/>
-          <w:right w:space="0" w:sz="0" w:val="nil"/>
-          <w:between w:space="0" w:sz="0" w:val="nil"/>
-        </w:pBdr>
-        <w:shd w:fill="auto" w:val="clear"/>
-        <w:tabs>
-          <w:tab w:val="center" w:leader="none" w:pos="4677"/>
-          <w:tab w:val="right" w:leader="none" w:pos="9355"/>
-        </w:tabs>
-        <w:spacing w:after="0" w:before="0" w:line="252.00000000000003" w:lineRule="auto"/>
-        <w:ind w:left="0" w:right="0" w:firstLine="0"/>
-        <w:jc w:val="left"/>
-        <w:rPr>
-          <w:rFonts w:ascii="Times New Roman" w:cs="Times New Roman" w:eastAsia="Times New Roman" w:hAnsi="Times New Roman"/>
-          <w:b w:val="0"/>
-          <w:bCs w:val="0"/>
-          <w:i w:val="0"/>
-          <w:iCs w:val="0"/>
-          <w:smallCaps w:val="0"/>
-          <w:strike w:val="0"/>
-          <w:color w:val="000000"/>
-          <w:sz w:val="24"/>
-          <w:szCs w:val="24"/>
-          <w:u w:val="none"/>
-          <w:shd w:fill="auto" w:val="clear"/>
-          <w:vertAlign w:val="baseline"/>
-        </w:rPr>
-      </w:pPr>
-      <w:r>
-        <w:rPr>
-          <w:rtl w:val="0"/>
-        </w:rPr>
+      <w:pPr/>
+      <w:r>
+        <w:t>Авторський колектив має безпосередній науковий доробок у механіці руйнування неоднорідних, композитних і квазікрихких матеріалів, що є методичною основою для запропонованої теми. Найважливішими для цієї роботи є результати з когезійно-зонного моделювання, аналізу міжфазних тріщин, зон передруйнування, кiнкування тріщин і дебондингу в сендвічевих та стільникових композитних системах. Саме ці напрями безпосередньо пов'язані з моделюванням тріщиностійкості метаматеріально-орієнтованих інфраструктурних композитів, у яких внутрішня архітектура, міжфазні межі та локальні зони пошкодження визначають довговічність матеріалу.</w:t>
+      </w:r>
+    </w:p>
+    <w:p>
+      <w:pPr/>
+      <w:r>
+        <w:t>Найбільш релевантними результатами авторського колективу є:</w:t>
+      </w:r>
+    </w:p>
+    <w:p>
+      <w:pPr/>
+      <w:r>
+        <w:t>1. Selivanov M., Nazarenko L., Altenbach H. Modeling the slow crack growth of an edge crack within the cohesive zone model approach // Theoretical Analyses, Computations, and Experiments of Multiscale Materials: A Tribute to Francesco dell'Isola / eds. I. Giorgio et al. Cham : Springer International Publishing, 2022. P. 505-535.</w:t>
+      </w:r>
+    </w:p>
+    <w:p>
+      <w:pPr/>
+      <w:r>
+        <w:t>2. Kaminsky A., Dudyk M., Reshitnyk Yu., Chornoivan Yu. An analytical method of modeling the process zone near the tip of an interface crack due to its kinking from the interface of quasi-elastic materials // International Journal of Solids and Structures. 2023. Vol. 267. 112117.</w:t>
+      </w:r>
+    </w:p>
+    <w:p>
+      <w:pPr/>
+      <w:r>
+        <w:t>3. Selivanov M., Bogdanov V., Altenbach H. Solving some problems of crack mechanics for a normal edge crack in orthotropic solid within the cohesive zone model approach // Mechanics of Composite Materials. 2023. Vol. 59, No. 2. P. 335-362.</w:t>
+      </w:r>
+    </w:p>
+    <w:p>
+      <w:pPr/>
+      <w:r>
+        <w:t>4. Xue P., Wei X., Li Z., Wang Y., Selivanov M. F., Xiong J. Mechanics of inner core debonding of composite sandwich beam with CFRP hexagonal honeycomb // International Journal of Solids and Structures. 2024. Vol. 293. 112760.</w:t>
+      </w:r>
+    </w:p>
+    <w:p>
+      <w:pPr/>
+      <w:r>
+        <w:t>5. Kaminsky A. A., Dudyk M. V., Chornoivan Y. O. An analytical solution for the interface crack in a quasi-brittle bonding material // Fatigue &amp; Fracture of Engineering Materials &amp; Structures. 2025. Vol. 48, No. 7. P. 2995-3006.</w:t>
       </w:r>
     </w:p>
     <w:p>

</xml_diff>

<commit_message>
Integrate Kipnis proposal updates
</commit_message>
<xml_diff>
--- a/Proposal2027-2028.improved.docx
+++ b/Proposal2027-2028.improved.docx
@@ -421,18 +421,7 @@
         </w:rPr>
       </w:pPr>
       <w:r>
-        <w:rPr>
-          <w:u w:val="single"/>
-          <w:rtl w:val="0"/>
-        </w:rPr>
-      </w:r>
-      <w:r>
-        <w:rPr>
-          <w:rtl w:val="0"/>
-        </w:rPr>
-      </w:r>
-      <w:r>
-        <w:t>Механіка руйнування метаматеріально-орієнтованих інфраструктурних композитів для потреб оборони та безпеки держави (з акцентом на системи аеродромного та дорожнього покриття за статичного та динамічного навантаження).</w:t>
+        <w:t>Механіка руйнування та втрати стійкості метаматеріально-орієнтованих інфраструктурних композитів для потреб оборони та безпеки держави (з акцентом на системи аеродромного та дорожнього покриття за статичного та динамічного навантаження).</w:t>
       </w:r>
     </w:p>
     <w:p>
@@ -3426,16 +3415,7 @@
         </w:rPr>
       </w:pPr>
       <w:r>
-        <w:rPr>
-          <w:u w:val="single"/>
-          <w:rtl w:val="0"/>
-        </w:rPr>
-        <w:t xml:space="preserve">механіка руйнування; метаматеріально-орієнтовані композити; інфраструктурні композити; дорожнє покриття; когезійна зона; міжфазне руйнування; тріщиностійкість.</w:t>
-      </w:r>
-      <w:r>
-        <w:rPr>
-          <w:rtl w:val="0"/>
-        </w:rPr>
+        <w:t>механіка руйнування; стійкість; метаматеріально-орієнтовані композити; інфраструктурні композити; аеродромне та дорожнє покриття; когезійна зона; біфуркація.</w:t>
       </w:r>
     </w:p>
     <w:p>
@@ -3473,14 +3453,8 @@
     </w:p>
     <w:p>
       <w:pPr/>
-      <w:r/>
-      <w:r/>
-      <w:r/>
-      <w:r/>
-      <w:r/>
-      <w:r/>
-      <w:r>
-        <w:t>Сучасні аеродромні та дорожні покриття, мостові настили, плитні елементи, захисні та ремонтні шари працюють за одночасної дії статичних, циклічних і динамічних навантажень, температурних змін, вологи та поступового накопичення пошкоджень. Одним із головних механізмів втрати їхньої довговічності є зародження і поширення тріщин у матриці матеріалу або на міжфазних межах між його структурними компонентами. Тому актуальним є створення механіко-математичних підходів, які дають змогу не лише описувати руйнування, а й цілеспрямовано керувати траєкторіями тріщин та підвищувати опір пошкодженню інфраструктурних композитів.</w:t>
+      <w:r>
+        <w:t>Сучасні аеродромні та дорожні покриття, мостові настили, плитні елементи, захисні та ремонтні шари працюють за одночасної дії статичних, циклічних і динамічних навантажень, температурних змін, вологи та поступового накопичення пошкоджень. Одними з головних механізмів втрати їхньої довговічності є зародження і поширення тріщин у матриці матеріалу або на міжфазних межах, а також втрата стійкості багатошарових систем за температурно-силового стиску. Тому актуальним є створення механіко-математичних підходів, які дають змогу не лише описувати руйнування, а й прогнозувати критичні стани рівноваги, керувати траєкторіями тріщин та підвищувати опір пошкодженню інфраструктурних композитів.</w:t>
       </w:r>
     </w:p>
     <w:p>
@@ -3493,13 +3467,13 @@
     <w:p>
       <w:pPr/>
       <w:r>
-        <w:t>Планується розробити скінченноелементні, когезійно-зонні та енергетичні моделі зародження, поширення, відхилення і зупинки тріщин у матеріалах з внутрішньою архітектурою за статичного, циклічного та динамічного навантаження. Окремо буде враховано crack-bridging механізми, посттріщинну поведінку цементної або бетонної матриці, міжфазну деградацію в системах полімер-цемент, армування-матриця та ремонтний шар-основа, а також вплив експлуатаційного середовища на полімерні архітектурні елементи.</w:t>
+        <w:t>Планується розробити скінченноелементні, когезійно-зонні, енергетичні та аналітичні моделі зародження, поширення, відхилення і зупинки тріщин у матеріалах з внутрішньою архітектурою за статичного, циклічного та динамічного навантаження. Окремо буде враховано crack-bridging механізми, посттріщинну поведінку цементної або бетонної матриці, міжфазну деградацію в системах полімер-цемент, армування-матриця та ремонтний шар-основа, а також втрату стійкості і хвилеутворення в гіперпружних метаматеріальних прошарках багатошарових дорожніх систем.</w:t>
       </w:r>
     </w:p>
     <w:p>
       <w:pPr/>
       <w:r>
-        <w:t>Очікуваними результатами є механіко-математичні моделі руйнування метаматеріально-орієнтованих інфраструктурних композитів, критерії ефективності внутрішніх архітектурних елементів як потенційних «пасток тріщин», чисельні карти руйнування для характерних архітектур, методики експериментальної ідентифікації параметрів тріщиностійкості та рекомендації щодо вибору геометричних, матеріальних і міжфазних параметрів композитів. Результати можуть бути використані при створенні тріщиностійких дорожніх систем, мостових настилів, ремонтних і захисних шарів, а також при подальшому розвитку механіки руйнування композитів з внутрішньою архітектурою.</w:t>
+        <w:t>Очікуваними результатами є механіко-математичні моделі руйнування та втрати стійкості метаматеріально-орієнтованих інфраструктурних композитів, критерії ефективності внутрішніх архітектурних елементів як потенційних «пасток тріщин», чисельні карти руйнування і втрати стійкості для характерних архітектур, методики експериментальної ідентифікації параметрів тріщиностійкості, а також методика прогнозування критичних біфуркаційних параметрів багатошарових композитів із гіперпружними метаматеріальними прошарками. Результати можуть бути використані при створенні тріщиностійких і формостабільних дорожніх систем, мостових настилів, ремонтних і захисних шарів, а також при подальшому розвитку механіки руйнування та стійкості композитів з внутрішньою архітектурою.</w:t>
       </w:r>
     </w:p>
     <w:p>
@@ -3618,9 +3592,8 @@
     </w:p>
     <w:p>
       <w:pPr/>
-      <w:r/>
-      <w:r>
-        <w:t>Метою роботи є розроблення механіко-математичних моделей, чисельних методик та критеріїв оцінювання руйнування метаматеріально-орієнтованих інфраструктурних композитів з акцентом на системи аеродромного та дорожнього покриття за статичного, циклічного та динамічного навантаження, з урахуванням впливу внутрішньої архітектури, міжфазної деградації, crack-bridging механізмів і взаємодії тріщин з архітектурними елементами матеріалу.</w:t>
+      <w:r>
+        <w:t>Метою роботи є розроблення механіко-математичних моделей, чисельних методик та критеріїв оцінювання руйнування і втрати стійкості метаматеріально-орієнтованих інфраструктурних композитів з акцентом на системи аеродромного та дорожнього покриття за статичного, циклічного та динамічного навантаження, з урахуванням впливу внутрішньої архітектури, міжфазної деградації, crack-bridging механізмів, взаємодії тріщин з архітектурними елементами матеріалу та критичних біфуркаційних станів багатошарових систем.</w:t>
       </w:r>
     </w:p>
     <w:p>
@@ -3674,13 +3647,19 @@
     <w:p>
       <w:pPr/>
       <w:r>
-        <w:t>8. Розробити підходи до експериментальної верифікації моделей із використанням випробувань на стиск, згин, непрямий розтяг та SCB-випробувань для визначення параметрів тріщиностійкості, енергопоглинання, посттріщинної поведінки та міжфазного руйнування.</w:t>
+        <w:t>8. Обґрунтувати раціональні геометричні та механічні параметри проміжних метаматеріальних прошарків у багатошарових системах аеродромного та дорожнього покриття для підвищення опору втраті стійкості при поздовжньому стиску.</w:t>
       </w:r>
     </w:p>
     <w:p>
       <w:pPr/>
       <w:r>
-        <w:t>9. Побудувати чисельні карти руйнування для вибраних типів метаматеріально-орієнтованих інфраструктурних композитів та сформулювати рекомендації щодо вибору геометричних, матеріальних і міжфазних параметрів, які забезпечують підвищений опір зародженню й поширенню тріщин.</w:t>
+        <w:t>9. Розробити підходи до експериментальної верифікації моделей із використанням випробувань на стиск, згин, непрямий розтяг та SCB-випробувань для визначення параметрів тріщиностійкості, енергопоглинання, посттріщинної поведінки, міжфазного руйнування та критичних станів деформування.</w:t>
+      </w:r>
+    </w:p>
+    <w:p>
+      <w:pPr/>
+      <w:r>
+        <w:t>10. Побудувати чисельні карти руйнування та втрати стійкості для вибраних типів метаматеріально-орієнтованих інфраструктурних композитів і сформулювати рекомендації щодо вибору геометричних, матеріальних і міжфазних параметрів, які забезпечують підвищений опір зародженню тріщин, їх поширенню та втраті формостабільності.</w:t>
       </w:r>
     </w:p>
     <w:p>
@@ -3754,13 +3733,8 @@
     </w:p>
     <w:p>
       <w:pPr/>
-      <w:r/>
-      <w:r/>
-      <w:r/>
-      <w:r/>
-      <w:r/>
-      <w:r>
-        <w:t>Водночас більшість наявних робіт зосереджена на демонстрації окремих ефектів: ауксетичної поведінки, хвильового гасіння, енергопоглинання, сенсорної функціональності, проникності або підвищення міцності. Значно менш розробленою залишається системна механіка руйнування таких матеріалів, особливо для аеродромних і дорожніх покриттів, мостових настилів, плитних елементів, захисних і ремонтних шарів, де саме зародження та розвиток тріщин часто визначають експлуатаційну надійність конструкції.</w:t>
+      <w:r>
+        <w:t>Водночас більшість наявних робіт зосереджена на демонстрації окремих ефектів: ауксетичної поведінки, хвильового гасіння, енергопоглинання, сенсорної функціональності, проникності або підвищення міцності. Значно менш розробленою залишається системна механіка руйнування та втрати стійкості таких матеріалів, особливо для аеродромних і дорожніх покриттів, мостових настилів, плитних елементів, захисних і ремонтних шарів, де зародження тріщин, міжфазне відшарування та втрата формостабільності часто визначають експлуатаційну надійність конструкції.</w:t>
       </w:r>
     </w:p>
     <w:p>
@@ -3784,13 +3758,19 @@
     <w:p>
       <w:pPr/>
       <w:r>
-        <w:t>Четвертою прогалиною є недостатньо розроблене моделювання міжфазного руйнування у гібридних бетонополімерних і цементополімерних метакомпозитах. Межі полімер-цемент, армування-матриця, включення-покриття-матриця або ремонтний шар-основа можуть бути зонами зародження пошкодження, відшарування та втрати зчеплення. Крім того, полімерні і полімер-композитні архітектурні елементи працюють у цементному, лужному, вологому та температурно змінному середовищі, що потребує врахування середовищно-індукованого пошкодження і довготривалої довговічності.</w:t>
+        <w:t>Четвертою прогалиною є недостатня розробленість моделей втрати стійкості багатошарових інфраструктурних композитів із гіперпружними метаматеріальними прошарками. Здатність проміжного шару до інтенсивного розсіювання енергії деформації може бути визначальним чинником для гасіння поздовжніх напружень і запобігання хвилеутворенню, однак критичні біфуркаційні параметри таких систем, їх залежність від геометрії прошарків, конститутивних співвідношень і стану міжфазного зчеплення залишаються недостатньо встановленими.</w:t>
       </w:r>
     </w:p>
     <w:p>
       <w:pPr/>
       <w:r>
-        <w:t>Отже, ключова наукова проблема полягає у відсутності цілісного fracture-mechanics підходу до аналізу та проєктування метаматеріально-орієнтованих інфраструктурних композитів. Запропонована робота спрямована на заповнення цієї прогалини шляхом розроблення моделей, які одночасно враховують внутрішню архітектуру, механізми зародження і поширення тріщин, посттріщинне деформування, міжфазну деградацію, динамічне навантаження та вплив експлуатаційного середовища.</w:t>
+        <w:t>П'ятою прогалиною є недостатньо розроблене моделювання міжфазного руйнування у гібридних бетонополімерних і цементополімерних метакомпозитах. Межі полімер-цемент, армування-матриця, включення-покриття-матриця або ремонтний шар-основа можуть бути зонами зародження пошкодження, відшарування, втрати зчеплення та локальної втрати стійкості. Крім того, полімерні і полімер-композитні архітектурні елементи працюють у цементному, лужному, вологому та температурно змінному середовищі, що потребує врахування середовищно-індукованого пошкодження і довготривалої довговічності.</w:t>
+      </w:r>
+    </w:p>
+    <w:p>
+      <w:pPr/>
+      <w:r>
+        <w:t>Отже, ключова наукова проблема полягає у відсутності цілісного підходу механіки руйнування та стійкості до аналізу й проєктування метаматеріально-орієнтованих інфраструктурних композитів. Запропонована робота спрямована на заповнення цієї прогалини шляхом розроблення моделей, які одночасно враховують внутрішню архітектуру, механізми зародження і поширення тріщин, посттріщинне деформування, міжфазну деградацію, динамічне навантаження, критичні стани втрати формостабільності та вплив експлуатаційного середовища.</w:t>
       </w:r>
     </w:p>
     <w:p>
@@ -3891,7 +3871,7 @@
     <w:p>
       <w:pPr/>
       <w:r>
-        <w:t>Авторський колектив має безпосередній науковий доробок у механіці руйнування неоднорідних, композитних і квазікрихких матеріалів, що є методичною основою для запропонованої теми. Найважливішими для цієї роботи є результати з когезійно-зонного моделювання, аналізу міжфазних тріщин, зон передруйнування, кiнкування тріщин і дебондингу в сендвічевих та стільникових композитних системах. Саме ці напрями безпосередньо пов'язані з моделюванням тріщиностійкості метаматеріально-орієнтованих інфраструктурних композитів, у яких внутрішня архітектура, міжфазні межі та локальні зони пошкодження визначають довговічність матеріалу.</w:t>
+        <w:t>Авторський колектив має безпосередній науковий доробок у механіці руйнування, стійкості, міжфазної деградації та моделюванні неоднорідних, композитних і квазікрихких матеріалів, що є методичною основою для запропонованої теми. Найважливішими для цієї роботи є результати з когезійно-зонного моделювання, аналізу міжфазних тріщин, зон передруйнування, кiнкування тріщин, дебондингу в сендвічевих системах, а також аналітичного прогнозування втрати стійкості гіперпружних шаруватих тіл із послабленими інтерфейсами.</w:t>
       </w:r>
     </w:p>
     <w:p>
@@ -3921,13 +3901,13 @@
     <w:p>
       <w:pPr/>
       <w:r>
-        <w:t>4. Xue P., Wei X., Li Z., Wang Y., Selivanov M. F., Xiong J. Mechanics of inner core debonding of composite sandwich beam with CFRP hexagonal honeycomb // International Journal of Solids and Structures. 2024. Vol. 293. 112760.</w:t>
+        <w:t>4. Bogdanov V.L., Nazarenko V.M., Kipnis A.L. Wrinkling-buckling interaction in a hyperelastic bilayer with interfacial delamination under compression: critical load analysis and comparison with approximate models // International Journal of Fracture. 2026. Vol. 250. Article 13.</w:t>
       </w:r>
     </w:p>
     <w:p>
       <w:pPr/>
       <w:r>
-        <w:t>5. Kaminsky A. A., Dudyk M. V., Chornoivan Y. O. An analytical solution for the interface crack in a quasi-brittle bonding material // Fatigue &amp; Fracture of Engineering Materials &amp; Structures. 2025. Vol. 48, No. 7. P. 2995-3006.</w:t>
+        <w:t>5. Kipnis A.L. Stability of a piecewise-homogeneous half-plane with sliding components under compression along an interface crack // Mechanics of Composite Materials. 2025. Vol. 61. P. 409-424.</w:t>
       </w:r>
     </w:p>
     <w:p>
@@ -3990,18 +3970,13 @@
     <w:p>
       <w:pPr/>
       <w:r>
-        <w:t>Виконання роботи передбачається у два взаємопов'язані етапи. Перший етап буде спрямований на формування теоретичної та чисельної основи дослідження: вибір характерних типів метаматеріально-орієнтованих інфраструктурних композитів, побудову базових скінченноелементних і когезійно-зонних моделей, визначення основних механізмів зародження та поширення тріщин у матеріалах з внутрішньою архітектурою. Другий етап буде присвячений розвитку моделей для статичного, циклічного та динамічного навантаження, урахуванню міжфазної деградації та середовищних чинників, чисельно-експериментальній верифікації результатів і формулюванню рекомендацій щодо створення тріщиностійких інфраструктурних композитів.</w:t>
+        <w:t>Виконання роботи передбачається у два взаємопов'язані етапи. Перший етап буде спрямований на формування теоретичної та чисельної основи дослідження: вибір характерних типів метаматеріально-орієнтованих інфраструктурних композитів, побудову базових скінченноелементних, когезійно-зонних та аналітичних моделей, визначення основних механізмів зародження тріщин і втрати стійкості у матеріалах з внутрішньою архітектурою. Другий етап буде присвячений розвитку моделей для статичного, циклічного та динамічного навантаження, урахуванню міжфазної деградації та середовищних чинників, чисельно-експериментальній верифікації результатів і формулюванню рекомендацій щодо створення тріщиностійких і формостабільних інфраструктурних композитів.</w:t>
       </w:r>
     </w:p>
     <w:p>
       <w:pPr/>
-      <w:r/>
-      <w:r/>
-      <w:r/>
-      <w:r/>
-      <w:r/>
-      <w:r>
-        <w:t>Етап 1 (2027 р.). Теоретико-чисельні моделі руйнування та вибір архітектур метаматеріально-орієнтованих композитів для аеродромних і дорожніх покриттів. На цьому етапі буде систематизовано сучасні підходи до створення метабетону, ауксетичних цементних і бетонних структур, бетонів із вбудованим архітектурним армуванням, багатофункціональних бетонополімерних систем та композитів з вираженими міжфазними межами. Для вибраних архітектур буде побудовано скінченноелементні моделі напружено-деформованого стану за статичного навантаження, а також базові когезійно-зонні моделі зародження тріщин, руйнування інтерфейсів і посттріщинної поведінки. Буде виконано параметричний аналіз впливу геометрії внутрішньої архітектури на локалізацію напружень, траєкторії тріщин і ефективність архітектурних «пасток тріщин».</w:t>
+      <w:r>
+        <w:t>Етап 1 (2027 р.). Теоретико-чисельні моделі руйнування, втрати стійкості та вибір архітектур метаматеріально-орієнтованих композитів для аеродромних і дорожніх покриттів. На цьому етапі буде систематизовано сучасні підходи до створення метабетону, ауксетичних цементних і бетонних структур, бетонів із вбудованим архітектурним армуванням, багатофункціональних бетонополімерних систем та композитів з вираженими міжфазними межами. Для вибраних архітектур буде побудовано скінченноелементні моделі напружено-деформованого стану за статичного навантаження, базові когезійно-зонні моделі зародження тріщин, руйнування інтерфейсів і посттріщинної поведінки, а також аналітичні моделі стійкості багатошарових систем із гіперпружними метаматеріальними прошарками. Буде виконано параметричний аналіз впливу геометрії внутрішньої архітектури на локалізацію напружень, траєкторії тріщин, критичні біфуркаційні параметри та ефективність архітектурних «пасток тріщин».</w:t>
       </w:r>
     </w:p>
     <w:p>
@@ -4149,19 +4124,14 @@
     </w:p>
     <w:p>
       <w:pPr/>
-      <w:r/>
-      <w:r/>
-      <w:r/>
-      <w:r/>
-      <w:r/>
-      <w:r>
-        <w:t>1. Актуальність та економічна значущість. Сучасна дорожня, транспортна та цивільна інфраструктура працює в умовах накопичення пошкоджень, де одним із головних чинників втрати працездатності є зародження та розвиток тріщин. Традиційні методи підвищення довговічності, орієнтовані переважно на зміну складу матеріалу, не забезпечують повного контролю над траєкторіями руйнування, міжфазним відшаруванням і динамічною відповіддю. Запропонований підхід дає змогу розглядати внутрішню архітектуру композиту як активний інструмент підвищення тріщиностійкості, що потенційно зменшує частоту ремонтів, подовжує строк служби аеродромних і дорожніх покриттів, мостових настилів і захисних шарів та підвищує надійність критичної інфраструктури.</w:t>
+      <w:r>
+        <w:t>1. Актуальність та економічна значущість. Сучасна дорожня, транспортна та цивільна інфраструктура працює в умовах накопичення пошкоджень, де головними чинниками втрати працездатності є зародження та розвиток тріщин, міжфазне відшарування і втрата стійкості верхніх шарів покриття за температурно-силових навантажень. Традиційні методи підвищення довговічності, орієнтовані переважно на зміну складу матеріалу, не забезпечують повного контролю над траєкторіями руйнування, критичними станами рівноваги, міжфазним відшаруванням і динамічною відповіддю. Запропонований підхід дає змогу розглядати внутрішню архітектуру композиту як активний інструмент підвищення тріщиностійкості та формостабільності, що потенційно зменшує частоту ремонтів, подовжує строк служби аеродромних і дорожніх покриттів, мостових настилів і захисних шарів та підвищує надійність критичної інфраструктури.</w:t>
       </w:r>
     </w:p>
     <w:p>
       <w:pPr/>
       <w:r>
-        <w:t>2. Технічна перевага та інноваційність. Робота поєднує архітектурне проєктування матеріалу з механікою руйнування. На відміну від підходів, у яких метабетон, ауксетичні цементні структури або бетон із 3D-друкованим армуванням розглядаються переважно через окремі ефекти жорсткості, енергопоглинання чи хвильового гасіння, у цій роботі пропонується цілісна система моделювання зародження, поширення, відхилення та зупинки тріщин. Вона включає когезійно-зонні моделі, критерії ефективності архітектурних «пасток тріщин», аналіз міжфазної деградації та оцінку впливу динамічної функціональності на локальні параметри руйнування.</w:t>
+        <w:t>2. Технічна перевага та інноваційність. Робота поєднує архітектурне проєктування матеріалу з механікою руйнування і стійкості. На відміну від підходів, у яких метабетон, ауксетичні цементні структури або бетон із 3D-друкованим армуванням розглядаються переважно через окремі ефекти жорсткості, енергопоглинання чи хвильового гасіння, у цій роботі пропонується цілісна система моделювання зародження, поширення, відхилення та зупинки тріщин, а також прогнозування критичних біфуркаційних параметрів багатошарових систем. Вона включає когезійно-зонні моделі, критерії ефективності архітектурних «пасток тріщин», аналіз міжфазної деградації, оцінку впливу динамічної функціональності на локальні параметри руйнування та вибір конститутивних співвідношень для визначення точок втрати стійкості.</w:t>
       </w:r>
     </w:p>
     <w:p>
@@ -4185,7 +4155,7 @@
     <w:p>
       <w:pPr/>
       <w:r>
-        <w:t>Висновок. Робота є технічно здійсненною завдяки наявній матеріально-технічній базі, досвіду авторського колективу та можливості поєднати чисельне моделювання з експериментальною верифікацією. Її реалізація створить науково обґрунтовану основу для проєктування тріщиностійких інфраструктурних композитів і матиме потенціал для підвищення експлуатаційної надійності критичної інфраструктури України.</w:t>
+        <w:t>Висновок. Робота є технічно здійсненною завдяки наявній матеріально-технічній базі, досвіду авторського колективу та можливості поєднати чисельне моделювання з експериментальною верифікацією. Її реалізація створить науково обґрунтовану основу для проєктування тріщиностійких і формостабільних інфраструктурних композитів і матиме потенціал для підвищення експлуатаційної надійності критичної інфраструктури України.</w:t>
       </w:r>
     </w:p>
     <w:p>
@@ -4613,127 +4583,8 @@
             <w:shd w:fill="auto" w:val="clear"/>
           </w:tcPr>
           <w:p>
-            <w:pPr>
-              <w:spacing w:line="252.00000000000003" w:lineRule="auto"/>
-              <w:rPr/>
-            </w:pPr>
-            <w:r>
-              <w:rPr>
-                <w:rtl w:val="0"/>
-              </w:rPr>
-            </w:r>
-            <w:r>
-              <w:t>Механіко-математичні моделі руйнування метаматеріально-орієнтованих інфраструктурних композитів; когезійно-зонні моделі міжфазної деградації; чисельні карти руйнування; критерії ефективності архітектурних «пасток тріщин»; рекомендації щодо вибору геометричних, матеріальних і міжфазних параметрів тріщиностійких композитів.</w:t>
-            </w:r>
-          </w:p>
-          <w:p>
-            <w:pPr>
-              <w:spacing w:line="252.00000000000003" w:lineRule="auto"/>
-              <w:rPr/>
-            </w:pPr>
-            <w:r>
-              <w:rPr>
-                <w:rtl w:val="0"/>
-              </w:rPr>
-            </w:r>
-          </w:p>
-          <w:p>
-            <w:pPr>
-              <w:spacing w:line="252.00000000000003" w:lineRule="auto"/>
-              <w:rPr/>
-            </w:pPr>
-            <w:r>
-              <w:rPr>
-                <w:rtl w:val="0"/>
-              </w:rPr>
-            </w:r>
-          </w:p>
-          <w:p>
-            <w:pPr>
-              <w:spacing w:line="252.00000000000003" w:lineRule="auto"/>
-              <w:rPr/>
-            </w:pPr>
-            <w:r>
-              <w:rPr>
-                <w:rtl w:val="0"/>
-              </w:rPr>
-            </w:r>
-          </w:p>
-          <w:p>
-            <w:pPr>
-              <w:spacing w:line="252.00000000000003" w:lineRule="auto"/>
-              <w:rPr/>
-            </w:pPr>
-            <w:r>
-              <w:rPr>
-                <w:rtl w:val="0"/>
-              </w:rPr>
-            </w:r>
-          </w:p>
-          <w:p>
-            <w:pPr>
-              <w:spacing w:line="252.00000000000003" w:lineRule="auto"/>
-              <w:rPr/>
-            </w:pPr>
-            <w:r>
-              <w:rPr>
-                <w:rtl w:val="0"/>
-              </w:rPr>
-            </w:r>
-          </w:p>
-          <w:p>
-            <w:pPr>
-              <w:spacing w:line="252.00000000000003" w:lineRule="auto"/>
-              <w:rPr/>
-            </w:pPr>
-            <w:r>
-              <w:rPr>
-                <w:rtl w:val="0"/>
-              </w:rPr>
-            </w:r>
-          </w:p>
-          <w:p>
-            <w:pPr>
-              <w:spacing w:line="252.00000000000003" w:lineRule="auto"/>
-              <w:rPr/>
-            </w:pPr>
-            <w:r>
-              <w:rPr>
-                <w:rtl w:val="0"/>
-              </w:rPr>
-            </w:r>
-          </w:p>
-          <w:p>
-            <w:pPr>
-              <w:spacing w:line="252.00000000000003" w:lineRule="auto"/>
-              <w:rPr/>
-            </w:pPr>
-            <w:r>
-              <w:rPr>
-                <w:rtl w:val="0"/>
-              </w:rPr>
-            </w:r>
-          </w:p>
-          <w:p>
-            <w:pPr>
-              <w:spacing w:line="252.00000000000003" w:lineRule="auto"/>
-              <w:rPr/>
-            </w:pPr>
-            <w:r>
-              <w:rPr>
-                <w:rtl w:val="0"/>
-              </w:rPr>
-            </w:r>
-          </w:p>
-          <w:p>
-            <w:pPr>
-              <w:spacing w:line="252.00000000000003" w:lineRule="auto"/>
-              <w:rPr/>
-            </w:pPr>
-            <w:r>
-              <w:rPr>
-                <w:rtl w:val="0"/>
-              </w:rPr>
+            <w:r>
+              <w:t>Механіко-математичні моделі руйнування та втрати стійкості метаматеріально-орієнтованих інфраструктурних композитів; когезійно-зонні моделі міжфазної деградації; чисельні карти руйнування і втрати стійкості; критерії ефективності архітектурних «пасток тріщин»; методика визначення критичних параметрів біфуркації; рекомендації щодо вибору геометричних, матеріальних і міжфазних параметрів композитів.</w:t>
             </w:r>
           </w:p>
         </w:tc>
@@ -4773,22 +4624,8 @@
             <w:shd w:fill="auto" w:val="clear"/>
           </w:tcPr>
           <w:p>
-            <w:pPr>
-              <w:spacing w:line="252.00000000000003" w:lineRule="auto"/>
-              <w:rPr>
-                <w:b w:val="1"/>
-                <w:bCs w:val="1"/>
-                <w:i w:val="1"/>
-                <w:iCs w:val="1"/>
-              </w:rPr>
-            </w:pPr>
-            <w:r>
-              <w:rPr>
-                <w:rtl w:val="0"/>
-              </w:rPr>
-            </w:r>
-            <w:r>
-              <w:t>Використання у наукових звітах, методиках розрахунку, рекомендаціях щодо проєктування тріщиностійких інфраструктурних композитів, підготовці публікацій, доповідей, навчально-методичних матеріалів та пропозицій для подальших прикладних і експериментальних робіт.</w:t>
+            <w:r>
+              <w:t>Використання у наукових звітах, методиках розрахунку, рекомендаціях щодо проєктування тріщиностійких і формостабільних інфраструктурних композитів, підготовці публікацій, доповідей, навчально-методичних матеріалів та пропозицій для подальших прикладних і експериментальних робіт.</w:t>
             </w:r>
           </w:p>
         </w:tc>
@@ -5524,62 +5361,8 @@
             <w:shd w:fill="auto" w:val="clear"/>
           </w:tcPr>
           <w:p>
-            <w:pPr>
-              <w:keepNext w:val="0"/>
-              <w:keepLines w:val="0"/>
-              <w:pageBreakBefore w:val="0"/>
-              <w:widowControl w:val="0"/>
-              <w:pBdr>
-                <w:top w:space="0" w:sz="0" w:val="nil"/>
-                <w:left w:space="0" w:sz="0" w:val="nil"/>
-                <w:bottom w:space="0" w:sz="0" w:val="nil"/>
-                <w:right w:space="0" w:sz="0" w:val="nil"/>
-                <w:between w:space="0" w:sz="0" w:val="nil"/>
-              </w:pBdr>
-              <w:shd w:fill="auto" w:val="clear"/>
-              <w:tabs>
-                <w:tab w:val="center" w:leader="none" w:pos="4677"/>
-                <w:tab w:val="right" w:leader="none" w:pos="9355"/>
-              </w:tabs>
-              <w:spacing w:after="0" w:before="0" w:line="252.00000000000003" w:lineRule="auto"/>
-              <w:ind w:left="0" w:right="0" w:firstLine="0"/>
-              <w:jc w:val="center"/>
-              <w:rPr>
-                <w:rFonts w:ascii="Times New Roman" w:cs="Times New Roman" w:eastAsia="Times New Roman" w:hAnsi="Times New Roman"/>
-                <w:b w:val="0"/>
-                <w:bCs w:val="0"/>
-                <w:i w:val="0"/>
-                <w:iCs w:val="0"/>
-                <w:smallCaps w:val="0"/>
-                <w:strike w:val="0"/>
-                <w:color w:val="000000"/>
-                <w:sz w:val="24"/>
-                <w:szCs w:val="24"/>
-                <w:u w:val="none"/>
-                <w:shd w:fill="auto" w:val="clear"/>
-                <w:vertAlign w:val="baseline"/>
-              </w:rPr>
-            </w:pPr>
-            <w:r>
-              <w:rPr>
-                <w:rFonts w:ascii="Times New Roman" w:cs="Times New Roman" w:eastAsia="Times New Roman" w:hAnsi="Times New Roman"/>
-                <w:b w:val="0"/>
-                <w:bCs w:val="0"/>
-                <w:i w:val="0"/>
-                <w:iCs w:val="0"/>
-                <w:smallCaps w:val="0"/>
-                <w:strike w:val="0"/>
-                <w:color w:val="000000"/>
-                <w:sz w:val="24"/>
-                <w:szCs w:val="24"/>
-                <w:u w:val="none"/>
-                <w:shd w:fill="auto" w:val="clear"/>
-                <w:vertAlign w:val="baseline"/>
-                <w:rtl w:val="0"/>
-              </w:rPr>
-            </w:r>
-            <w:r>
-              <w:t>Моделі, алгоритми та рекомендації з оцінювання тріщиностійкості метаматеріально-орієнтованих інфраструктурних композитів; чисельні карти руйнування; методики визначення параметрів міжфазної деградації та посттріщинної поведінки.</w:t>
+            <w:r>
+              <w:t>Моделі, алгоритми та рекомендації з оцінювання тріщиностійкості і втрати стійкості метаматеріально-орієнтованих інфраструктурних композитів; чисельні карти руйнування; методики визначення параметрів міжфазної деградації, посттріщинної поведінки та критичних біфуркаційних станів.</w:t>
             </w:r>
           </w:p>
         </w:tc>
@@ -5594,67 +5377,8 @@
             <w:shd w:fill="auto" w:val="clear"/>
           </w:tcPr>
           <w:p>
-            <w:pPr>
-              <w:keepNext w:val="0"/>
-              <w:keepLines w:val="0"/>
-              <w:pageBreakBefore w:val="0"/>
-              <w:widowControl w:val="0"/>
-              <w:pBdr>
-                <w:top w:space="0" w:sz="0" w:val="nil"/>
-                <w:left w:space="0" w:sz="0" w:val="nil"/>
-                <w:bottom w:space="0" w:sz="0" w:val="nil"/>
-                <w:right w:space="0" w:sz="0" w:val="nil"/>
-                <w:between w:space="0" w:sz="0" w:val="nil"/>
-              </w:pBdr>
-              <w:shd w:fill="auto" w:val="clear"/>
-              <w:tabs>
-                <w:tab w:val="center" w:leader="none" w:pos="4677"/>
-                <w:tab w:val="right" w:leader="none" w:pos="9355"/>
-              </w:tabs>
-              <w:spacing w:after="0" w:before="0" w:line="252.00000000000003" w:lineRule="auto"/>
-              <w:ind w:left="0" w:right="0" w:firstLine="0"/>
-              <w:jc w:val="center"/>
-              <w:rPr>
-                <w:rFonts w:ascii="Times New Roman" w:cs="Times New Roman" w:eastAsia="Times New Roman" w:hAnsi="Times New Roman"/>
-                <w:b w:val="0"/>
-                <w:bCs w:val="0"/>
-                <w:i w:val="0"/>
-                <w:iCs w:val="0"/>
-                <w:smallCaps w:val="0"/>
-                <w:strike w:val="0"/>
-                <w:color w:val="000000"/>
-                <w:sz w:val="24"/>
-                <w:szCs w:val="24"/>
-                <w:u w:val="none"/>
-                <w:shd w:fill="auto" w:val="clear"/>
-                <w:vertAlign w:val="baseline"/>
-              </w:rPr>
-            </w:pPr>
-            <w:r>
-              <w:rPr>
-                <w:rFonts w:ascii="Times New Roman" w:cs="Times New Roman" w:eastAsia="Times New Roman" w:hAnsi="Times New Roman"/>
-                <w:b w:val="0"/>
-                <w:bCs w:val="0"/>
-                <w:i w:val="0"/>
-                <w:iCs w:val="0"/>
-                <w:smallCaps w:val="0"/>
-                <w:strike w:val="0"/>
-                <w:color w:val="000000"/>
-                <w:sz w:val="24"/>
-                <w:szCs w:val="24"/>
-                <w:u w:val="none"/>
-                <w:shd w:fill="auto" w:val="clear"/>
-                <w:vertAlign w:val="baseline"/>
-                <w:rtl w:val="0"/>
-              </w:rPr>
-            </w:r>
-            <w:r/>
-            <w:r/>
-            <w:r/>
-            <w:r/>
-            <w:r/>
-            <w:r>
-              <w:t>Використання під час попереднього проєктування, порівняльного аналізу архітектурних рішень, оцінювання ресурсу і довговічності аеродромних і дорожніх покриттів, мостових настилів, ремонтних та захисних шарів.</w:t>
+            <w:r>
+              <w:t>Використання під час попереднього проєктування, порівняльного аналізу архітектурних рішень, оцінювання ресурсу, довговічності та формостабільності аеродромних і дорожніх покриттів, мостових настилів, ремонтних та захисних шарів.</w:t>
             </w:r>
           </w:p>
         </w:tc>
@@ -9069,7 +8793,7 @@
     <w:p>
       <w:pPr/>
       <w:r>
-        <w:t>розроблення механіко-математичних моделей, чисельних методик та критеріїв оцінювання руйнування метаматеріально-орієнтованих інфраструктурних композитів з урахуванням внутрішньої архітектури, міжфазної деградації та дії статичного, циклічного і динамічного навантаження.</w:t>
+        <w:t>розроблення механіко-математичних моделей, чисельних методик та критеріїв оцінювання руйнування і втрати стійкості метаматеріально-орієнтованих інфраструктурних композитів з урахуванням внутрішньої архітектури, міжфазної деградації, критичних біфуркаційних станів та дії статичного, циклічного і динамічного навантаження.</w:t>
       </w:r>
     </w:p>
     <w:p>
@@ -9656,8 +9380,123 @@
             <w:vAlign w:val="center"/>
           </w:tcPr>
           <w:p>
+            <w:r>
+              <w:t>Теоретико-чисельні моделі руйнування, втрати стійкості та вибір архітектур метаматеріально-орієнтованих композитів для аеродромних і дорожніх покриттів</w:t>
+            </w:r>
+          </w:p>
+        </w:tc>
+        <w:tc>
+          <w:tcPr>
+            <w:tcBorders>
+              <w:top w:color="000000" w:space="0" w:sz="4" w:val="single"/>
+              <w:left w:color="000000" w:space="0" w:sz="4" w:val="single"/>
+              <w:bottom w:color="000000" w:space="0" w:sz="4" w:val="single"/>
+              <w:right w:color="000000" w:space="0" w:sz="4" w:val="single"/>
+            </w:tcBorders>
+            <w:shd w:fill="auto" w:val="clear"/>
+            <w:vAlign w:val="center"/>
+          </w:tcPr>
+          <w:p>
             <w:pPr>
               <w:keepNext w:val="1"/>
+              <w:widowControl w:val="0"/>
+              <w:spacing w:line="288" w:lineRule="auto"/>
+              <w:jc w:val="center"/>
+              <w:rPr/>
+            </w:pPr>
+            <w:r>
+              <w:rPr>
+                <w:rtl w:val="0"/>
+              </w:rPr>
+            </w:r>
+            <w:r/>
+            <w:r/>
+            <w:r>
+              <w:t>01 січня 2027 р. - 31 грудня 2027 р.</w:t>
+            </w:r>
+          </w:p>
+        </w:tc>
+        <w:tc>
+          <w:tcPr>
+            <w:tcBorders>
+              <w:top w:color="000000" w:space="0" w:sz="4" w:val="single"/>
+              <w:left w:color="000000" w:space="0" w:sz="4" w:val="single"/>
+              <w:bottom w:color="000000" w:space="0" w:sz="4" w:val="single"/>
+              <w:right w:color="000000" w:space="0" w:sz="4" w:val="single"/>
+            </w:tcBorders>
+            <w:shd w:fill="auto" w:val="clear"/>
+            <w:vAlign w:val="center"/>
+          </w:tcPr>
+          <w:p>
+            <w:pPr>
+              <w:keepNext w:val="1"/>
+              <w:widowControl w:val="0"/>
+              <w:spacing w:line="288" w:lineRule="auto"/>
+              <w:jc w:val="center"/>
+              <w:rPr/>
+            </w:pPr>
+            <w:r>
+              <w:rPr>
+                <w:rtl w:val="0"/>
+              </w:rPr>
+            </w:r>
+            <w:r/>
+            <w:r/>
+            <w:r>
+              <w:t>д.ф.-м.н., чл.-кор. НАН України М.Ф. Селіванов</w:t>
+            </w:r>
+          </w:p>
+        </w:tc>
+      </w:tr>
+      <w:tr>
+        <w:trPr>
+          <w:cantSplit w:val="0"/>
+          <w:tblHeader w:val="0"/>
+        </w:trPr>
+        <w:tc>
+          <w:tcPr>
+            <w:tcBorders>
+              <w:top w:color="000000" w:space="0" w:sz="4" w:val="single"/>
+              <w:left w:color="000000" w:space="0" w:sz="4" w:val="single"/>
+              <w:bottom w:color="000000" w:space="0" w:sz="4" w:val="single"/>
+              <w:right w:color="000000" w:space="0" w:sz="4" w:val="single"/>
+            </w:tcBorders>
+            <w:shd w:fill="auto" w:val="clear"/>
+            <w:vAlign w:val="center"/>
+          </w:tcPr>
+          <w:p>
+            <w:pPr>
+              <w:widowControl w:val="0"/>
+              <w:spacing w:line="288" w:lineRule="auto"/>
+              <w:jc w:val="center"/>
+              <w:rPr/>
+            </w:pPr>
+            <w:r>
+              <w:rPr>
+                <w:rtl w:val="0"/>
+              </w:rPr>
+            </w:r>
+            <w:r/>
+            <w:r/>
+            <w:r>
+              <w:t>2</w:t>
+            </w:r>
+          </w:p>
+        </w:tc>
+        <w:tc>
+          <w:tcPr>
+            <w:tcBorders>
+              <w:top w:color="000000" w:space="0" w:sz="4" w:val="single"/>
+              <w:left w:color="000000" w:space="0" w:sz="4" w:val="single"/>
+              <w:bottom w:color="000000" w:space="0" w:sz="4" w:val="single"/>
+              <w:right w:color="000000" w:space="0" w:sz="4" w:val="single"/>
+            </w:tcBorders>
+            <w:shd w:fill="auto" w:val="clear"/>
+            <w:vAlign w:val="center"/>
+          </w:tcPr>
+          <w:p>
+            <w:pPr>
+              <w:keepNext w:val="0"/>
               <w:keepLines w:val="0"/>
               <w:pageBreakBefore w:val="0"/>
               <w:widowControl w:val="0"/>
@@ -9695,10 +9534,8 @@
             </w:r>
             <w:r/>
             <w:r/>
-            <w:r/>
-            <w:r/>
-            <w:r>
-              <w:t>Теоретико-чисельні моделі руйнування та вибір архітектур метаматеріально-орієнтованих композитів для аеродромних і дорожніх покриттів</w:t>
+            <w:r>
+              <w:t>Динамічне, міжфазне та експериментально верифіковане моделювання тріщиностійкості інфраструктурних метакомпозитів</w:t>
             </w:r>
           </w:p>
         </w:tc>
@@ -9715,7 +9552,6 @@
           </w:tcPr>
           <w:p>
             <w:pPr>
-              <w:keepNext w:val="1"/>
               <w:widowControl w:val="0"/>
               <w:spacing w:line="288" w:lineRule="auto"/>
               <w:jc w:val="center"/>
@@ -9729,7 +9565,7 @@
             <w:r/>
             <w:r/>
             <w:r>
-              <w:t>01 січня 2027 р. - 31 грудня 2027 р.</w:t>
+              <w:t>01 січня 2028 р. - 31 грудня 2028 р.</w:t>
             </w:r>
           </w:p>
         </w:tc>
@@ -9746,7 +9582,6 @@
           </w:tcPr>
           <w:p>
             <w:pPr>
-              <w:keepNext w:val="1"/>
               <w:widowControl w:val="0"/>
               <w:spacing w:line="288" w:lineRule="auto"/>
               <w:jc w:val="center"/>
@@ -9792,11 +9627,6 @@
               <w:rPr>
                 <w:rtl w:val="0"/>
               </w:rPr>
-            </w:r>
-            <w:r/>
-            <w:r/>
-            <w:r>
-              <w:t>2</w:t>
             </w:r>
           </w:p>
         </w:tc>
@@ -9849,11 +9679,6 @@
                 <w:rtl w:val="0"/>
               </w:rPr>
             </w:r>
-            <w:r/>
-            <w:r/>
-            <w:r>
-              <w:t>Динамічне, міжфазне та експериментально верифіковане моделювання тріщиностійкості інфраструктурних метакомпозитів</w:t>
-            </w:r>
           </w:p>
         </w:tc>
         <w:tc>
@@ -9879,11 +9704,6 @@
                 <w:rtl w:val="0"/>
               </w:rPr>
             </w:r>
-            <w:r/>
-            <w:r/>
-            <w:r>
-              <w:t>01 січня 2028 р. - 31 грудня 2028 р.</w:t>
-            </w:r>
           </w:p>
         </w:tc>
         <w:tc>
@@ -9908,11 +9728,6 @@
               <w:rPr>
                 <w:rtl w:val="0"/>
               </w:rPr>
-            </w:r>
-            <w:r/>
-            <w:r/>
-            <w:r>
-              <w:t>д.ф.-м.н., чл.-кор. НАН України М.Ф. Селіванов</w:t>
             </w:r>
           </w:p>
         </w:tc>
@@ -10067,6 +9882,7 @@
           </w:tcPr>
           <w:p>
             <w:pPr>
+              <w:keepNext w:val="1"/>
               <w:widowControl w:val="0"/>
               <w:spacing w:line="288" w:lineRule="auto"/>
               <w:jc w:val="center"/>
@@ -10092,7 +9908,117 @@
           </w:tcPr>
           <w:p>
             <w:pPr>
-              <w:keepNext w:val="0"/>
+              <w:keepNext w:val="1"/>
+              <w:widowControl w:val="0"/>
+              <w:spacing w:line="288" w:lineRule="auto"/>
+              <w:jc w:val="center"/>
+              <w:rPr/>
+            </w:pPr>
+            <w:r>
+              <w:rPr>
+                <w:rtl w:val="0"/>
+              </w:rPr>
+            </w:r>
+          </w:p>
+        </w:tc>
+        <w:tc>
+          <w:tcPr>
+            <w:tcBorders>
+              <w:top w:color="000000" w:space="0" w:sz="4" w:val="single"/>
+              <w:left w:color="000000" w:space="0" w:sz="4" w:val="single"/>
+              <w:bottom w:color="000000" w:space="0" w:sz="4" w:val="single"/>
+              <w:right w:color="000000" w:space="0" w:sz="4" w:val="single"/>
+            </w:tcBorders>
+            <w:shd w:fill="auto" w:val="clear"/>
+            <w:vAlign w:val="center"/>
+          </w:tcPr>
+          <w:p>
+            <w:pPr>
+              <w:keepNext w:val="1"/>
+              <w:widowControl w:val="0"/>
+              <w:spacing w:line="288" w:lineRule="auto"/>
+              <w:jc w:val="center"/>
+              <w:rPr/>
+            </w:pPr>
+            <w:r>
+              <w:rPr>
+                <w:rtl w:val="0"/>
+              </w:rPr>
+            </w:r>
+          </w:p>
+        </w:tc>
+        <w:tc>
+          <w:tcPr>
+            <w:tcBorders>
+              <w:top w:color="000000" w:space="0" w:sz="4" w:val="single"/>
+              <w:left w:color="000000" w:space="0" w:sz="4" w:val="single"/>
+              <w:bottom w:color="000000" w:space="0" w:sz="4" w:val="single"/>
+              <w:right w:color="000000" w:space="0" w:sz="4" w:val="single"/>
+            </w:tcBorders>
+            <w:shd w:fill="auto" w:val="clear"/>
+            <w:vAlign w:val="center"/>
+          </w:tcPr>
+          <w:p>
+            <w:pPr>
+              <w:keepNext w:val="1"/>
+              <w:widowControl w:val="0"/>
+              <w:spacing w:line="288" w:lineRule="auto"/>
+              <w:jc w:val="center"/>
+              <w:rPr/>
+            </w:pPr>
+            <w:r>
+              <w:rPr>
+                <w:rtl w:val="0"/>
+              </w:rPr>
+            </w:r>
+          </w:p>
+        </w:tc>
+      </w:tr>
+      <w:tr>
+        <w:trPr>
+          <w:cantSplit w:val="0"/>
+          <w:tblHeader w:val="0"/>
+        </w:trPr>
+        <w:tc>
+          <w:tcPr>
+            <w:tcBorders>
+              <w:top w:color="000000" w:space="0" w:sz="4" w:val="single"/>
+              <w:left w:color="000000" w:space="0" w:sz="4" w:val="single"/>
+              <w:bottom w:color="000000" w:space="0" w:sz="4" w:val="single"/>
+              <w:right w:color="000000" w:space="0" w:sz="4" w:val="single"/>
+            </w:tcBorders>
+            <w:shd w:fill="auto" w:val="clear"/>
+            <w:vAlign w:val="center"/>
+          </w:tcPr>
+          <w:p>
+            <w:pPr>
+              <w:keepNext w:val="1"/>
+              <w:widowControl w:val="0"/>
+              <w:spacing w:line="288" w:lineRule="auto"/>
+              <w:jc w:val="center"/>
+              <w:rPr/>
+            </w:pPr>
+            <w:r>
+              <w:rPr>
+                <w:rtl w:val="0"/>
+              </w:rPr>
+            </w:r>
+          </w:p>
+        </w:tc>
+        <w:tc>
+          <w:tcPr>
+            <w:tcBorders>
+              <w:top w:color="000000" w:space="0" w:sz="4" w:val="single"/>
+              <w:left w:color="000000" w:space="0" w:sz="4" w:val="single"/>
+              <w:bottom w:color="000000" w:space="0" w:sz="4" w:val="single"/>
+              <w:right w:color="000000" w:space="0" w:sz="4" w:val="single"/>
+            </w:tcBorders>
+            <w:shd w:fill="auto" w:val="clear"/>
+            <w:vAlign w:val="center"/>
+          </w:tcPr>
+          <w:p>
+            <w:pPr>
+              <w:keepNext w:val="1"/>
               <w:keepLines w:val="0"/>
               <w:pageBreakBefore w:val="0"/>
               <w:widowControl w:val="0"/>
@@ -10143,6 +10069,7 @@
           </w:tcPr>
           <w:p>
             <w:pPr>
+              <w:keepNext w:val="1"/>
               <w:widowControl w:val="0"/>
               <w:spacing w:line="288" w:lineRule="auto"/>
               <w:jc w:val="center"/>
@@ -10168,6 +10095,7 @@
           </w:tcPr>
           <w:p>
             <w:pPr>
+              <w:keepNext w:val="1"/>
               <w:widowControl w:val="0"/>
               <w:spacing w:line="288" w:lineRule="auto"/>
               <w:jc w:val="center"/>
@@ -10199,7 +10127,6 @@
           </w:tcPr>
           <w:p>
             <w:pPr>
-              <w:keepNext w:val="1"/>
               <w:widowControl w:val="0"/>
               <w:spacing w:line="288" w:lineRule="auto"/>
               <w:jc w:val="center"/>
@@ -10225,117 +10152,7 @@
           </w:tcPr>
           <w:p>
             <w:pPr>
-              <w:keepNext w:val="1"/>
-              <w:widowControl w:val="0"/>
-              <w:spacing w:line="288" w:lineRule="auto"/>
-              <w:jc w:val="center"/>
-              <w:rPr/>
-            </w:pPr>
-            <w:r>
-              <w:rPr>
-                <w:rtl w:val="0"/>
-              </w:rPr>
-            </w:r>
-          </w:p>
-        </w:tc>
-        <w:tc>
-          <w:tcPr>
-            <w:tcBorders>
-              <w:top w:color="000000" w:space="0" w:sz="4" w:val="single"/>
-              <w:left w:color="000000" w:space="0" w:sz="4" w:val="single"/>
-              <w:bottom w:color="000000" w:space="0" w:sz="4" w:val="single"/>
-              <w:right w:color="000000" w:space="0" w:sz="4" w:val="single"/>
-            </w:tcBorders>
-            <w:shd w:fill="auto" w:val="clear"/>
-            <w:vAlign w:val="center"/>
-          </w:tcPr>
-          <w:p>
-            <w:pPr>
-              <w:keepNext w:val="1"/>
-              <w:widowControl w:val="0"/>
-              <w:spacing w:line="288" w:lineRule="auto"/>
-              <w:jc w:val="center"/>
-              <w:rPr/>
-            </w:pPr>
-            <w:r>
-              <w:rPr>
-                <w:rtl w:val="0"/>
-              </w:rPr>
-            </w:r>
-          </w:p>
-        </w:tc>
-        <w:tc>
-          <w:tcPr>
-            <w:tcBorders>
-              <w:top w:color="000000" w:space="0" w:sz="4" w:val="single"/>
-              <w:left w:color="000000" w:space="0" w:sz="4" w:val="single"/>
-              <w:bottom w:color="000000" w:space="0" w:sz="4" w:val="single"/>
-              <w:right w:color="000000" w:space="0" w:sz="4" w:val="single"/>
-            </w:tcBorders>
-            <w:shd w:fill="auto" w:val="clear"/>
-            <w:vAlign w:val="center"/>
-          </w:tcPr>
-          <w:p>
-            <w:pPr>
-              <w:keepNext w:val="1"/>
-              <w:widowControl w:val="0"/>
-              <w:spacing w:line="288" w:lineRule="auto"/>
-              <w:jc w:val="center"/>
-              <w:rPr/>
-            </w:pPr>
-            <w:r>
-              <w:rPr>
-                <w:rtl w:val="0"/>
-              </w:rPr>
-            </w:r>
-          </w:p>
-        </w:tc>
-      </w:tr>
-      <w:tr>
-        <w:trPr>
-          <w:cantSplit w:val="0"/>
-          <w:tblHeader w:val="0"/>
-        </w:trPr>
-        <w:tc>
-          <w:tcPr>
-            <w:tcBorders>
-              <w:top w:color="000000" w:space="0" w:sz="4" w:val="single"/>
-              <w:left w:color="000000" w:space="0" w:sz="4" w:val="single"/>
-              <w:bottom w:color="000000" w:space="0" w:sz="4" w:val="single"/>
-              <w:right w:color="000000" w:space="0" w:sz="4" w:val="single"/>
-            </w:tcBorders>
-            <w:shd w:fill="auto" w:val="clear"/>
-            <w:vAlign w:val="center"/>
-          </w:tcPr>
-          <w:p>
-            <w:pPr>
-              <w:keepNext w:val="1"/>
-              <w:widowControl w:val="0"/>
-              <w:spacing w:line="288" w:lineRule="auto"/>
-              <w:jc w:val="center"/>
-              <w:rPr/>
-            </w:pPr>
-            <w:r>
-              <w:rPr>
-                <w:rtl w:val="0"/>
-              </w:rPr>
-            </w:r>
-          </w:p>
-        </w:tc>
-        <w:tc>
-          <w:tcPr>
-            <w:tcBorders>
-              <w:top w:color="000000" w:space="0" w:sz="4" w:val="single"/>
-              <w:left w:color="000000" w:space="0" w:sz="4" w:val="single"/>
-              <w:bottom w:color="000000" w:space="0" w:sz="4" w:val="single"/>
-              <w:right w:color="000000" w:space="0" w:sz="4" w:val="single"/>
-            </w:tcBorders>
-            <w:shd w:fill="auto" w:val="clear"/>
-            <w:vAlign w:val="center"/>
-          </w:tcPr>
-          <w:p>
-            <w:pPr>
-              <w:keepNext w:val="1"/>
+              <w:keepNext w:val="0"/>
               <w:keepLines w:val="0"/>
               <w:pageBreakBefore w:val="0"/>
               <w:widowControl w:val="0"/>
@@ -10386,7 +10203,6 @@
           </w:tcPr>
           <w:p>
             <w:pPr>
-              <w:keepNext w:val="1"/>
               <w:widowControl w:val="0"/>
               <w:spacing w:line="288" w:lineRule="auto"/>
               <w:jc w:val="center"/>
@@ -10412,7 +10228,6 @@
           </w:tcPr>
           <w:p>
             <w:pPr>
-              <w:keepNext w:val="1"/>
               <w:widowControl w:val="0"/>
               <w:spacing w:line="288" w:lineRule="auto"/>
               <w:jc w:val="center"/>
@@ -10690,138 +10505,6 @@
           </w:p>
         </w:tc>
       </w:tr>
-      <w:tr>
-        <w:trPr>
-          <w:cantSplit w:val="0"/>
-          <w:tblHeader w:val="0"/>
-        </w:trPr>
-        <w:tc>
-          <w:tcPr>
-            <w:tcBorders>
-              <w:top w:color="000000" w:space="0" w:sz="4" w:val="single"/>
-              <w:left w:color="000000" w:space="0" w:sz="4" w:val="single"/>
-              <w:bottom w:color="000000" w:space="0" w:sz="4" w:val="single"/>
-              <w:right w:color="000000" w:space="0" w:sz="4" w:val="single"/>
-            </w:tcBorders>
-            <w:shd w:fill="auto" w:val="clear"/>
-            <w:vAlign w:val="center"/>
-          </w:tcPr>
-          <w:p>
-            <w:pPr>
-              <w:widowControl w:val="0"/>
-              <w:spacing w:line="288" w:lineRule="auto"/>
-              <w:jc w:val="center"/>
-              <w:rPr/>
-            </w:pPr>
-            <w:r>
-              <w:rPr>
-                <w:rtl w:val="0"/>
-              </w:rPr>
-            </w:r>
-          </w:p>
-        </w:tc>
-        <w:tc>
-          <w:tcPr>
-            <w:tcBorders>
-              <w:top w:color="000000" w:space="0" w:sz="4" w:val="single"/>
-              <w:left w:color="000000" w:space="0" w:sz="4" w:val="single"/>
-              <w:bottom w:color="000000" w:space="0" w:sz="4" w:val="single"/>
-              <w:right w:color="000000" w:space="0" w:sz="4" w:val="single"/>
-            </w:tcBorders>
-            <w:shd w:fill="auto" w:val="clear"/>
-            <w:vAlign w:val="center"/>
-          </w:tcPr>
-          <w:p>
-            <w:pPr>
-              <w:keepNext w:val="0"/>
-              <w:keepLines w:val="0"/>
-              <w:pageBreakBefore w:val="0"/>
-              <w:widowControl w:val="0"/>
-              <w:pBdr>
-                <w:top w:space="0" w:sz="0" w:val="nil"/>
-                <w:left w:space="0" w:sz="0" w:val="nil"/>
-                <w:bottom w:space="0" w:sz="0" w:val="nil"/>
-                <w:right w:space="0" w:sz="0" w:val="nil"/>
-                <w:between w:space="0" w:sz="0" w:val="nil"/>
-              </w:pBdr>
-              <w:shd w:fill="auto" w:val="clear"/>
-              <w:spacing w:after="0" w:before="280" w:line="288" w:lineRule="auto"/>
-              <w:ind w:left="57" w:right="57" w:firstLine="0"/>
-              <w:jc w:val="both"/>
-              <w:rPr>
-                <w:rFonts w:ascii="Times New Roman" w:cs="Times New Roman" w:eastAsia="Times New Roman" w:hAnsi="Times New Roman"/>
-                <w:b w:val="0"/>
-                <w:bCs w:val="0"/>
-                <w:i w:val="0"/>
-                <w:iCs w:val="0"/>
-                <w:smallCaps w:val="0"/>
-                <w:strike w:val="0"/>
-                <w:color w:val="000000"/>
-                <w:sz w:val="24"/>
-                <w:szCs w:val="24"/>
-                <w:u w:val="none"/>
-                <w:shd w:fill="auto" w:val="clear"/>
-                <w:vertAlign w:val="baseline"/>
-              </w:rPr>
-            </w:pPr>
-            <w:r>
-              <w:rPr>
-                <w:rtl w:val="0"/>
-              </w:rPr>
-            </w:r>
-          </w:p>
-        </w:tc>
-        <w:tc>
-          <w:tcPr>
-            <w:tcBorders>
-              <w:top w:color="000000" w:space="0" w:sz="4" w:val="single"/>
-              <w:left w:color="000000" w:space="0" w:sz="4" w:val="single"/>
-              <w:bottom w:color="000000" w:space="0" w:sz="4" w:val="single"/>
-              <w:right w:color="000000" w:space="0" w:sz="4" w:val="single"/>
-            </w:tcBorders>
-            <w:shd w:fill="auto" w:val="clear"/>
-            <w:vAlign w:val="center"/>
-          </w:tcPr>
-          <w:p>
-            <w:pPr>
-              <w:widowControl w:val="0"/>
-              <w:spacing w:line="288" w:lineRule="auto"/>
-              <w:jc w:val="center"/>
-              <w:rPr/>
-            </w:pPr>
-            <w:r>
-              <w:rPr>
-                <w:rtl w:val="0"/>
-              </w:rPr>
-            </w:r>
-          </w:p>
-        </w:tc>
-        <w:tc>
-          <w:tcPr>
-            <w:tcBorders>
-              <w:top w:color="000000" w:space="0" w:sz="4" w:val="single"/>
-              <w:left w:color="000000" w:space="0" w:sz="4" w:val="single"/>
-              <w:bottom w:color="000000" w:space="0" w:sz="4" w:val="single"/>
-              <w:right w:color="000000" w:space="0" w:sz="4" w:val="single"/>
-            </w:tcBorders>
-            <w:shd w:fill="auto" w:val="clear"/>
-            <w:vAlign w:val="center"/>
-          </w:tcPr>
-          <w:p>
-            <w:pPr>
-              <w:widowControl w:val="0"/>
-              <w:spacing w:line="288" w:lineRule="auto"/>
-              <w:jc w:val="center"/>
-              <w:rPr/>
-            </w:pPr>
-            <w:r>
-              <w:rPr>
-                <w:rtl w:val="0"/>
-              </w:rPr>
-            </w:r>
-          </w:p>
-        </w:tc>
-      </w:tr>
     </w:tbl>
     <w:p>
       <w:pPr>
@@ -10856,27 +10539,26 @@
     </w:p>
     <w:p>
       <w:pPr/>
-      <w:r/>
-      <w:r>
-        <w:t>Дослідження мають теоретичну, чисельну та чисельно-експериментальну спрямованість і присвячені розробленню механіко-математичних моделей, чисельних методик та критеріїв оцінювання руйнування метаматеріально-орієнтованих інфраструктурних композитів з акцентом на системи аеродромного та дорожнього покриття за статичного, циклічного та динамічного навантаження.</w:t>
+      <w:r>
+        <w:t>Дослідження мають теоретичну, чисельну та чисельно-експериментальну спрямованість і присвячені розробленню механіко-математичних моделей, чисельних методик та критеріїв оцінювання руйнування і втрати стійкості метаматеріально-орієнтованих інфраструктурних композитів з акцентом на системи аеродромного та дорожнього покриття за статичного, циклічного та динамічного навантаження.</w:t>
       </w:r>
     </w:p>
     <w:p>
       <w:pPr/>
       <w:r>
-        <w:t>У роботі розглядатиметься широкий спектр композитів зі спеціально спроєктованою внутрішньою архітектурою: комірчасті та ауксетичні структури, резонансні включення, перфоровані цементні елементи, 3D-друковані полімерні або полімер-композитні армувальні решітки, а також шаруваті й міжфазні системи. Для цих матеріалів буде досліджено умови зародження, поширення, відхилення, кiнкування і зупинки тріщин, а також вплив внутрішньої архітектури на локалізацію напружень, енергопоглинання, посттріщинну поведінку та довговічність.</w:t>
+        <w:t>У роботі розглядатиметься широкий спектр композитів зі спеціально спроєктованою внутрішньою архітектурою: комірчасті та ауксетичні структури, резонансні включення, перфоровані цементні елементи, 3D-друковані полімерні або полімер-композитні армувальні решітки, гіперпружні метаматеріальні прошарки, а також шаруваті й міжфазні системи. Для цих матеріалів буде досліджено умови зародження, поширення, відхилення, кiнкування і зупинки тріщин, а також вплив внутрішньої архітектури на локалізацію напружень, енергопоглинання, посттріщинну поведінку, критичні стани рівноваги та довговічність.</w:t>
       </w:r>
     </w:p>
     <w:p>
       <w:pPr/>
       <w:r>
-        <w:t>Основними способами виконання роботи є метод скінченних елементів, когезійно-зонне моделювання, енергетичні критерії руйнування, моделі міжфазної деградації, параметричний аналіз геометрії комірок і включень, моделювання статичного, циклічного та імпульсного динамічного навантаження, а також експериментальна верифікація за схемами стиску, згину, непрямого розтягу та SCB-випробувань. Для виготовлення окремих модельних архітектурних елементів передбачається використання технологій 3D-друку.</w:t>
+        <w:t>Основними способами виконання роботи є метод скінченних елементів, когезійно-зонне моделювання, енергетичні критерії руйнування, моделі міжфазної деградації, параметричний аналіз геометрії комірок, включень і метаматеріальних прошарків, аналітичне визначення критичних біфуркаційних параметрів, моделювання статичного, циклічного та імпульсного динамічного навантаження, а також експериментальна верифікація за схемами стиску, згину, непрямого розтягу та SCB-випробувань. Для виготовлення окремих модельних архітектурних елементів передбачається використання технологій 3D-друку.</w:t>
       </w:r>
     </w:p>
     <w:p>
       <w:pPr/>
       <w:r>
-        <w:t>Рівень досліджень відповідає сучасним світовим тенденціям у галузі mechanical metamaterials, architected infrastructure materials, метабетону, ауксетичних цементних структур і багатофункціональних бетонополімерних композитів. Водночас запропонована робота має власний фокус: перенесення центру уваги з демонстрації окремих метаматеріальних ефектів на системну механіку тріщиноутворення, міжфазного руйнування та довговічності матеріалів інфраструктурного призначення. За власною оцінкою, робота не має прямих аналогів в Україні.</w:t>
+        <w:t>Рівень досліджень відповідає сучасним світовим тенденціям у галузі mechanical metamaterials, architected infrastructure materials, метабетону, ауксетичних цементних структур, багатофункціональних бетонополімерних композитів і стійкості гіперпружних шаруватих систем. Водночас запропонована робота має власний фокус: перенесення центру уваги з демонстрації окремих метаматеріальних ефектів на системну механіку тріщиноутворення, міжфазного руйнування, втрати стійкості та довговічності матеріалів інфраструктурного призначення. За власною оцінкою, робота не має прямих аналогів в Україні.</w:t>
       </w:r>
     </w:p>
     <w:p>
@@ -10908,7 +10590,7 @@
     <w:p>
       <w:pPr/>
       <w:r>
-        <w:t>При виконанні першого етапу очікується створення базового комплексу механіко-математичних і скінченноелементних моделей руйнування метаматеріально-орієнтованих інфраструктурних композитів за статичного навантаження; вибір репрезентативних типів внутрішньої архітектури; побудова початкових когезійно-зонних моделей для матриці, лігаментів і міжфазних меж; визначення критеріїв ефективності архітектурних «пасток тріщин» та формування чисельних карт локалізації напружень, зон зародження тріщин і можливих траєкторій їхнього поширення.</w:t>
+        <w:t>При виконанні першого етапу очікується створення базового комплексу механіко-математичних, скінченноелементних та аналітичних моделей руйнування і втрати стійкості метаматеріально-орієнтованих інфраструктурних композитів за статичного навантаження; вибір репрезентативних типів внутрішньої архітектури; побудова початкових когезійно-зонних моделей для матриці, лігаментів і міжфазних меж; визначення критеріїв ефективності архітектурних «пасток тріщин»; формування чисельних карт локалізації напружень, зон зародження тріщин і можливих траєкторій їхнього поширення; розроблення методики прогнозування критичних біфуркаційних параметрів багатошарових систем із гіперпружними метаматеріальними прошарками.</w:t>
       </w:r>
     </w:p>
     <w:p>
@@ -10920,13 +10602,13 @@
     <w:p>
       <w:pPr/>
       <w:r>
-        <w:t>За результатами роботи в цілому очікується:</w:t>
+        <w:t>За результатами роботи в цілому очікується створення цілісного підходу до проєктування тріщиностійких і формостабільних метаматеріально-орієнтованих інфраструктурних композитів. Основними результатами стануть:</w:t>
       </w:r>
     </w:p>
     <w:p>
       <w:pPr/>
       <w:r>
-        <w:t>1. Механіко-математична модель руйнування метаматеріально-орієнтованих інфраструктурних композитів, що враховує вплив внутрішньої комірчастої, ауксетичної, резонансної, перфорованої або армувальної архітектури на умови зародження і поширення тріщин.</w:t>
+        <w:t>1. Механіко-математична модель руйнування та втрати стійкості метаматеріально-орієнтованих інфраструктурних композитів, що враховує вплив внутрішньої комірчастої, ауксетичної, резонансної, перфорованої або армувальної архітектури на умови зародження тріщин, їх поширення та критичні стани рівноваги.</w:t>
       </w:r>
     </w:p>
     <w:p>
@@ -10944,7 +10626,7 @@
     <w:p>
       <w:pPr/>
       <w:r>
-        <w:t>4. Чисельні карти руйнування для характерних типів метаматеріально-орієнтованих інфраструктурних композитів, які пов'язують геометричні параметри внутрішньої архітектури, властивості матриці та міжфазних меж із тріщиностійкістю, енергопоглинанням і посттріщинною поведінкою.</w:t>
+        <w:t>4. Чисельні карти руйнування та втрати стійкості для характерних типів метаматеріально-орієнтованих інфраструктурних композитів, які пов'язують геометричні параметри внутрішньої архітектури, властивості матриці, метаматеріальних прошарків і міжфазних меж із тріщиностійкістю, енергопоглинанням, критичними біфуркаційними параметрами і посттріщинною поведінкою.</w:t>
       </w:r>
     </w:p>
     <w:p>
@@ -10955,13 +10637,14 @@
     </w:p>
     <w:p>
       <w:pPr/>
-      <w:r/>
-      <w:r/>
-      <w:r/>
-      <w:r/>
-      <w:r/>
-      <w:r>
-        <w:t>6. Рекомендації щодо вибору геометричних, матеріальних і міжфазних параметрів тріщиностійких композитів для аеродромних і дорожніх покриттів, мостових настилів, плитних елементів, захисних і ремонтних шарів інфраструктурних об'єктів.</w:t>
+      <w:r>
+        <w:t>6. Рекомендації щодо вибору геометричних, матеріальних і міжфазних параметрів тріщиностійких та формостабільних композитів для аеродромних і дорожніх покриттів, мостових настилів, плитних елементів, захисних і ремонтних шарів інфраструктурних об'єктів.</w:t>
+      </w:r>
+    </w:p>
+    <w:p>
+      <w:pPr/>
+      <w:r>
+        <w:t>7. Методика визначення критичних параметрів біфуркації з можливістю адаптивного вибору нелінійно-пружних конститутивних моделей, що забезпечує прогнозування порогів втрати стійкості багатошарових композитів при стиску.</w:t>
       </w:r>
     </w:p>
     <w:p>

</xml_diff>

<commit_message>
Integrate durability modeling proposal updates
</commit_message>
<xml_diff>
--- a/Proposal2027-2028.improved.docx
+++ b/Proposal2027-2028.improved.docx
@@ -3415,7 +3415,7 @@
         </w:rPr>
       </w:pPr>
       <w:r>
-        <w:t>механіка руйнування; стійкість; метаматеріально-орієнтовані композити; інфраструктурні композити; аеродромне та дорожнє покриття; когезійна зона; біфуркація.</w:t>
+        <w:t>механіка руйнування; стійкість; довготривала міцність; інфраструктурні композити; аеродромне та дорожнє покриття; когезійна зона; міжфазні мікронапруження.</w:t>
       </w:r>
     </w:p>
     <w:p>
@@ -3454,26 +3454,25 @@
     <w:p>
       <w:pPr/>
       <w:r>
-        <w:t>Сучасні аеродромні та дорожні покриття, мостові настили, плитні елементи, захисні та ремонтні шари працюють за одночасної дії статичних, циклічних і динамічних навантажень, температурних змін, вологи та поступового накопичення пошкоджень. Одними з головних механізмів втрати їхньої довговічності є зародження і поширення тріщин у матриці матеріалу або на міжфазних межах, а також втрата стійкості багатошарових систем за температурно-силового стиску. Тому актуальним є створення механіко-математичних підходів, які дають змогу не лише описувати руйнування, а й прогнозувати критичні стани рівноваги, керувати траєкторіями тріщин та підвищувати опір пошкодженню інфраструктурних композитів.</w:t>
+        <w:t>Сучасні аеродромні та дорожні покриття, мостові настили, плитні елементи, захисні та ремонтні шари працюють за одночасної дії статичних, циклічних і динамічних навантажень, температурних змін, вологи та поступового накопичення пошкоджень. Одними з головних механізмів втрати їхньої довговічності є зародження і поширення тріщин у матриці матеріалу або на міжфазних межах, корозійно- та середовищно-індуковане пошкодження, а також втрата стійкості багатошарових систем за температурно-силового стиску. Тому актуальним є створення механіко-математичних підходів, які дають змогу не лише описувати руйнування, а й прогнозувати критичні стани рівноваги, довготривалу міцність, керувати траєкторіями тріщин та підвищувати опір пошкодженню інфраструктурних композитів.</w:t>
       </w:r>
     </w:p>
     <w:p>
       <w:pPr/>
-      <w:r/>
-      <w:r>
-        <w:t>У роботі пропонується дослідити метаматеріально-орієнтовані інфраструктурні композити, у яких ефективні механічні властивості визначаються не лише складом, а й спеціально спроєктованою внутрішньою архітектурою. До таких архітектур належать комірчасті та ауксетичні структури, резонансні включення, перфоровані цементні елементи, 3D-друковані полімерні або полімер-композитні армувальні решітки, а також шаруваті й міжфазні системи. Основна увага буде приділена системам аеродромного та дорожнього покриття та спорідненим інфраструктурним елементам, для яких критичними є тріщиностійкість, енергопоглинання, міжфазна міцність і довговічність.</w:t>
+      <w:r>
+        <w:t>У роботі пропонується дослідити метаматеріально-орієнтовані інфраструктурні композити, у яких ефективні механічні властивості визначаються не лише складом, а й спеціально спроєктованою внутрішньою архітектурою. До таких архітектур належать комірчасті та ауксетичні структури, резонансні включення, перфоровані цементні елементи, 3D-друковані полімерні або полімер-композитні армувальні решітки, композити регулярної структури з в'язкопластичною матрицею асфальтобетонного типу, а також шаруваті й міжфазні системи. Основна увага буде приділена системам аеродромного та дорожнього покриття та спорідненим інфраструктурним елементам, для яких критичними є тріщиностійкість, енергопоглинання, міжфазна міцність, довготривала міцність і довговічність.</w:t>
       </w:r>
     </w:p>
     <w:p>
       <w:pPr/>
       <w:r>
-        <w:t>Планується розробити скінченноелементні, когезійно-зонні, енергетичні та аналітичні моделі зародження, поширення, відхилення і зупинки тріщин у матеріалах з внутрішньою архітектурою за статичного, циклічного та динамічного навантаження. Окремо буде враховано crack-bridging механізми, посттріщинну поведінку цементної або бетонної матриці, міжфазну деградацію в системах полімер-цемент, армування-матриця та ремонтний шар-основа, а також втрату стійкості і хвилеутворення в гіперпружних метаматеріальних прошарках багатошарових дорожніх систем.</w:t>
+        <w:t>Планується розробити скінченноелементні, когезійно-зонні, енергетичні, фізико-механічні та аналітичні моделі зародження, поширення, відхилення і зупинки тріщин у матеріалах з внутрішньою архітектурою за статичного, циклічного та динамічного навантаження. Окремо буде враховано crack-bridging механізми, посттріщинну поведінку цементної або бетонної матриці, корозійно- та середовищно-індуковане пошкодження, міжфазну деградацію в системах полімер-цемент, армування-матриця та ремонтний шар-основа, концентрацію міжфазних мікронапружень, а також втрату стійкості і хвилеутворення в гіперпружних метаматеріальних прошарках багатошарових дорожніх систем.</w:t>
       </w:r>
     </w:p>
     <w:p>
       <w:pPr/>
       <w:r>
-        <w:t>Очікуваними результатами є механіко-математичні моделі руйнування та втрати стійкості метаматеріально-орієнтованих інфраструктурних композитів, критерії ефективності внутрішніх архітектурних елементів як потенційних «пасток тріщин», чисельні карти руйнування і втрати стійкості для характерних архітектур, методики експериментальної ідентифікації параметрів тріщиностійкості, а також методика прогнозування критичних біфуркаційних параметрів багатошарових композитів із гіперпружними метаматеріальними прошарками. Результати можуть бути використані при створенні тріщиностійких і формостабільних дорожніх систем, мостових настилів, ремонтних і захисних шарів, а також при подальшому розвитку механіки руйнування та стійкості композитів з внутрішньою архітектурою.</w:t>
+        <w:t>Очікуваними результатами є механіко-математичні та фізико-механічні моделі руйнування, корозійно- та середовищно-індукованого пошкодження і втрати стійкості метаматеріально-орієнтованих інфраструктурних композитів, критерії ефективності внутрішніх архітектурних елементів як потенційних «пасток тріщин», чисельні карти руйнування і втрати стійкості для характерних архітектур, методики експериментальної ідентифікації параметрів тріщиностійкості, методика прогнозування критичних біфуркаційних параметрів багатошарових композитів із гіперпружними метаматеріальними прошарками, а також підхід до прогнозування довготривалої міцності при циклічних навантаженнях. Результати можуть бути використані при створенні тріщиностійких і формостабільних дорожніх систем, мостових настилів, ремонтних і захисних шарів, а також при подальшому розвитку механіки руйнування, стійкості та довговічності композитів з внутрішньою архітектурою.</w:t>
       </w:r>
     </w:p>
     <w:p>
@@ -3593,7 +3592,7 @@
     <w:p>
       <w:pPr/>
       <w:r>
-        <w:t>Метою роботи є розроблення механіко-математичних моделей, чисельних методик та критеріїв оцінювання руйнування і втрати стійкості метаматеріально-орієнтованих інфраструктурних композитів з акцентом на системи аеродромного та дорожнього покриття за статичного, циклічного та динамічного навантаження, з урахуванням впливу внутрішньої архітектури, міжфазної деградації, crack-bridging механізмів, взаємодії тріщин з архітектурними елементами матеріалу та критичних біфуркаційних станів багатошарових систем.</w:t>
+        <w:t>Метою роботи є розроблення механіко-математичних і фізико-механічних моделей, чисельних методик та критеріїв оцінювання руйнування, довготривалої міцності і втрати стійкості метаматеріально-орієнтованих інфраструктурних композитів з акцентом на системи аеродромного та дорожнього покриття за статичного, циклічного та динамічного навантаження, з урахуванням впливу внутрішньої архітектури, міжфазної деградації, корозійно- та середовищно-індукованого пошкодження, crack-bridging механізмів, взаємодії тріщин з архітектурними елементами матеріалу та критичних біфуркаційних станів багатошарових систем.</w:t>
       </w:r>
     </w:p>
     <w:p>
@@ -3647,19 +3646,25 @@
     <w:p>
       <w:pPr/>
       <w:r>
-        <w:t>8. Обґрунтувати раціональні геометричні та механічні параметри проміжних метаматеріальних прошарків у багатошарових системах аеродромного та дорожнього покриття для підвищення опору втраті стійкості при поздовжньому стиску.</w:t>
+        <w:t>8. Розробити фізико-механічну модель накопичення пошкоджень у композитах регулярної структури з в'язкопластичною матрицею асфальтобетонного типу за циклічних навантажень та корозійно- та середовищно-індукованої деградації.</w:t>
       </w:r>
     </w:p>
     <w:p>
       <w:pPr/>
       <w:r>
-        <w:t>9. Розробити підходи до експериментальної верифікації моделей із використанням випробувань на стиск, згин, непрямий розтяг та SCB-випробувань для визначення параметрів тріщиностійкості, енергопоглинання, посттріщинної поведінки, міжфазного руйнування та критичних станів деформування.</w:t>
+        <w:t>9. Обґрунтувати раціональні геометричні та механічні параметри проміжних метаматеріальних прошарків у багатошарових системах аеродромного та дорожнього покриття для підвищення опору втраті стійкості при поздовжньому стиску.</w:t>
       </w:r>
     </w:p>
     <w:p>
       <w:pPr/>
       <w:r>
-        <w:t>10. Побудувати чисельні карти руйнування та втрати стійкості для вибраних типів метаматеріально-орієнтованих інфраструктурних композитів і сформулювати рекомендації щодо вибору геометричних, матеріальних і міжфазних параметрів, які забезпечують підвищений опір зародженню тріщин, їх поширенню та втраті формостабільності.</w:t>
+        <w:t>10. Розробити підходи до експериментальної верифікації моделей із використанням випробувань на стиск, згин, непрямий розтяг та SCB-випробувань для визначення параметрів тріщиностійкості, енергопоглинання, посттріщинної поведінки, міжфазного руйнування, довготривалої міцності та критичних станів деформування.</w:t>
+      </w:r>
+    </w:p>
+    <w:p>
+      <w:pPr/>
+      <w:r>
+        <w:t>11. Побудувати чисельні карти руйнування, втрати стійкості та концентрації міжфазних мікронапружень для вибраних типів метаматеріально-орієнтованих інфраструктурних композитів і сформулювати рекомендації щодо вибору геометричних, матеріальних і міжфазних параметрів, які забезпечують підвищений опір зародженню тріщин, їх поширенню, деградації при циклічних навантаженнях та втраті формостабільності.</w:t>
       </w:r>
     </w:p>
     <w:p>
@@ -3734,7 +3739,7 @@
     <w:p>
       <w:pPr/>
       <w:r>
-        <w:t>Водночас більшість наявних робіт зосереджена на демонстрації окремих ефектів: ауксетичної поведінки, хвильового гасіння, енергопоглинання, сенсорної функціональності, проникності або підвищення міцності. Значно менш розробленою залишається системна механіка руйнування та втрати стійкості таких матеріалів, особливо для аеродромних і дорожніх покриттів, мостових настилів, плитних елементів, захисних і ремонтних шарів, де зародження тріщин, міжфазне відшарування та втрата формостабільності часто визначають експлуатаційну надійність конструкції.</w:t>
+        <w:t>Водночас більшість наявних робіт зосереджена на демонстрації окремих ефектів: ауксетичної поведінки, хвильового гасіння, енергопоглинання, сенсорної функціональності, проникності або підвищення міцності. Значно менш розробленою залишається системна механіка руйнування, довготривалої міцності та втрати стійкості таких матеріалів, особливо для аеродромних і дорожніх покриттів, мостових настилів, плитних елементів, захисних і ремонтних шарів, де зародження тріщин, циклічна деградація, міжфазне відшарування та втрата формостабільності часто визначають експлуатаційну надійність конструкції.</w:t>
       </w:r>
     </w:p>
     <w:p>
@@ -3770,7 +3775,13 @@
     <w:p>
       <w:pPr/>
       <w:r>
-        <w:t>Отже, ключова наукова проблема полягає у відсутності цілісного підходу механіки руйнування та стійкості до аналізу й проєктування метаматеріально-орієнтованих інфраструктурних композитів. Запропонована робота спрямована на заповнення цієї прогалини шляхом розроблення моделей, які одночасно враховують внутрішню архітектуру, механізми зародження і поширення тріщин, посттріщинне деформування, міжфазну деградацію, динамічне навантаження, критичні стани втрати формостабільності та вплив експлуатаційного середовища.</w:t>
+        <w:t>Шостою прогалиною є недостатнє врахування корозійно- та середовищно-індукованого пошкодження в композитах регулярної структури з в'язкопластичною матрицею асфальтобетонного типу. Для таких систем циклічне навантаження, старіння, волога, температурні зміни та локальні міжфазні мікронапруження можуть суттєво змінювати довготривалу міцність і швидкість накопичення пошкоджень, однак узгоджені фізико-механічні моделі для їх прогнозування у метаматеріально-орієнтованих інфраструктурних композитах залишаються недостатньо розвиненими.</w:t>
+      </w:r>
+    </w:p>
+    <w:p>
+      <w:pPr/>
+      <w:r>
+        <w:t>Отже, ключова наукова проблема полягає у відсутності цілісного підходу механіки руйнування, стійкості та довготривалої міцності до аналізу й проєктування метаматеріально-орієнтованих інфраструктурних композитів. Запропонована робота спрямована на заповнення цієї прогалини шляхом розроблення моделей, які одночасно враховують внутрішню архітектуру, механізми зародження і поширення тріщин, посттріщинне деформування, міжфазну деградацію, концентрацію міжфазних мікронапружень, циклічне навантаження, корозійно- та середовищно-індуковане пошкодження, критичні стани втрати формостабільності та вплив експлуатаційного середовища.</w:t>
       </w:r>
     </w:p>
     <w:p>
@@ -3970,25 +3981,19 @@
     <w:p>
       <w:pPr/>
       <w:r>
-        <w:t>Виконання роботи передбачається у два взаємопов'язані етапи. Перший етап буде спрямований на формування теоретичної та чисельної основи дослідження: вибір характерних типів метаматеріально-орієнтованих інфраструктурних композитів, побудову базових скінченноелементних, когезійно-зонних та аналітичних моделей, визначення основних механізмів зародження тріщин і втрати стійкості у матеріалах з внутрішньою архітектурою. Другий етап буде присвячений розвитку моделей для статичного, циклічного та динамічного навантаження, урахуванню міжфазної деградації та середовищних чинників, чисельно-експериментальній верифікації результатів і формулюванню рекомендацій щодо створення тріщиностійких і формостабільних інфраструктурних композитів.</w:t>
+        <w:t>Виконання роботи передбачається у два взаємопов'язані етапи. Перший етап буде спрямований на формування теоретичної та чисельної основи дослідження: вибір характерних типів метаматеріально-орієнтованих інфраструктурних композитів, побудову базових скінченноелементних, когезійно-зонних, фізико-механічних та аналітичних моделей, визначення основних механізмів зародження тріщин, накопичення пошкоджень і втрати стійкості у матеріалах з внутрішньою архітектурою. Другий етап буде присвячений розвитку моделей для статичного, циклічного та динамічного навантаження, урахуванню міжфазної деградації, концентрації міжфазних мікронапружень та середовищних чинників, чисельно-експериментальній верифікації результатів і формулюванню рекомендацій щодо створення тріщиностійких, формостабільних і довговічних інфраструктурних композитів.</w:t>
       </w:r>
     </w:p>
     <w:p>
       <w:pPr/>
       <w:r>
-        <w:t>Етап 1 (2027 р.). Теоретико-чисельні моделі руйнування, втрати стійкості та вибір архітектур метаматеріально-орієнтованих композитів для аеродромних і дорожніх покриттів. На цьому етапі буде систематизовано сучасні підходи до створення метабетону, ауксетичних цементних і бетонних структур, бетонів із вбудованим архітектурним армуванням, багатофункціональних бетонополімерних систем та композитів з вираженими міжфазними межами. Для вибраних архітектур буде побудовано скінченноелементні моделі напружено-деформованого стану за статичного навантаження, базові когезійно-зонні моделі зародження тріщин, руйнування інтерфейсів і посттріщинної поведінки, а також аналітичні моделі стійкості багатошарових систем із гіперпружними метаматеріальними прошарками. Буде виконано параметричний аналіз впливу геометрії внутрішньої архітектури на локалізацію напружень, траєкторії тріщин, критичні біфуркаційні параметри та ефективність архітектурних «пасток тріщин».</w:t>
+        <w:t>Етап 1 (2027 р.). Теоретико-чисельні моделі руйнування, втрати стійкості та пошкодження композитів регулярної структури для аеродромних і дорожніх покриттів. На цьому етапі буде систематизовано сучасні підходи до створення метабетону, ауксетичних цементних і бетонних структур, бетонів із вбудованим архітектурним армуванням, багатофункціональних бетонополімерних систем та композитів з вираженими міжфазними межами. Для вибраних архітектур буде побудовано скінченноелементні моделі напружено-деформованого стану за статичного навантаження, базові когезійно-зонні моделі зародження тріщин, руйнування інтерфейсів і посттріщинної поведінки, аналітичні моделі стійкості багатошарових систем із гіперпружними метаматеріальними прошарками, а також фізико-механічну модель корозійно- та середовищно-індукованого пошкодження композитів регулярної структури з в'язкопластичною матрицею асфальтобетонного типу. Буде виконано параметричний аналіз впливу геометрії внутрішньої архітектури на локалізацію напружень, траєкторії тріщин, критичні біфуркаційні параметри, циклічне накопичення пошкоджень та ефективність архітектурних «пасток тріщин».</w:t>
       </w:r>
     </w:p>
     <w:p>
       <w:pPr/>
-      <w:r/>
-      <w:r/>
-      <w:r/>
-      <w:r/>
-      <w:r/>
-      <w:r/>
-      <w:r>
-        <w:t>Етап 2 (2028 р.). Динамічне, міжфазне та експериментально верифіковане моделювання тріщиностійкості інфраструктурних метакомпозитів. На цьому етапі буде розвинено побудовані моделі для складніших умов навантаження, характерних для дорожньої та цивільної інфраструктури, включаючи імпульсне, циклічне та динамічне навантаження. Окремий блок робіт буде присвячено межам полімер-цемент, армування-матриця, включення-покриття-матриця та ремонтний шар-основа з побудовою когезійних моделей змішаного руйнування. Передбачається чисельно-експериментальна верифікація за схемами стиску, згину, непрямого розтягу та SCB-випробувань, а також формулювання рекомендацій щодо створення тріщиностійких композитів для аеродромних і дорожніх покриттів, мостових настилів, плитних елементів, захисних і ремонтних шарів.</w:t>
+      <w:r>
+        <w:t>Етап 2 (2028 р.). Динамічне, міжфазне та експериментально верифіковане моделювання тріщиностійкості і довготривалої міцності інфраструктурних метакомпозитів. На цьому етапі буде розвинено побудовані моделі для складніших умов навантаження, характерних для дорожньої та цивільної інфраструктури, включаючи імпульсне, циклічне та динамічне навантаження. Окремий блок робіт буде присвячено межам полімер-цемент, армування-матриця, включення-покриття-матриця та ремонтний шар-основа з побудовою когезійних моделей змішаного руйнування і визначенням концентрації міжфазних мікронапружень у метаматеріально-орієнтованих композитах. Передбачається чисельно-експериментальна верифікація за схемами стиску, згину, непрямого розтягу та SCB-випробувань, а також формулювання рекомендацій щодо створення тріщиностійких, довговічних і формостабільних композитів для аеродромних і дорожніх покриттів, мостових настилів, плитних елементів, захисних і ремонтних шарів.</w:t>
       </w:r>
     </w:p>
     <w:p>
@@ -4125,13 +4130,13 @@
     <w:p>
       <w:pPr/>
       <w:r>
-        <w:t>1. Актуальність та економічна значущість. Сучасна дорожня, транспортна та цивільна інфраструктура працює в умовах накопичення пошкоджень, де головними чинниками втрати працездатності є зародження та розвиток тріщин, міжфазне відшарування і втрата стійкості верхніх шарів покриття за температурно-силових навантажень. Традиційні методи підвищення довговічності, орієнтовані переважно на зміну складу матеріалу, не забезпечують повного контролю над траєкторіями руйнування, критичними станами рівноваги, міжфазним відшаруванням і динамічною відповіддю. Запропонований підхід дає змогу розглядати внутрішню архітектуру композиту як активний інструмент підвищення тріщиностійкості та формостабільності, що потенційно зменшує частоту ремонтів, подовжує строк служби аеродромних і дорожніх покриттів, мостових настилів і захисних шарів та підвищує надійність критичної інфраструктури.</w:t>
+        <w:t>1. Актуальність та економічна значущість. Сучасна дорожня, транспортна та цивільна інфраструктура працює в умовах накопичення пошкоджень, де головними чинниками втрати працездатності є зародження та розвиток тріщин, міжфазне відшарування, циклічна деградація, корозійно- та середовищно-індуковане пошкодження і втрата стійкості верхніх шарів покриття за температурно-силових навантажень. Традиційні методи підвищення довговічності, орієнтовані переважно на зміну складу матеріалу, не забезпечують повного контролю над траєкторіями руйнування, критичними станами рівноваги, довготривалою міцністю, міжфазним відшаруванням і динамічною відповіддю. Запропонований підхід дає змогу розглядати внутрішню архітектуру композиту як активний інструмент підвищення тріщиностійкості, формостабільності та ресурсу, що потенційно зменшує частоту ремонтів, подовжує строк служби аеродромних і дорожніх покриттів, мостових настилів і захисних шарів та підвищує надійність критичної інфраструктури.</w:t>
       </w:r>
     </w:p>
     <w:p>
       <w:pPr/>
       <w:r>
-        <w:t>2. Технічна перевага та інноваційність. Робота поєднує архітектурне проєктування матеріалу з механікою руйнування і стійкості. На відміну від підходів, у яких метабетон, ауксетичні цементні структури або бетон із 3D-друкованим армуванням розглядаються переважно через окремі ефекти жорсткості, енергопоглинання чи хвильового гасіння, у цій роботі пропонується цілісна система моделювання зародження, поширення, відхилення та зупинки тріщин, а також прогнозування критичних біфуркаційних параметрів багатошарових систем. Вона включає когезійно-зонні моделі, критерії ефективності архітектурних «пасток тріщин», аналіз міжфазної деградації, оцінку впливу динамічної функціональності на локальні параметри руйнування та вибір конститутивних співвідношень для визначення точок втрати стійкості.</w:t>
+        <w:t>2. Технічна перевага та інноваційність. Робота поєднує архітектурне проєктування матеріалу з механікою руйнування, стійкості та довготривалої міцності. На відміну від підходів, у яких метабетон, ауксетичні цементні структури або бетон із 3D-друкованим армуванням розглядаються переважно через окремі ефекти жорсткості, енергопоглинання чи хвильового гасіння, у цій роботі пропонується цілісна система моделювання зародження, поширення, відхилення та зупинки тріщин, прогнозування критичних біфуркаційних параметрів багатошарових систем і оцінювання довготривалої міцності композитів регулярної структури при циклічному навантаженні. Вона включає когезійно-зонні моделі, критерії ефективності архітектурних «пасток тріщин», аналіз міжфазної деградації, концентрації міжфазних мікронапружень, оцінку впливу динамічної функціональності на локальні параметри руйнування та вибір конститутивних співвідношень для визначення точок втрати стійкості.</w:t>
       </w:r>
     </w:p>
     <w:p>
@@ -4155,7 +4160,7 @@
     <w:p>
       <w:pPr/>
       <w:r>
-        <w:t>Висновок. Робота є технічно здійсненною завдяки наявній матеріально-технічній базі, досвіду авторського колективу та можливості поєднати чисельне моделювання з експериментальною верифікацією. Її реалізація створить науково обґрунтовану основу для проєктування тріщиностійких і формостабільних інфраструктурних композитів і матиме потенціал для підвищення експлуатаційної надійності критичної інфраструктури України.</w:t>
+        <w:t>Висновок. Робота є технічно здійсненною завдяки наявній матеріально-технічній базі, досвіду авторського колективу та можливості поєднати чисельне моделювання з експериментальною верифікацією. Її реалізація створить науково обґрунтовану основу для проєктування тріщиностійких, формостабільних і довговічних інфраструктурних композитів і матиме потенціал для підвищення експлуатаційної надійності критичної інфраструктури України.</w:t>
       </w:r>
     </w:p>
     <w:p>
@@ -4584,7 +4589,7 @@
           </w:tcPr>
           <w:p>
             <w:r>
-              <w:t>Механіко-математичні моделі руйнування та втрати стійкості метаматеріально-орієнтованих інфраструктурних композитів; когезійно-зонні моделі міжфазної деградації; чисельні карти руйнування і втрати стійкості; критерії ефективності архітектурних «пасток тріщин»; методика визначення критичних параметрів біфуркації; рекомендації щодо вибору геометричних, матеріальних і міжфазних параметрів композитів.</w:t>
+              <w:t>Механіко-математичні та фізико-механічні моделі руйнування, корозійно- та середовищно-індукованого пошкодження і втрати стійкості метаматеріально-орієнтованих інфраструктурних композитів; когезійно-зонні моделі міжфазної деградації; чисельні карти руйнування, втрати стійкості та концентрації міжфазних мікронапружень; критерії ефективності архітектурних «пасток тріщин»; методика визначення критичних параметрів біфуркації; модель прогнозування довготривалої міцності; рекомендації щодо вибору геометричних, матеріальних і міжфазних параметрів композитів.</w:t>
             </w:r>
           </w:p>
         </w:tc>
@@ -4625,7 +4630,7 @@
           </w:tcPr>
           <w:p>
             <w:r>
-              <w:t>Використання у наукових звітах, методиках розрахунку, рекомендаціях щодо проєктування тріщиностійких і формостабільних інфраструктурних композитів, підготовці публікацій, доповідей, навчально-методичних матеріалів та пропозицій для подальших прикладних і експериментальних робіт.</w:t>
+              <w:t>Використання у наукових звітах, методиках розрахунку, рекомендаціях щодо проєктування тріщиностійких, довговічних і формостабільних інфраструктурних композитів, підготовці публікацій, доповідей, навчально-методичних матеріалів та пропозицій для подальших прикладних і експериментальних робіт.</w:t>
             </w:r>
           </w:p>
         </w:tc>
@@ -5362,7 +5367,7 @@
           </w:tcPr>
           <w:p>
             <w:r>
-              <w:t>Моделі, алгоритми та рекомендації з оцінювання тріщиностійкості і втрати стійкості метаматеріально-орієнтованих інфраструктурних композитів; чисельні карти руйнування; методики визначення параметрів міжфазної деградації, посттріщинної поведінки та критичних біфуркаційних станів.</w:t>
+              <w:t>Моделі, алгоритми та рекомендації з оцінювання тріщиностійкості, довготривалої міцності і втрати стійкості метаматеріально-орієнтованих інфраструктурних композитів; чисельні карти руйнування; методики визначення параметрів міжфазної деградації, концентрації міжфазних мікронапружень, посттріщинної поведінки та критичних біфуркаційних станів.</w:t>
             </w:r>
           </w:p>
         </w:tc>
@@ -5378,7 +5383,7 @@
           </w:tcPr>
           <w:p>
             <w:r>
-              <w:t>Використання під час попереднього проєктування, порівняльного аналізу архітектурних рішень, оцінювання ресурсу, довговічності та формостабільності аеродромних і дорожніх покриттів, мостових настилів, ремонтних та захисних шарів.</w:t>
+              <w:t>Використання під час попереднього проєктування, порівняльного аналізу архітектурних рішень, оцінювання ресурсу, довговічності, втомної міцності та формостабільності аеродромних і дорожніх покриттів, мостових настилів, ремонтних та захисних шарів.</w:t>
             </w:r>
           </w:p>
         </w:tc>
@@ -8793,7 +8798,7 @@
     <w:p>
       <w:pPr/>
       <w:r>
-        <w:t>розроблення механіко-математичних моделей, чисельних методик та критеріїв оцінювання руйнування і втрати стійкості метаматеріально-орієнтованих інфраструктурних композитів з урахуванням внутрішньої архітектури, міжфазної деградації, критичних біфуркаційних станів та дії статичного, циклічного і динамічного навантаження.</w:t>
+        <w:t>розроблення механіко-математичних і фізико-механічних моделей, чисельних методик та критеріїв оцінювання руйнування, довготривалої міцності і втрати стійкості метаматеріально-орієнтованих інфраструктурних композитів з урахуванням внутрішньої архітектури, міжфазної деградації, корозійно- та середовищно-індукованого пошкодження, критичних біфуркаційних станів та дії статичного, циклічного і динамічного навантаження.</w:t>
       </w:r>
     </w:p>
     <w:p>
@@ -9381,7 +9386,7 @@
           </w:tcPr>
           <w:p>
             <w:r>
-              <w:t>Теоретико-чисельні моделі руйнування, втрати стійкості та вибір архітектур метаматеріально-орієнтованих композитів для аеродромних і дорожніх покриттів</w:t>
+              <w:t>Теоретико-чисельні моделі руйнування, втрати стійкості та пошкодження композитів регулярної структури для аеродромних і дорожніх покриттів</w:t>
             </w:r>
           </w:p>
         </w:tc>
@@ -9480,6 +9485,114 @@
             <w:r/>
             <w:r>
               <w:t>2</w:t>
+            </w:r>
+          </w:p>
+        </w:tc>
+        <w:tc>
+          <w:tcPr>
+            <w:tcBorders>
+              <w:top w:color="000000" w:space="0" w:sz="4" w:val="single"/>
+              <w:left w:color="000000" w:space="0" w:sz="4" w:val="single"/>
+              <w:bottom w:color="000000" w:space="0" w:sz="4" w:val="single"/>
+              <w:right w:color="000000" w:space="0" w:sz="4" w:val="single"/>
+            </w:tcBorders>
+            <w:shd w:fill="auto" w:val="clear"/>
+            <w:vAlign w:val="center"/>
+          </w:tcPr>
+          <w:p>
+            <w:r>
+              <w:t>Динамічне, міжфазне та експериментально верифіковане моделювання тріщиностійкості і довготривалої міцності інфраструктурних метакомпозитів</w:t>
+            </w:r>
+          </w:p>
+        </w:tc>
+        <w:tc>
+          <w:tcPr>
+            <w:tcBorders>
+              <w:top w:color="000000" w:space="0" w:sz="4" w:val="single"/>
+              <w:left w:color="000000" w:space="0" w:sz="4" w:val="single"/>
+              <w:bottom w:color="000000" w:space="0" w:sz="4" w:val="single"/>
+              <w:right w:color="000000" w:space="0" w:sz="4" w:val="single"/>
+            </w:tcBorders>
+            <w:shd w:fill="auto" w:val="clear"/>
+            <w:vAlign w:val="center"/>
+          </w:tcPr>
+          <w:p>
+            <w:pPr>
+              <w:widowControl w:val="0"/>
+              <w:spacing w:line="288" w:lineRule="auto"/>
+              <w:jc w:val="center"/>
+              <w:rPr/>
+            </w:pPr>
+            <w:r>
+              <w:rPr>
+                <w:rtl w:val="0"/>
+              </w:rPr>
+            </w:r>
+            <w:r/>
+            <w:r/>
+            <w:r>
+              <w:t>01 січня 2028 р. - 31 грудня 2028 р.</w:t>
+            </w:r>
+          </w:p>
+        </w:tc>
+        <w:tc>
+          <w:tcPr>
+            <w:tcBorders>
+              <w:top w:color="000000" w:space="0" w:sz="4" w:val="single"/>
+              <w:left w:color="000000" w:space="0" w:sz="4" w:val="single"/>
+              <w:bottom w:color="000000" w:space="0" w:sz="4" w:val="single"/>
+              <w:right w:color="000000" w:space="0" w:sz="4" w:val="single"/>
+            </w:tcBorders>
+            <w:shd w:fill="auto" w:val="clear"/>
+            <w:vAlign w:val="center"/>
+          </w:tcPr>
+          <w:p>
+            <w:pPr>
+              <w:widowControl w:val="0"/>
+              <w:spacing w:line="288" w:lineRule="auto"/>
+              <w:jc w:val="center"/>
+              <w:rPr/>
+            </w:pPr>
+            <w:r>
+              <w:rPr>
+                <w:rtl w:val="0"/>
+              </w:rPr>
+            </w:r>
+            <w:r/>
+            <w:r/>
+            <w:r>
+              <w:t>д.ф.-м.н., чл.-кор. НАН України М.Ф. Селіванов</w:t>
+            </w:r>
+          </w:p>
+        </w:tc>
+      </w:tr>
+      <w:tr>
+        <w:trPr>
+          <w:cantSplit w:val="0"/>
+          <w:tblHeader w:val="0"/>
+        </w:trPr>
+        <w:tc>
+          <w:tcPr>
+            <w:tcBorders>
+              <w:top w:color="000000" w:space="0" w:sz="4" w:val="single"/>
+              <w:left w:color="000000" w:space="0" w:sz="4" w:val="single"/>
+              <w:bottom w:color="000000" w:space="0" w:sz="4" w:val="single"/>
+              <w:right w:color="000000" w:space="0" w:sz="4" w:val="single"/>
+            </w:tcBorders>
+            <w:shd w:fill="auto" w:val="clear"/>
+            <w:vAlign w:val="center"/>
+          </w:tcPr>
+          <w:p>
+            <w:pPr>
+              <w:widowControl w:val="0"/>
+              <w:spacing w:line="288" w:lineRule="auto"/>
+              <w:jc w:val="center"/>
+              <w:rPr/>
+            </w:pPr>
+            <w:r>
+              <w:rPr>
+                <w:rtl w:val="0"/>
+              </w:rPr>
             </w:r>
           </w:p>
         </w:tc>
@@ -9532,11 +9645,6 @@
                 <w:rtl w:val="0"/>
               </w:rPr>
             </w:r>
-            <w:r/>
-            <w:r/>
-            <w:r>
-              <w:t>Динамічне, міжфазне та експериментально верифіковане моделювання тріщиностійкості інфраструктурних метакомпозитів</w:t>
-            </w:r>
           </w:p>
         </w:tc>
         <w:tc>
@@ -9562,11 +9670,6 @@
                 <w:rtl w:val="0"/>
               </w:rPr>
             </w:r>
-            <w:r/>
-            <w:r/>
-            <w:r>
-              <w:t>01 січня 2028 р. - 31 грудня 2028 р.</w:t>
-            </w:r>
           </w:p>
         </w:tc>
         <w:tc>
@@ -9591,11 +9694,6 @@
               <w:rPr>
                 <w:rtl w:val="0"/>
               </w:rPr>
-            </w:r>
-            <w:r/>
-            <w:r/>
-            <w:r>
-              <w:t>д.ф.-м.н., чл.-кор. НАН України М.Ф. Селіванов</w:t>
             </w:r>
           </w:p>
         </w:tc>
@@ -9750,6 +9848,7 @@
           </w:tcPr>
           <w:p>
             <w:pPr>
+              <w:keepNext w:val="1"/>
               <w:widowControl w:val="0"/>
               <w:spacing w:line="288" w:lineRule="auto"/>
               <w:jc w:val="center"/>
@@ -9775,7 +9874,117 @@
           </w:tcPr>
           <w:p>
             <w:pPr>
-              <w:keepNext w:val="0"/>
+              <w:keepNext w:val="1"/>
+              <w:widowControl w:val="0"/>
+              <w:spacing w:line="288" w:lineRule="auto"/>
+              <w:jc w:val="center"/>
+              <w:rPr/>
+            </w:pPr>
+            <w:r>
+              <w:rPr>
+                <w:rtl w:val="0"/>
+              </w:rPr>
+            </w:r>
+          </w:p>
+        </w:tc>
+        <w:tc>
+          <w:tcPr>
+            <w:tcBorders>
+              <w:top w:color="000000" w:space="0" w:sz="4" w:val="single"/>
+              <w:left w:color="000000" w:space="0" w:sz="4" w:val="single"/>
+              <w:bottom w:color="000000" w:space="0" w:sz="4" w:val="single"/>
+              <w:right w:color="000000" w:space="0" w:sz="4" w:val="single"/>
+            </w:tcBorders>
+            <w:shd w:fill="auto" w:val="clear"/>
+            <w:vAlign w:val="center"/>
+          </w:tcPr>
+          <w:p>
+            <w:pPr>
+              <w:keepNext w:val="1"/>
+              <w:widowControl w:val="0"/>
+              <w:spacing w:line="288" w:lineRule="auto"/>
+              <w:jc w:val="center"/>
+              <w:rPr/>
+            </w:pPr>
+            <w:r>
+              <w:rPr>
+                <w:rtl w:val="0"/>
+              </w:rPr>
+            </w:r>
+          </w:p>
+        </w:tc>
+        <w:tc>
+          <w:tcPr>
+            <w:tcBorders>
+              <w:top w:color="000000" w:space="0" w:sz="4" w:val="single"/>
+              <w:left w:color="000000" w:space="0" w:sz="4" w:val="single"/>
+              <w:bottom w:color="000000" w:space="0" w:sz="4" w:val="single"/>
+              <w:right w:color="000000" w:space="0" w:sz="4" w:val="single"/>
+            </w:tcBorders>
+            <w:shd w:fill="auto" w:val="clear"/>
+            <w:vAlign w:val="center"/>
+          </w:tcPr>
+          <w:p>
+            <w:pPr>
+              <w:keepNext w:val="1"/>
+              <w:widowControl w:val="0"/>
+              <w:spacing w:line="288" w:lineRule="auto"/>
+              <w:jc w:val="center"/>
+              <w:rPr/>
+            </w:pPr>
+            <w:r>
+              <w:rPr>
+                <w:rtl w:val="0"/>
+              </w:rPr>
+            </w:r>
+          </w:p>
+        </w:tc>
+      </w:tr>
+      <w:tr>
+        <w:trPr>
+          <w:cantSplit w:val="0"/>
+          <w:tblHeader w:val="0"/>
+        </w:trPr>
+        <w:tc>
+          <w:tcPr>
+            <w:tcBorders>
+              <w:top w:color="000000" w:space="0" w:sz="4" w:val="single"/>
+              <w:left w:color="000000" w:space="0" w:sz="4" w:val="single"/>
+              <w:bottom w:color="000000" w:space="0" w:sz="4" w:val="single"/>
+              <w:right w:color="000000" w:space="0" w:sz="4" w:val="single"/>
+            </w:tcBorders>
+            <w:shd w:fill="auto" w:val="clear"/>
+            <w:vAlign w:val="center"/>
+          </w:tcPr>
+          <w:p>
+            <w:pPr>
+              <w:keepNext w:val="1"/>
+              <w:widowControl w:val="0"/>
+              <w:spacing w:line="288" w:lineRule="auto"/>
+              <w:jc w:val="center"/>
+              <w:rPr/>
+            </w:pPr>
+            <w:r>
+              <w:rPr>
+                <w:rtl w:val="0"/>
+              </w:rPr>
+            </w:r>
+          </w:p>
+        </w:tc>
+        <w:tc>
+          <w:tcPr>
+            <w:tcBorders>
+              <w:top w:color="000000" w:space="0" w:sz="4" w:val="single"/>
+              <w:left w:color="000000" w:space="0" w:sz="4" w:val="single"/>
+              <w:bottom w:color="000000" w:space="0" w:sz="4" w:val="single"/>
+              <w:right w:color="000000" w:space="0" w:sz="4" w:val="single"/>
+            </w:tcBorders>
+            <w:shd w:fill="auto" w:val="clear"/>
+            <w:vAlign w:val="center"/>
+          </w:tcPr>
+          <w:p>
+            <w:pPr>
+              <w:keepNext w:val="1"/>
               <w:keepLines w:val="0"/>
               <w:pageBreakBefore w:val="0"/>
               <w:widowControl w:val="0"/>
@@ -9826,6 +10035,7 @@
           </w:tcPr>
           <w:p>
             <w:pPr>
+              <w:keepNext w:val="1"/>
               <w:widowControl w:val="0"/>
               <w:spacing w:line="288" w:lineRule="auto"/>
               <w:jc w:val="center"/>
@@ -9851,6 +10061,7 @@
           </w:tcPr>
           <w:p>
             <w:pPr>
+              <w:keepNext w:val="1"/>
               <w:widowControl w:val="0"/>
               <w:spacing w:line="288" w:lineRule="auto"/>
               <w:jc w:val="center"/>
@@ -9882,7 +10093,6 @@
           </w:tcPr>
           <w:p>
             <w:pPr>
-              <w:keepNext w:val="1"/>
               <w:widowControl w:val="0"/>
               <w:spacing w:line="288" w:lineRule="auto"/>
               <w:jc w:val="center"/>
@@ -9908,117 +10118,7 @@
           </w:tcPr>
           <w:p>
             <w:pPr>
-              <w:keepNext w:val="1"/>
-              <w:widowControl w:val="0"/>
-              <w:spacing w:line="288" w:lineRule="auto"/>
-              <w:jc w:val="center"/>
-              <w:rPr/>
-            </w:pPr>
-            <w:r>
-              <w:rPr>
-                <w:rtl w:val="0"/>
-              </w:rPr>
-            </w:r>
-          </w:p>
-        </w:tc>
-        <w:tc>
-          <w:tcPr>
-            <w:tcBorders>
-              <w:top w:color="000000" w:space="0" w:sz="4" w:val="single"/>
-              <w:left w:color="000000" w:space="0" w:sz="4" w:val="single"/>
-              <w:bottom w:color="000000" w:space="0" w:sz="4" w:val="single"/>
-              <w:right w:color="000000" w:space="0" w:sz="4" w:val="single"/>
-            </w:tcBorders>
-            <w:shd w:fill="auto" w:val="clear"/>
-            <w:vAlign w:val="center"/>
-          </w:tcPr>
-          <w:p>
-            <w:pPr>
-              <w:keepNext w:val="1"/>
-              <w:widowControl w:val="0"/>
-              <w:spacing w:line="288" w:lineRule="auto"/>
-              <w:jc w:val="center"/>
-              <w:rPr/>
-            </w:pPr>
-            <w:r>
-              <w:rPr>
-                <w:rtl w:val="0"/>
-              </w:rPr>
-            </w:r>
-          </w:p>
-        </w:tc>
-        <w:tc>
-          <w:tcPr>
-            <w:tcBorders>
-              <w:top w:color="000000" w:space="0" w:sz="4" w:val="single"/>
-              <w:left w:color="000000" w:space="0" w:sz="4" w:val="single"/>
-              <w:bottom w:color="000000" w:space="0" w:sz="4" w:val="single"/>
-              <w:right w:color="000000" w:space="0" w:sz="4" w:val="single"/>
-            </w:tcBorders>
-            <w:shd w:fill="auto" w:val="clear"/>
-            <w:vAlign w:val="center"/>
-          </w:tcPr>
-          <w:p>
-            <w:pPr>
-              <w:keepNext w:val="1"/>
-              <w:widowControl w:val="0"/>
-              <w:spacing w:line="288" w:lineRule="auto"/>
-              <w:jc w:val="center"/>
-              <w:rPr/>
-            </w:pPr>
-            <w:r>
-              <w:rPr>
-                <w:rtl w:val="0"/>
-              </w:rPr>
-            </w:r>
-          </w:p>
-        </w:tc>
-      </w:tr>
-      <w:tr>
-        <w:trPr>
-          <w:cantSplit w:val="0"/>
-          <w:tblHeader w:val="0"/>
-        </w:trPr>
-        <w:tc>
-          <w:tcPr>
-            <w:tcBorders>
-              <w:top w:color="000000" w:space="0" w:sz="4" w:val="single"/>
-              <w:left w:color="000000" w:space="0" w:sz="4" w:val="single"/>
-              <w:bottom w:color="000000" w:space="0" w:sz="4" w:val="single"/>
-              <w:right w:color="000000" w:space="0" w:sz="4" w:val="single"/>
-            </w:tcBorders>
-            <w:shd w:fill="auto" w:val="clear"/>
-            <w:vAlign w:val="center"/>
-          </w:tcPr>
-          <w:p>
-            <w:pPr>
-              <w:keepNext w:val="1"/>
-              <w:widowControl w:val="0"/>
-              <w:spacing w:line="288" w:lineRule="auto"/>
-              <w:jc w:val="center"/>
-              <w:rPr/>
-            </w:pPr>
-            <w:r>
-              <w:rPr>
-                <w:rtl w:val="0"/>
-              </w:rPr>
-            </w:r>
-          </w:p>
-        </w:tc>
-        <w:tc>
-          <w:tcPr>
-            <w:tcBorders>
-              <w:top w:color="000000" w:space="0" w:sz="4" w:val="single"/>
-              <w:left w:color="000000" w:space="0" w:sz="4" w:val="single"/>
-              <w:bottom w:color="000000" w:space="0" w:sz="4" w:val="single"/>
-              <w:right w:color="000000" w:space="0" w:sz="4" w:val="single"/>
-            </w:tcBorders>
-            <w:shd w:fill="auto" w:val="clear"/>
-            <w:vAlign w:val="center"/>
-          </w:tcPr>
-          <w:p>
-            <w:pPr>
-              <w:keepNext w:val="1"/>
+              <w:keepNext w:val="0"/>
               <w:keepLines w:val="0"/>
               <w:pageBreakBefore w:val="0"/>
               <w:widowControl w:val="0"/>
@@ -10069,7 +10169,6 @@
           </w:tcPr>
           <w:p>
             <w:pPr>
-              <w:keepNext w:val="1"/>
               <w:widowControl w:val="0"/>
               <w:spacing w:line="288" w:lineRule="auto"/>
               <w:jc w:val="center"/>
@@ -10095,7 +10194,6 @@
           </w:tcPr>
           <w:p>
             <w:pPr>
-              <w:keepNext w:val="1"/>
               <w:widowControl w:val="0"/>
               <w:spacing w:line="288" w:lineRule="auto"/>
               <w:jc w:val="center"/>
@@ -10373,138 +10471,6 @@
           </w:p>
         </w:tc>
       </w:tr>
-      <w:tr>
-        <w:trPr>
-          <w:cantSplit w:val="0"/>
-          <w:tblHeader w:val="0"/>
-        </w:trPr>
-        <w:tc>
-          <w:tcPr>
-            <w:tcBorders>
-              <w:top w:color="000000" w:space="0" w:sz="4" w:val="single"/>
-              <w:left w:color="000000" w:space="0" w:sz="4" w:val="single"/>
-              <w:bottom w:color="000000" w:space="0" w:sz="4" w:val="single"/>
-              <w:right w:color="000000" w:space="0" w:sz="4" w:val="single"/>
-            </w:tcBorders>
-            <w:shd w:fill="auto" w:val="clear"/>
-            <w:vAlign w:val="center"/>
-          </w:tcPr>
-          <w:p>
-            <w:pPr>
-              <w:widowControl w:val="0"/>
-              <w:spacing w:line="288" w:lineRule="auto"/>
-              <w:jc w:val="center"/>
-              <w:rPr/>
-            </w:pPr>
-            <w:r>
-              <w:rPr>
-                <w:rtl w:val="0"/>
-              </w:rPr>
-            </w:r>
-          </w:p>
-        </w:tc>
-        <w:tc>
-          <w:tcPr>
-            <w:tcBorders>
-              <w:top w:color="000000" w:space="0" w:sz="4" w:val="single"/>
-              <w:left w:color="000000" w:space="0" w:sz="4" w:val="single"/>
-              <w:bottom w:color="000000" w:space="0" w:sz="4" w:val="single"/>
-              <w:right w:color="000000" w:space="0" w:sz="4" w:val="single"/>
-            </w:tcBorders>
-            <w:shd w:fill="auto" w:val="clear"/>
-            <w:vAlign w:val="center"/>
-          </w:tcPr>
-          <w:p>
-            <w:pPr>
-              <w:keepNext w:val="0"/>
-              <w:keepLines w:val="0"/>
-              <w:pageBreakBefore w:val="0"/>
-              <w:widowControl w:val="0"/>
-              <w:pBdr>
-                <w:top w:space="0" w:sz="0" w:val="nil"/>
-                <w:left w:space="0" w:sz="0" w:val="nil"/>
-                <w:bottom w:space="0" w:sz="0" w:val="nil"/>
-                <w:right w:space="0" w:sz="0" w:val="nil"/>
-                <w:between w:space="0" w:sz="0" w:val="nil"/>
-              </w:pBdr>
-              <w:shd w:fill="auto" w:val="clear"/>
-              <w:spacing w:after="0" w:before="280" w:line="288" w:lineRule="auto"/>
-              <w:ind w:left="57" w:right="57" w:firstLine="0"/>
-              <w:jc w:val="both"/>
-              <w:rPr>
-                <w:rFonts w:ascii="Times New Roman" w:cs="Times New Roman" w:eastAsia="Times New Roman" w:hAnsi="Times New Roman"/>
-                <w:b w:val="0"/>
-                <w:bCs w:val="0"/>
-                <w:i w:val="0"/>
-                <w:iCs w:val="0"/>
-                <w:smallCaps w:val="0"/>
-                <w:strike w:val="0"/>
-                <w:color w:val="000000"/>
-                <w:sz w:val="24"/>
-                <w:szCs w:val="24"/>
-                <w:u w:val="none"/>
-                <w:shd w:fill="auto" w:val="clear"/>
-                <w:vertAlign w:val="baseline"/>
-              </w:rPr>
-            </w:pPr>
-            <w:r>
-              <w:rPr>
-                <w:rtl w:val="0"/>
-              </w:rPr>
-            </w:r>
-          </w:p>
-        </w:tc>
-        <w:tc>
-          <w:tcPr>
-            <w:tcBorders>
-              <w:top w:color="000000" w:space="0" w:sz="4" w:val="single"/>
-              <w:left w:color="000000" w:space="0" w:sz="4" w:val="single"/>
-              <w:bottom w:color="000000" w:space="0" w:sz="4" w:val="single"/>
-              <w:right w:color="000000" w:space="0" w:sz="4" w:val="single"/>
-            </w:tcBorders>
-            <w:shd w:fill="auto" w:val="clear"/>
-            <w:vAlign w:val="center"/>
-          </w:tcPr>
-          <w:p>
-            <w:pPr>
-              <w:widowControl w:val="0"/>
-              <w:spacing w:line="288" w:lineRule="auto"/>
-              <w:jc w:val="center"/>
-              <w:rPr/>
-            </w:pPr>
-            <w:r>
-              <w:rPr>
-                <w:rtl w:val="0"/>
-              </w:rPr>
-            </w:r>
-          </w:p>
-        </w:tc>
-        <w:tc>
-          <w:tcPr>
-            <w:tcBorders>
-              <w:top w:color="000000" w:space="0" w:sz="4" w:val="single"/>
-              <w:left w:color="000000" w:space="0" w:sz="4" w:val="single"/>
-              <w:bottom w:color="000000" w:space="0" w:sz="4" w:val="single"/>
-              <w:right w:color="000000" w:space="0" w:sz="4" w:val="single"/>
-            </w:tcBorders>
-            <w:shd w:fill="auto" w:val="clear"/>
-            <w:vAlign w:val="center"/>
-          </w:tcPr>
-          <w:p>
-            <w:pPr>
-              <w:widowControl w:val="0"/>
-              <w:spacing w:line="288" w:lineRule="auto"/>
-              <w:jc w:val="center"/>
-              <w:rPr/>
-            </w:pPr>
-            <w:r>
-              <w:rPr>
-                <w:rtl w:val="0"/>
-              </w:rPr>
-            </w:r>
-          </w:p>
-        </w:tc>
-      </w:tr>
     </w:tbl>
     <w:p>
       <w:pPr>
@@ -10540,25 +10506,25 @@
     <w:p>
       <w:pPr/>
       <w:r>
-        <w:t>Дослідження мають теоретичну, чисельну та чисельно-експериментальну спрямованість і присвячені розробленню механіко-математичних моделей, чисельних методик та критеріїв оцінювання руйнування і втрати стійкості метаматеріально-орієнтованих інфраструктурних композитів з акцентом на системи аеродромного та дорожнього покриття за статичного, циклічного та динамічного навантаження.</w:t>
+        <w:t>Дослідження мають теоретичну, чисельну та чисельно-експериментальну спрямованість і присвячені розробленню механіко-математичних і фізико-механічних моделей, чисельних методик та критеріїв оцінювання руйнування, довготривалої міцності і втрати стійкості метаматеріально-орієнтованих інфраструктурних композитів з акцентом на системи аеродромного та дорожнього покриття за статичного, циклічного та динамічного навантаження.</w:t>
       </w:r>
     </w:p>
     <w:p>
       <w:pPr/>
       <w:r>
-        <w:t>У роботі розглядатиметься широкий спектр композитів зі спеціально спроєктованою внутрішньою архітектурою: комірчасті та ауксетичні структури, резонансні включення, перфоровані цементні елементи, 3D-друковані полімерні або полімер-композитні армувальні решітки, гіперпружні метаматеріальні прошарки, а також шаруваті й міжфазні системи. Для цих матеріалів буде досліджено умови зародження, поширення, відхилення, кiнкування і зупинки тріщин, а також вплив внутрішньої архітектури на локалізацію напружень, енергопоглинання, посттріщинну поведінку, критичні стани рівноваги та довговічність.</w:t>
+        <w:t>У роботі розглядатиметься широкий спектр композитів зі спеціально спроєктованою внутрішньою архітектурою: комірчасті та ауксетичні структури, резонансні включення, перфоровані цементні елементи, 3D-друковані полімерні або полімер-композитні армувальні решітки, гіперпружні метаматеріальні прошарки, композити регулярної структури з в'язкопластичною матрицею асфальтобетонного типу, а також шаруваті й міжфазні системи. Для цих матеріалів буде досліджено умови зародження, поширення, відхилення, кiнкування і зупинки тріщин, а також вплив внутрішньої архітектури на локалізацію напружень, енергопоглинання, посттріщинну поведінку, концентрацію міжфазних мікронапружень, критичні стани рівноваги, циклічне накопичення пошкоджень та довговічність.</w:t>
       </w:r>
     </w:p>
     <w:p>
       <w:pPr/>
       <w:r>
-        <w:t>Основними способами виконання роботи є метод скінченних елементів, когезійно-зонне моделювання, енергетичні критерії руйнування, моделі міжфазної деградації, параметричний аналіз геометрії комірок, включень і метаматеріальних прошарків, аналітичне визначення критичних біфуркаційних параметрів, моделювання статичного, циклічного та імпульсного динамічного навантаження, а також експериментальна верифікація за схемами стиску, згину, непрямого розтягу та SCB-випробувань. Для виготовлення окремих модельних архітектурних елементів передбачається використання технологій 3D-друку.</w:t>
+        <w:t>Основними способами виконання роботи є метод скінченних елементів, когезійно-зонне моделювання, енергетичні критерії руйнування, фізико-механічні моделі корозійно- та середовищно-індукованого пошкодження, моделі міжфазної деградації, параметричний аналіз геометрії комірок, включень і метаматеріальних прошарків, аналітичне визначення критичних біфуркаційних параметрів, моделювання статичного, циклічного та імпульсного динамічного навантаження, а також експериментальна верифікація за схемами стиску, згину, непрямого розтягу та SCB-випробувань. Для виготовлення окремих модельних архітектурних елементів передбачається використання технологій 3D-друку.</w:t>
       </w:r>
     </w:p>
     <w:p>
       <w:pPr/>
       <w:r>
-        <w:t>Рівень досліджень відповідає сучасним світовим тенденціям у галузі mechanical metamaterials, architected infrastructure materials, метабетону, ауксетичних цементних структур, багатофункціональних бетонополімерних композитів і стійкості гіперпружних шаруватих систем. Водночас запропонована робота має власний фокус: перенесення центру уваги з демонстрації окремих метаматеріальних ефектів на системну механіку тріщиноутворення, міжфазного руйнування, втрати стійкості та довговічності матеріалів інфраструктурного призначення. За власною оцінкою, робота не має прямих аналогів в Україні.</w:t>
+        <w:t>Рівень досліджень відповідає сучасним світовим тенденціям у галузі mechanical metamaterials, architected infrastructure materials, метабетону, ауксетичних цементних структур, багатофункціональних бетонополімерних композитів, стійкості гіперпружних шаруватих систем і прогнозування довготривалої міцності матеріалів інфраструктурного призначення. Водночас запропонована робота має власний фокус: перенесення центру уваги з демонстрації окремих метаматеріальних ефектів на системну механіку тріщиноутворення, міжфазного руйнування, втрати стійкості, циклічного накопичення пошкоджень та довговічності матеріалів інфраструктурного призначення. За власною оцінкою, робота не має прямих аналогів в Україні.</w:t>
       </w:r>
     </w:p>
     <w:p>
@@ -10590,25 +10556,25 @@
     <w:p>
       <w:pPr/>
       <w:r>
-        <w:t>При виконанні першого етапу очікується створення базового комплексу механіко-математичних, скінченноелементних та аналітичних моделей руйнування і втрати стійкості метаматеріально-орієнтованих інфраструктурних композитів за статичного навантаження; вибір репрезентативних типів внутрішньої архітектури; побудова початкових когезійно-зонних моделей для матриці, лігаментів і міжфазних меж; визначення критеріїв ефективності архітектурних «пасток тріщин»; формування чисельних карт локалізації напружень, зон зародження тріщин і можливих траєкторій їхнього поширення; розроблення методики прогнозування критичних біфуркаційних параметрів багатошарових систем із гіперпружними метаматеріальними прошарками.</w:t>
+        <w:t>При виконанні першого етапу очікується створення базового комплексу механіко-математичних, фізико-механічних, скінченноелементних та аналітичних моделей руйнування, корозійно- та середовищно-індукованого пошкодження та втрати стійкості метаматеріально-орієнтованих інфраструктурних композитів за статичного і циклічного навантаження; вибір репрезентативних типів внутрішньої архітектури; побудова початкових когезійно-зонних моделей для матриці, лігаментів і міжфазних меж; розроблення моделі накопичення пошкоджень у композитах регулярної структури з в'язкопластичною матрицею асфальтобетонного типу; визначення критеріїв ефективності архітектурних «пасток тріщин»; формування чисельних карт локалізації напружень, зон зародження тріщин і можливих траєкторій їхнього поширення; розроблення методики прогнозування критичних біфуркаційних параметрів багатошарових систем із гіперпружними метаматеріальними прошарками.</w:t>
       </w:r>
     </w:p>
     <w:p>
       <w:pPr/>
       <w:r>
-        <w:t>При виконанні другого етапу очікується розроблення уточнених моделей руйнування за статичного, циклічного й динамічного навантаження; опис міжфазної деградації у системах полімер-цемент, армування-матриця та ремонтний шар-основа; оцінювання впливу резонансних і ауксетичних архітектур на енергопоглинання та локальні параметри руйнування; проведення чисельно-експериментальної верифікації через випробування на стиск, згин, непрямий розтяг і SCB-випробування.</w:t>
+        <w:t>При виконанні другого етапу очікується розроблення уточнених моделей руйнування за статичного, циклічного й динамічного навантаження; опис міжфазної деградації у системах полімер-цемент, армування-матриця та ремонтний шар-основа; оцінювання концентрації міжфазних мікронапружень у метаматеріально-орієнтованих композитах та її впливу на довготривалу міцність, втому і деградацію матеріалу; оцінювання впливу резонансних і ауксетичних архітектур на енергопоглинання та локальні параметри руйнування; проведення чисельно-експериментальної верифікації через випробування на стиск, згин, непрямий розтяг і SCB-випробування.</w:t>
       </w:r>
     </w:p>
     <w:p>
       <w:pPr/>
       <w:r>
-        <w:t>За результатами роботи в цілому очікується створення цілісного підходу до проєктування тріщиностійких і формостабільних метаматеріально-орієнтованих інфраструктурних композитів. Основними результатами стануть:</w:t>
+        <w:t>За результатами роботи в цілому очікується створення цілісного підходу до проєктування тріщиностійких, формостабільних і довговічних метаматеріально-орієнтованих інфраструктурних композитів. Основними результатами стануть:</w:t>
       </w:r>
     </w:p>
     <w:p>
       <w:pPr/>
       <w:r>
-        <w:t>1. Механіко-математична модель руйнування та втрати стійкості метаматеріально-орієнтованих інфраструктурних композитів, що враховує вплив внутрішньої комірчастої, ауксетичної, резонансної, перфорованої або армувальної архітектури на умови зародження тріщин, їх поширення та критичні стани рівноваги.</w:t>
+        <w:t>1. Механіко-математична та фізико-механічна модель руйнування, корозійно- та середовищно-індукованого пошкодження і втрати стійкості метаматеріально-орієнтованих інфраструктурних композитів, що враховує вплив внутрішньої комірчастої, ауксетичної, резонансної, перфорованої або армувальної архітектури на умови зародження тріщин, їх поширення, накопичення пошкоджень та критичні стани рівноваги.</w:t>
       </w:r>
     </w:p>
     <w:p>
@@ -10626,7 +10592,7 @@
     <w:p>
       <w:pPr/>
       <w:r>
-        <w:t>4. Чисельні карти руйнування та втрати стійкості для характерних типів метаматеріально-орієнтованих інфраструктурних композитів, які пов'язують геометричні параметри внутрішньої архітектури, властивості матриці, метаматеріальних прошарків і міжфазних меж із тріщиностійкістю, енергопоглинанням, критичними біфуркаційними параметрами і посттріщинною поведінкою.</w:t>
+        <w:t>4. Чисельні карти руйнування, втрати стійкості та концентрації міжфазних мікронапружень для характерних типів метаматеріально-орієнтованих інфраструктурних композитів, які пов'язують геометричні параметри внутрішньої архітектури, властивості матриці, метаматеріальних прошарків і міжфазних меж із тріщиностійкістю, енергопоглинанням, критичними біфуркаційними параметрами, довготривалою міцністю і посттріщинною поведінкою.</w:t>
       </w:r>
     </w:p>
     <w:p>
@@ -10638,13 +10604,19 @@
     <w:p>
       <w:pPr/>
       <w:r>
-        <w:t>6. Рекомендації щодо вибору геометричних, матеріальних і міжфазних параметрів тріщиностійких та формостабільних композитів для аеродромних і дорожніх покриттів, мостових настилів, плитних елементів, захисних і ремонтних шарів інфраструктурних об'єктів.</w:t>
+        <w:t>6. Рекомендації щодо вибору геометричних, матеріальних і міжфазних параметрів тріщиностійких, довговічних та формостабільних композитів для аеродромних і дорожніх покриттів, мостових настилів, плитних елементів, захисних і ремонтних шарів інфраструктурних об'єктів.</w:t>
       </w:r>
     </w:p>
     <w:p>
       <w:pPr/>
       <w:r>
         <w:t>7. Методика визначення критичних параметрів біфуркації з можливістю адаптивного вибору нелінійно-пружних конститутивних моделей, що забезпечує прогнозування порогів втрати стійкості багатошарових композитів при стиску.</w:t>
+      </w:r>
+    </w:p>
+    <w:p>
+      <w:pPr/>
+      <w:r>
+        <w:t>8. Фізико-механічна модель прогнозування довготривалої міцності інфраструктурних композитів з урахуванням циклічного навантаження, міжфазних мікронапружень та корозійно- та середовищно-індукованого пошкодження.</w:t>
       </w:r>
     </w:p>
     <w:p>

</xml_diff>